<commit_message>
docs: descripciones de PRESUPUESTOS.ESTADO y AIU_MODIFICADO, avance fuera del 01 y excepcion de 02 §10.2
</commit_message>
<xml_diff>
--- a/docs/01 - Alcance del MVP.docx
+++ b/docs/01 - Alcance del MVP.docx
@@ -6428,7 +6428,7 @@
                 <w:szCs w:val="18"/>
                 <w:lang w:val="es-CO"/>
               </w:rPr>
-              <w:t>Congelamiento de la línea base. Al activar, el presupuesto pasa a solo lectura. La única escritura admitida en estado Activo es el registro de avance físico. Ningún cambio posterior en recursos o APU puede alterarlo, ni siquiera con autorización del usuario. Para modificarlo, el Administrador debe reabrirlo con justificación, editarlo en estado Abierto y volver a activarlo.</w:t>
+              <w:t>Congelamiento de la línea base. Al activar, el presupuesto pasa a solo lectura. En estado Activo no se admite ninguna escritura sobre el presupuesto: el avance físico salió del MVP con la D-43 y vuelve en la fase 2 del producto. Ningún cambio posterior en recursos o APU puede alterarlo, ni siquiera con autorización del usuario. Para modificarlo, el Administrador debe reabrirlo con justificación, editarlo en estado Abierto y volver a activarlo.</w:t>
             </w:r>
           </w:p>
         </w:tc>
@@ -13651,7 +13651,7 @@
                 <w:szCs w:val="18"/>
                 <w:lang w:val="es-CO"/>
               </w:rPr>
-              <w:t>Cierre del proyecto por el Administrador: estado Cerrado, archivo histórico, bloqueo de registros adicionales incluido el avance.</w:t>
+              <w:t>Cierre del proyecto por el Administrador: estado Cerrado, archivo histórico, bloqueo de registros adicionales.</w:t>
             </w:r>
           </w:p>
         </w:tc>

</xml_diff>

<commit_message>
docs: documento 04 como quinto arbitro (stack y decisiones tecnicas) y correcciones del 01, 02 y 06
</commit_message>
<xml_diff>
--- a/docs/01 - Alcance del MVP.docx
+++ b/docs/01 - Alcance del MVP.docx
@@ -198,7 +198,7 @@
                 <w:szCs w:val="18"/>
                 <w:lang w:val="es-CO"/>
               </w:rPr>
-              <w:t>16 de septiembre de 2026 · revisión del 22 de septiembre de 2026</w:t>
+              <w:t>16 de septiembre de 2026 · revisiones del 22 de septiembre y del 1 de octubre de 2026</w:t>
             </w:r>
           </w:p>
         </w:tc>
@@ -255,7 +255,7 @@
                 <w:szCs w:val="18"/>
                 <w:lang w:val="es-CO"/>
               </w:rPr>
-              <w:t>Cerrado para desarrollo. La revisión del 22 de septiembre incorpora el IVA sobre la utilidad y las decisiones D-33 a D-39, que salieron de auditar el esquema contra una base real. Los puntos que siguen sin decidir están en la sección 17 y ninguno bloquea las fases 0 a 6.</w:t>
+              <w:t>Cerrado para desarrollo. La revisión del 22 de septiembre incorpora el IVA sobre la utilidad y las decisiones D-33 a D-39, que salieron de auditar el esquema contra una base real. La del 1 de octubre toca cuatro requisitos: RF-PRE-22 y RF-PRE-43 por el orden del pie y el nombre de la línea del IVA, y RF-AUT-14 y RF-AUT-15 porque la suscripción vencida pasó de bloquear a dejar en solo lectura (D-65). Los puntos que siguen sin decidir están en la sección 17 y ninguno bloquea lo que está en construcción. Cuidado al leer «fase» en este documento: las fases del PRODUCTO que nombran estas páginas no son las fases de CONSTRUCCIÓN del plan, que se renumeraron el 1 de octubre de 2026 para dar lugar a la aplicación web.</w:t>
             </w:r>
           </w:p>
         </w:tc>
@@ -8318,7 +8318,7 @@
                 <w:szCs w:val="18"/>
                 <w:lang w:val="es-CO"/>
               </w:rPr>
-              <w:t>Al iniciar sesión el sistema verifica la vigencia de la suscripción de la empresa. Si no está vigente, el usuario entra a una pantalla de suscripción vencida y no puede abrir Recursos, APU ni Presupuestos.</w:t>
+              <w:t>Al iniciar sesión el sistema verifica la vigencia de la suscripción de la empresa. Si no está vigente, la empresa queda en SOLO LECTURA: el usuario abre Recursos, APU y Presupuestos, los consulta y los exporta, y cualquier acción que escriba se rechaza; la pantalla de suscripción vencida es donde están los datos para pagar. Hasta el 30 de septiembre de 2026 este requisito decía que no podía abrir nada. El cambio es decisión del dueño y su motivo es que los datos son del cliente: una empresa a la que se le pasó la renovación tiene que poder sacar sus presupuestos.</w:t>
             </w:r>
           </w:p>
         </w:tc>
@@ -8379,7 +8379,7 @@
                 <w:szCs w:val="18"/>
                 <w:lang w:val="es-CO"/>
               </w:rPr>
-              <w:t>La verificación de vigencia se repite en el servidor en cada petición, no solo al iniciar sesión.</w:t>
+              <w:t>La verificación de vigencia se repite en el servidor en cada petición y no solo al iniciar sesión. Vive en la base de datos, dentro de app.fn_exigir_permiso, y no en la capa HTTP: así un endpoint nuevo que se olvide de comprobarla queda cubierto igual. Lo que deja pasar son los permisos cuya acción es VER o EXPORTAR, por una condición sobre el catálogo de permisos y no por una lista de excepciones, de modo que los permisos que agregue la fase 2 del producto caen del lado correcto el día que se crean.</w:t>
             </w:r>
           </w:p>
         </w:tc>
@@ -13410,7 +13410,7 @@
                 <w:szCs w:val="18"/>
                 <w:lang w:val="es-CO"/>
               </w:rPr>
-              <w:t>Pie financiero fijo, en este orden: Total Costo Directo, AIU desglosado en Administración, Imprevistos y Utilidad, IVA sobre la utilidad, Total Costo Indirecto y Valor Total. El orden no es estético: el AIU va inmediatamente debajo del costo directo porque es lo único sobre lo que se calcula, y el IVA debajo de la utilidad porque es lo único que grava.</w:t>
+              <w:t>Pie financiero. En el PDF y en el Excel se imprimen ocho renglones, en este orden: Total Costo Indirecto, Total Costo Directo, Administración, Imprevistos, Utilidad, AIU, IVA y Valor Total. En la mesa de trabajo la barra fija muestra solo DOS —Total Costo Directo y Valor Total— y el desglose completo vive en un panel lateral, que es además donde se editan los cuatro porcentajes. El orden y el recorte son decisión del dueño del proyecto, del 30 de septiembre de 2026; hasta entonces el costo directo iba primero, con el AIU pegado a él, y el costo indirecto al final. Son dos renglones y no uno porque la clasificación de cada actividad se hereda del capítulo y es lo único del cálculo que puede salir mal sin producir ningún error: el valor total solo sube o baja, y el costo directo dice si cambió por la razón que el usuario creía.</w:t>
             </w:r>
           </w:p>
         </w:tc>
@@ -13470,7 +13470,7 @@
                 <w:szCs w:val="18"/>
                 <w:lang w:val="es-CO"/>
               </w:rPr>
-              <w:t>Los tres porcentajes del AIU y el del IVA son un campo de cada presupuesto y no existe un AIU estándar de la empresa que los precargue (D-41): el AIU se negocia obra por obra. Nacen en cero y quedan editables mientras el proyecto esté Abierto. El IVA sí arranca en 19 %, porque es tarifa de ley y no una decisión comercial del ingeniero.</w:t>
+              <w:t>Los tres porcentajes del AIU y el del IVA son un campo de cada presupuesto y no existe un AIU estándar de la empresa que los precargue (D-41): el AIU se negocia obra por obra. Nacen en cero y quedan editables mientras el proyecto esté Abierto. El IVA sí arranca en 19 %, porque es tarifa de ley y no una decisión comercial del ingeniero. Se editan en el panel del pie financiero.</w:t>
             </w:r>
           </w:p>
         </w:tc>
@@ -14191,7 +14191,7 @@
                 <w:szCs w:val="18"/>
                 <w:lang w:val="es-CO"/>
               </w:rPr>
-              <w:t>Si el presupuesto no tiene ningún capítulo de costo directo y el AIU está configurado con porcentajes mayores que cero, el pie financiero muestra un aviso permanente y no bloqueante: el AIU dará cero porque no hay base sobre la que aplicarlo, y la causa probable es que los capítulos estén mal clasificados.</w:t>
+              <w:t>Si el presupuesto no tiene ningún capítulo de costo directo y el AIU está configurado con porcentajes mayores que cero, el pie financiero muestra un aviso permanente y no bloqueante: el AIU dará cero porque no hay base sobre la que aplicarlo, y la causa probable es que los capítulos estén mal clasificados. El aviso va en la barra fija de dos renglones y NO en el panel: un aviso que hay que abrir para verlo no avisa.</w:t>
             </w:r>
           </w:p>
         </w:tc>
@@ -14552,7 +14552,7 @@
                 <w:szCs w:val="18"/>
                 <w:lang w:val="es-CO"/>
               </w:rPr>
-              <w:t>El pie financiero muestra el IVA sobre la utilidad como una línea propia, con su porcentaje visible. Si la utilidad es cero el IVA es cero, y la línea se muestra igual: una oferta sin utilidad es una decisión del ingeniero, no un error de cálculo.</w:t>
+              <w:t>El pie muestra el IVA como una línea propia y con su porcentaje visible, etiquetada «IVA (19,00 %)», sin nombrar su base. La base es la Utilidad y solo la Utilidad. Hasta el 30 de septiembre de 2026 la línea decía «IVA sobre la utilidad»; el nombre corto es decisión del dueño, y la consecuencia aceptada es que quien lea la oferta no encuentra ahí sobre qué se calculó. El porcentaje no se quita: es lo único que le permite al cliente verificar la cifra. Si la utilidad es cero el IVA es cero, y la línea se muestra igual: una oferta sin utilidad es una decisión del ingeniero, no un error de cálculo.</w:t>
             </w:r>
           </w:p>
         </w:tc>
@@ -29366,7 +29366,7 @@
               <w:rPr>
                 <w:sz w:val="19"/>
               </w:rPr>
-              <w:t>Fase 6 del MVP</w:t>
+              <w:t>Antes de la fase 7 (el cobro)</w:t>
             </w:r>
           </w:p>
         </w:tc>
@@ -29448,7 +29448,7 @@
               <w:rPr>
                 <w:sz w:val="19"/>
               </w:rPr>
-              <w:t>Fase 6 del MVP</w:t>
+              <w:t>Antes de la fase 7 (el cobro)</w:t>
             </w:r>
           </w:p>
         </w:tc>
@@ -29520,7 +29520,7 @@
               <w:rPr>
                 <w:sz w:val="19"/>
               </w:rPr>
-              <w:t>Fase 3 del MVP</w:t>
+              <w:t>Antes de la rebanada 6.2: los patrones visuales se definen antes de la segunda pantalla, o salen quince pantallas en quince estilos</w:t>
             </w:r>
           </w:p>
         </w:tc>
@@ -29602,7 +29602,7 @@
               <w:rPr>
                 <w:sz w:val="19"/>
               </w:rPr>
-              <w:t>Fase 2 del producto</w:t>
+              <w:t>Las casillas y las columnas, en la rebanada 6.1, que es donde vive el registro: el esquema ya tiene acepto_terminos_en y version_terminos. Los textos, antes del primer cliente real</w:t>
             </w:r>
           </w:p>
         </w:tc>

</xml_diff>

<commit_message>
feat(web): usuarios y roles, activacion de cuenta; documentos 01 y 02 al dia
Contenido escrito por el otro asistente (duenio de web/ y de los documentos),
no por quien hace este commit. Verificado aqui: tsc, eslint y vite build
limpios. Incluye el CONTRATO §11 (usuarios y roles) y los documentos 01 y 02
con la importacion desde Excel dentro del MVP.
</commit_message>
<xml_diff>
--- a/docs/01 - Alcance del MVP.docx
+++ b/docs/01 - Alcance del MVP.docx
@@ -5230,7 +5230,7 @@
                 <w:sz w:val="18"/>
                 <w:szCs w:val="18"/>
               </w:rPr>
-              <w:t>Funcionalidad de productividad avanzada.</w:t>
+              <w:t>Por Excel entró al MVP por decisión del dueño del 6 de octubre de 2026: plantilla descargable e importación todo o nada de recursos y APU (02 §5.5 y §6.6). CSV sigue fuera.</w:t>
             </w:r>
           </w:p>
         </w:tc>
@@ -5254,7 +5254,7 @@
                 <w:sz w:val="18"/>
                 <w:szCs w:val="18"/>
               </w:rPr>
-              <w:t>Fase 2</w:t>
+              <w:t>Excel: construida el 7 de octubre de 2026. CSV: Fase 2</w:t>
             </w:r>
           </w:p>
         </w:tc>

</xml_diff>

<commit_message>
feat: ciclo de vida de la suscripcion (D-74, CONTRATO §15): por pagar, suspension por falta de pago, cancelar y reanudar, 423 para la cuenta detenida y purga diaria
</commit_message>
<xml_diff>
--- a/docs/01 - Alcance del MVP.docx
+++ b/docs/01 - Alcance del MVP.docx
@@ -3137,7 +3137,7 @@
         <w:rPr>
           <w:lang w:val="es-CO"/>
         </w:rPr>
-        <w:t>La suspensión sin borrado es una decisión de negocio deliberada: el cliente que deja de pagar conserva su base de datos de recursos y APU, que es justamente el activo que le costó construir y el que lo hace volver.</w:t>
+        <w:t>La suspensión no borra de inmediato, y es una decisión de negocio deliberada: el cliente que deja de pagar conserva su base de datos de recursos y APU, que es el activo que le costó construir y el que lo hace volver. Pero no la conserva para siempre: desde el 12 de octubre de 2026 (D-74), una cuenta suspendida por falta de pago conserva sus datos 60 días, y una cancelada, los 10 días en que puede reactivarla.</w:t>
       </w:r>
     </w:p>
     <w:p>
@@ -3218,7 +3218,7 @@
                 <w:szCs w:val="19"/>
                 <w:lang w:val="es-CO"/>
               </w:rPr>
-              <w:t>Una empresa que ya pagó alguna vez y después deja de pagar conserva sus datos indefinidamente: pierde el acceso, no la información. Esa es la regla de arriba y no cambia.</w:t>
+              <w:t>Una empresa que ya pagó y después deja de pagar tiene dos días hábiles para hacerlo. Si no paga, queda suspendida: solo entra a la suscripción, para pagar. Conserva sus datos 60 días; después se eliminan. Hasta el 12 de octubre de 2026 esta regla decía que los conservaba indefinidamente; la cambió el dueño ese día (D-74).</w:t>
             </w:r>
           </w:p>
           <w:p>
@@ -4304,7 +4304,7 @@
         <w:rPr>
           <w:lang w:val="es-CO"/>
         </w:rPr>
-        <w:t>Corte automático de acceso por fecha de vencimiento, conservando los datos.</w:t>
+        <w:t>Corte automático de acceso por fecha de vencimiento, con dos días hábiles de gracia; los datos se conservan 60 días (D-74).</w:t>
       </w:r>
     </w:p>
     <w:p>
@@ -8318,7 +8318,7 @@
                 <w:szCs w:val="18"/>
                 <w:lang w:val="es-CO"/>
               </w:rPr>
-              <w:t>Al iniciar sesión el sistema verifica la vigencia de la suscripción de la empresa. Si no está vigente, la empresa queda en SOLO LECTURA: el usuario abre Recursos, APU y Presupuestos, los consulta y los exporta, y cualquier acción que escriba se rechaza; la pantalla de suscripción vencida es donde están los datos para pagar. Hasta el 30 de septiembre de 2026 este requisito decía que no podía abrir nada. El cambio es decisión del dueño y su motivo es que los datos son del cliente: una empresa a la que se le pasó la renovación tiene que poder sacar sus presupuestos.</w:t>
+              <w:t>Al iniciar sesión el sistema verifica la vigencia de la suscripción de la empresa. Si la prueba gratuita terminó sin pago, la empresa queda en SOLO LECTURA: el usuario abre Recursos, APU y Presupuestos, los consulta y los exporta, y cualquier acción que escriba se rechaza. Una suscripción pagada y vencida tiene dos días hábiles con todo funcionando; después queda suspendida y el usuario solo ve la pantalla de su suscripción, para pagar. Lo mismo ocurre con una cancelada pasada la fecha pagada (D-74).</w:t>
             </w:r>
           </w:p>
         </w:tc>
@@ -9437,7 +9437,7 @@
                 <w:szCs w:val="18"/>
                 <w:lang w:val="es-CO"/>
               </w:rPr>
-              <w:t>Listado de cuentas con prueba vencida sin conversión, con la opción de eliminar los datos del tenant a partir de los 10 días de vencida la prueba. La eliminación es siempre una acción manual del superadministrador, nunca un proceso automático.</w:t>
+              <w:t>Listado de cuentas con prueba vencida sin conversión, con la opción de eliminar los datos del tenant a partir de los 10 días de vencida la prueba; esta eliminación es siempre manual. Desde D-74 (12 de octubre de 2026), un proceso diario elimina además los datos de las cuentas suspendidas por falta de pago que cumplen 60 días y de las canceladas que no se reactivaron en sus 10 días.</w:t>
             </w:r>
           </w:p>
         </w:tc>
@@ -21543,14 +21543,7 @@
                 <w:sz w:val="19"/>
                 <w:lang w:val="es-CO"/>
               </w:rPr>
-              <w:t>Una empresa que ya pagó alguna vez y después deja de pagar conserva sus datos indefinidamente. Pierde el acceso, no la información. Esa es la decisión comercial de la sección 8: el catálogo de rec</w:t>
-            </w:r>
-            <w:r>
-              <w:rPr>
-                <w:sz w:val="19"/>
-                <w:lang w:val="es-CO"/>
-              </w:rPr>
-              <w:t>ursos y APU es el activo que hace volver al cliente.</w:t>
+              <w:t>Una empresa que ya pagó y después deja de pagar tiene dos días hábiles para hacerlo. Si no paga, queda suspendida: solo entra a la suscripción, para pagar. Conserva sus datos 60 días; después se eliminan. Hasta el 12 de octubre de 2026 esta regla decía que los conservaba indefinidamente; la cambió el dueño ese día (D-74).</w:t>
             </w:r>
           </w:p>
           <w:p>

</xml_diff>

<commit_message>
feat(web): pantalla Plazos del panel y textos de suscripción con los plazos vigentes (D-78)
El panel de superadmin gana «Plazos»: ver, cambiar con motivo y fecha, y
anular un cambio programado. Suscripción y Cuenta detenida dejan de
escribir los números fijos. CONTRATO §18 propone a la API el comando de
migración, los endpoints de parámetros y los plazos en el detalle.
Nuevo documento 07 (alcance después del MVP) y nota en el 01.

El esquema (docs/05), las migraciones 0001-0002 y las baterías d78/d79
quedan en el árbol sin commitear: entran con el trabajo de la API.

Co-Authored-By: Claude Opus 5.5 <noreply@anthropic.com>
Claude-Session: https://claude.ai/code/session_01QkUecTxXWHcSEBT7CByXQu
</commit_message>
<xml_diff>
--- a/docs/01 - Alcance del MVP.docx
+++ b/docs/01 - Alcance del MVP.docx
@@ -23,18 +23,7 @@
           <w:szCs w:val="52"/>
           <w:lang w:val="es-CO"/>
         </w:rPr>
-        <w:t xml:space="preserve">C O N S T </w:t>
-      </w:r>
-      <w:r>
-        <w:rPr>
-          <w:b/>
-          <w:bCs/>
-          <w:color w:val="13496B"/>
-          <w:sz w:val="52"/>
-          <w:szCs w:val="52"/>
-          <w:lang w:val="es-CO"/>
-        </w:rPr>
-        <w:t>R U S O F T</w:t>
+        <w:t xml:space="preserve">C O N S T R U S O F T</w:t>
       </w:r>
     </w:p>
     <w:p>
@@ -255,7 +244,7 @@
                 <w:szCs w:val="18"/>
                 <w:lang w:val="es-CO"/>
               </w:rPr>
-              <w:t>Cerrado para desarrollo. La revisión del 22 de septiembre incorpora el IVA sobre la utilidad y las decisiones D-33 a D-39, que salieron de auditar el esquema contra una base real. La del 1 de octubre toca cuatro requisitos: RF-PRE-22 y RF-PRE-43 por el orden del pie y el nombre de la línea del IVA, y RF-AUT-14 y RF-AUT-15 porque la suscripción vencida pasó de bloquear a dejar en solo lectura (D-65). Los puntos que siguen sin decidir están en la sección 17 y ninguno bloquea lo que está en construcción. Cuidado al leer «fase» en este documento: las fases del PRODUCTO que nombran estas páginas no son las fases de CONSTRUCCIÓN del plan, que se renumeraron el 1 de octubre de 2026 para dar lugar a la aplicación web.</w:t>
+              <w:t>Cerrado para desarrollo. La revisión del 22 de septiembre incorpora el IVA sobre la utilidad y las decisiones D-33 a D-39, que salieron de auditar el esquema contra una base real. La del 1 de octubre toca cuatro requisitos: RF-PRE-22 y RF-PRE-43 por el orden del pie y el nombre de la línea del IVA, y RF-AUT-14 y RF-AUT-15 porque la suscripción vencida pasó de bloquear a dejar en solo lectura (D-65). Los puntos que siguen sin decidir están en la sección 17 y ninguno bloquea lo que está en construcción. Cuidado al leer «fase» en este documento: las fases del PRODUCTO que nombran estas páginas no son las fases de CONSTRUCCIÓN del plan, que se renumeraron el 1 de octubre de 2026 para dar lugar a la aplicación web. Nota del 14 de octubre de 2026: el MVP está terminado; lo que se construye después, con sus requisitos y reglas nuevas (RNF-27 en adelante, RF-SAD-16 en adelante, RF-CFG-26, RN-21 en adelante), está en el documento 07, que completa a este sin reemplazarlo.</w:t>
             </w:r>
           </w:p>
         </w:tc>
@@ -363,19 +352,7 @@
         <w:rPr>
           <w:lang w:val="es-CO"/>
         </w:rPr>
-        <w:t>Este documento define el alcance del Producto Mín</w:t>
-      </w:r>
-      <w:r>
-        <w:rPr>
-          <w:lang w:val="es-CO"/>
-        </w:rPr>
-        <w:t>imo Viable (MVP) de CONSTRUSOFT</w:t>
-      </w:r>
-      <w:r>
-        <w:rPr>
-          <w:lang w:val="es-CO"/>
-        </w:rPr>
-        <w:t>. Su propósito es establecer con precisión qué se construye en la primera fase, qué queda deliberadamente fuera, y por qué. Toda decisión técnica, de diseño y de base de datos debe ser coherente con este documento.</w:t>
+        <w:t>Este documento define el alcance del Producto Mínimo Viable (MVP) de CONSTRUSOFT. Su propósito es establecer con precisión qué se construye en la primera fase, qué queda deliberadamente fuera, y por qué. Toda decisión técnica, de diseño y de base de datos debe ser coherente con este documento.</w:t>
       </w:r>
     </w:p>
     <w:p>
@@ -4304,7 +4281,7 @@
         <w:rPr>
           <w:lang w:val="es-CO"/>
         </w:rPr>
-        <w:t>Corte automático de acceso por fecha de vencimiento, con dos días hábiles de gracia; los datos se conservan 60 días (D-74).</w:t>
+        <w:t>Corte automático de acceso por fecha de vencimiento, con dos días hábiles de gracia; los datos se conservan 60 días (D-74). Desde el 14 de octubre de 2026 esos números son los valores iniciales: el superadministrador puede cambiarlos y cada plazo se cuenta con el valor vigente el día en que empieza a correr (D-78, documento 07).</w:t>
       </w:r>
     </w:p>
     <w:p>
@@ -19219,19 +19196,7 @@
         <w:rPr>
           <w:lang w:val="es-CO"/>
         </w:rPr>
-        <w:t>Cuarenta y nueve decisiones de diseño gobiernan el MVP; las seis últimas salieron de una auditoría externa del esquema y se leen juntas al final de esta sección. Tres de ellas —D-12, D-23 y la propia D-43— quedan reservadas: describen el control de avance físico, que sale del MVP y vuelve en la fase 2. Se conservan con su número, y las reglas RN-12, RN-13 y RN-19 dejan su hueco por la misma razón: renumerar rompería las referencias cruzadas de los demás documentos. Están cerradas: no se reabren</w:t>
-      </w:r>
-      <w:r>
-        <w:rPr>
-          <w:lang w:val="es-CO"/>
-        </w:rPr>
-        <w:t xml:space="preserve"> durante el desarrollo, y ninguna parte del sistema puede contradecirlas. Cada una se enuncia con su motivo, porque en dos años nadie va a recordar por qué la fórmula es la que es, y un desarrollador que no entiende el motivo de una regla termina "arreglán</w:t>
-      </w:r>
-      <w:r>
-        <w:rPr>
-          <w:lang w:val="es-CO"/>
-        </w:rPr>
-        <w:t>dola".</w:t>
+        <w:t xml:space="preserve">Cuarenta y nueve decisiones de diseño gobiernan el MVP; las seis últimas salieron de una auditoría externa del esquema y se leen juntas al final de esta sección. Tres de ellas —D-12, D-23 y la propia D-43— quedan reservadas: describen el control de avance físico, que sale del MVP y vuelve en la fase 2. Se conservan con su número, y las reglas RN-12, RN-13 y RN-19 dejan su hueco por la misma razón: renumerar rompería las referencias cruzadas de los demás documentos. Están cerradas: no se reabren durante el desarrollo, y ninguna parte del sistema puede contradecirlas. Cada una se enuncia con su motivo, porque en dos años nadie va a recordar por qué la fórmula es la que es, y un desarrollador que no entiende el motivo de una regla termina "arreglándola".</w:t>
       </w:r>
     </w:p>
     <w:p>
@@ -19260,13 +19225,7 @@
         <w:rPr>
           <w:lang w:val="es-CO"/>
         </w:rPr>
-        <w:t>D-1 · El subtotal de una línea de APU multiplic</w:t>
-      </w:r>
-      <w:r>
-        <w:rPr>
-          <w:lang w:val="es-CO"/>
-        </w:rPr>
-        <w:t>a</w:t>
+        <w:t>D-1 · El subtotal de una línea de APU multiplica</w:t>
       </w:r>
     </w:p>
     <w:p>
@@ -19295,13 +19254,7 @@
         <w:rPr>
           <w:lang w:val="es-CO"/>
         </w:rPr>
-        <w:t>•  Rendimiento: cuánto consume una unidad del recurso por unidad de</w:t>
-      </w:r>
-      <w:r>
-        <w:rPr>
-          <w:lang w:val="es-CO"/>
-        </w:rPr>
-        <w:t xml:space="preserve"> obra. Por ejemplo 0,05 jornal por m³, o 7 bultos por m³.</w:t>
+        <w:t xml:space="preserve">•  Rendimiento: cuánto consume una unidad del recurso por unidad de obra. Por ejemplo 0,05 jornal por m³, o 7 bultos por m³.</w:t>
       </w:r>
     </w:p>
     <w:p>
@@ -19316,13 +19269,7 @@
         <w:rPr>
           <w:lang w:val="es-CO"/>
         </w:rPr>
-        <w:t>•  Cantidad: cuántas unidades del recurso intervienen. Por ejemplo dos oficiales o una mezcladora. Su valor por defecto es 1, que es el caso normal en materiales, donde todo el consumo se expresa en</w:t>
-      </w:r>
-      <w:r>
-        <w:rPr>
-          <w:lang w:val="es-CO"/>
-        </w:rPr>
-        <w:t xml:space="preserve"> el rendimiento.</w:t>
+        <w:t xml:space="preserve">•  Cantidad: cuántas unidades del recurso intervienen. Por ejemplo dos oficiales o una mezcladora. Su valor por defecto es 1, que es el caso normal en materiales, donde todo el consumo se expresa en el rendimiento.</w:t>
       </w:r>
     </w:p>
     <w:p>
@@ -19969,14 +19916,7 @@
                 <w:sz w:val="19"/>
                 <w:lang w:val="es-CO"/>
               </w:rPr>
-              <w:t xml:space="preserve">Si el usuario entiende que ambos campos miden consumo, multiplicará dos veces lo mismo y el APU saldrá inflado sin que nada falle. Las etiquetas y el texto de ayuda del formulario tienen que </w:t>
-            </w:r>
-            <w:r>
-              <w:rPr>
-                <w:sz w:val="19"/>
-                <w:lang w:val="es-CO"/>
-              </w:rPr>
-              <w:t>dejarlo claro, y el campo Cantidad debe venir precargado en 1 (RF-APU-19 y RF-APU-20).</w:t>
+              <w:t xml:space="preserve">Si el usuario entiende que ambos campos miden consumo, multiplicará dos veces lo mismo y el APU saldrá inflado sin que nada falle. Las etiquetas y el texto de ayuda del formulario tienen que dejarlo claro, y el campo Cantidad debe venir precargado en 1 (RF-APU-19 y RF-APU-20).</w:t>
             </w:r>
           </w:p>
         </w:tc>
@@ -20008,33 +19948,21 @@
         <w:rPr>
           <w:lang w:val="es-CO"/>
         </w:rPr>
-        <w:t xml:space="preserve">El precio que entra en el APU es el precio total, con IVA incluido. Es la práctica habitual cuando el IVA no es </w:t>
+        <w:t xml:space="preserve">El precio que entra en el APU es el precio total, con IVA incluido. Es la práctica habitual cuando el IVA no es recuperable para el constructor, que es el caso de la inmensa mayoría de los clientes del producto.</w:t>
       </w:r>
+    </w:p>
+    <w:p>
+      <w:pPr>
+        <w:spacing w:after="120"/>
+        <w:rPr>
+          <w:lang w:val="es-CO"/>
+        </w:rPr>
+      </w:pPr>
       <w:r>
         <w:rPr>
           <w:lang w:val="es-CO"/>
         </w:rPr>
-        <w:t>recuperable para el constructor, que es el caso de la inmensa mayoría de los clientes del producto.</w:t>
-      </w:r>
-    </w:p>
-    <w:p>
-      <w:pPr>
-        <w:spacing w:after="120"/>
-        <w:rPr>
-          <w:lang w:val="es-CO"/>
-        </w:rPr>
-      </w:pPr>
-      <w:r>
-        <w:rPr>
-          <w:lang w:val="es-CO"/>
-        </w:rPr>
-        <w:t>Consecuencia: el costo directo ya incorpora el IVA y el AIU se aplica sobre esa base. Si en el futuro apareciera un cliente que sí recupera el IVA, la elecc</w:t>
-      </w:r>
-      <w:r>
-        <w:rPr>
-          <w:lang w:val="es-CO"/>
-        </w:rPr>
-        <w:t>ión tendría que guardarse junto con la versión del APU y no leerse de la configuración vigente; de lo contrario un cambio de configuración alteraría presupuestos ya emitidos.</w:t>
+        <w:t>Consecuencia: el costo directo ya incorpora el IVA y el AIU se aplica sobre esa base. Si en el futuro apareciera un cliente que sí recupera el IVA, la elección tendría que guardarse junto con la versión del APU y no leerse de la configuración vigente; de lo contrario un cambio de configuración alteraría presupuestos ya emitidos.</w:t>
       </w:r>
     </w:p>
     <w:p>
@@ -20060,13 +19988,7 @@
         <w:rPr>
           <w:lang w:val="es-CO"/>
         </w:rPr>
-        <w:t xml:space="preserve">Los tres porcentajes del AIU se aplican, cada </w:t>
-      </w:r>
-      <w:r>
-        <w:rPr>
-          <w:lang w:val="es-CO"/>
-        </w:rPr>
-        <w:t xml:space="preserve">uno por separado, sobre el costo directo. </w:t>
+        <w:t xml:space="preserve">Los tres porcentajes del AIU se aplican, cada uno por separado, sobre el costo directo. </w:t>
       </w:r>
       <w:r>
         <w:t>La utilidad no depende de la administración.</w:t>
@@ -20533,13 +20455,7 @@
         <w:rPr>
           <w:lang w:val="es-CO"/>
         </w:rPr>
-        <w:t>El ejemplo es un costo directo de $63.675.000 con un AIU de 10 / 5 / 5, un IVA del 19 % sobre la utilidad y sin capítulos indirectos, de mo</w:t>
-      </w:r>
-      <w:r>
-        <w:rPr>
-          <w:lang w:val="es-CO"/>
-        </w:rPr>
-        <w:t>do que el costo indirecto vale cero. La decisión D-16 confirma que ese término existe y que el AIU nunca se calcula sobre él.</w:t>
+        <w:t>El ejemplo es un costo directo de $63.675.000 con un AIU de 10 / 5 / 5, un IVA del 19 % sobre la utilidad y sin capítulos indirectos, de modo que el costo indirecto vale cero. La decisión D-16 confirma que ese término existe y que el AIU nunca se calcula sobre él.</w:t>
       </w:r>
     </w:p>
     <w:p>
@@ -20568,33 +20484,21 @@
         <w:rPr>
           <w:lang w:val="es-CO"/>
         </w:rPr>
-        <w:t xml:space="preserve">El MVP no crea, edita ni consulta órdenes de cambio. No hay entidad, ni campos, ni </w:t>
+        <w:t xml:space="preserve">El MVP no crea, edita ni consulta órdenes de cambio. No hay entidad, ni campos, ni responsable, ni flujo de aprobación. La modificación de un proyecto en ejecución se resuelve con el mecanismo de D-5, que produce la misma trazabilidad.</w:t>
       </w:r>
+    </w:p>
+    <w:p>
+      <w:pPr>
+        <w:spacing w:after="120"/>
+        <w:rPr>
+          <w:lang w:val="es-CO"/>
+        </w:rPr>
+      </w:pPr>
       <w:r>
         <w:rPr>
           <w:lang w:val="es-CO"/>
         </w:rPr>
-        <w:t>responsable, ni flujo de aprobación. La modificación de un proyecto en ejecución se resuelve con el mecanismo de D-5, que produce la misma trazabilidad.</w:t>
-      </w:r>
-    </w:p>
-    <w:p>
-      <w:pPr>
-        <w:spacing w:after="120"/>
-        <w:rPr>
-          <w:lang w:val="es-CO"/>
-        </w:rPr>
-      </w:pPr>
-      <w:r>
-        <w:rPr>
-          <w:lang w:val="es-CO"/>
-        </w:rPr>
-        <w:t xml:space="preserve">El término queda reservado para la fase 2, donde el módulo de control de proyectos sí necesitará </w:t>
-      </w:r>
-      <w:r>
-        <w:rPr>
-          <w:lang w:val="es-CO"/>
-        </w:rPr>
-        <w:t>distinguir entre una corrección interna y un otrosí contractual.</w:t>
+        <w:t xml:space="preserve">El término queda reservado para la fase 2, donde el módulo de control de proyectos sí necesitará distinguir entre una corrección interna y un otrosí contractual.</w:t>
       </w:r>
     </w:p>
     <w:p>
@@ -20623,13 +20527,21 @@
         <w:rPr>
           <w:lang w:val="es-CO"/>
         </w:rPr>
-        <w:t>Activar un presupuesto lo congela: a partir de ese momento no admite ninguna escritura. No hay propagación de precios haci</w:t>
+        <w:t>Activar un presupuesto lo congela: a partir de ese momento no admite ninguna escritura. No hay propagación de precios hacia un presupuesto activo, con autorización del usuario ni sin ella.</w:t>
       </w:r>
+    </w:p>
+    <w:p>
+      <w:pPr>
+        <w:spacing w:after="120"/>
+        <w:rPr>
+          <w:lang w:val="es-CO"/>
+        </w:rPr>
+      </w:pPr>
       <w:r>
         <w:rPr>
           <w:lang w:val="es-CO"/>
         </w:rPr>
-        <w:t>a un presupuesto activo, con autorización del usuario ni sin ella.</w:t>
+        <w:t xml:space="preserve">El motivo es doble. Primero, la promesa comercial del producto es que la línea base es intocable, y una línea base que puede recalcularse no lo es. Segundo, editar una obra en ejecución es precisamente el trabajo del módulo de control de proyectos, que opera contra un APU propio del proyecto sin tocar el catálogo maestro; anticipar una versión pobre de eso en el MVP crearía un comportamiento que después habría que deshacer.</w:t>
       </w:r>
     </w:p>
     <w:p>
@@ -20643,65 +20555,21 @@
         <w:rPr>
           <w:lang w:val="es-CO"/>
         </w:rPr>
-        <w:t xml:space="preserve">El motivo es doble. Primero, la promesa comercial del producto es que la línea base es intocable, y una línea base que puede recalcularse no lo es. Segundo, editar una obra en ejecución es </w:t>
+        <w:t xml:space="preserve">Para modificar un presupuesto activo, el Administrador lo reabre dejando por escrito el motivo, lo edita en estado Abierto y vuelve a activarlo. El sistema guarda una versión antes de habilitar la edición, de modo que la línea base anterior queda archivada y consultable. Ese camino tiene una sola puerta en la base de datos: la función app.fn_reabrir_presupuesto, que en una misma transacción exige el motivo, comprueba que quien reabre sea Administrador, archiva la línea base y deja la reapertura en el historial. Cambiar el estado por fuera de ella queda rechazado, porque una reapertura sin línea base archivada no se puede deshacer después.</w:t>
       </w:r>
+    </w:p>
+    <w:p>
+      <w:pPr>
+        <w:spacing w:after="120"/>
+        <w:rPr>
+          <w:lang w:val="es-CO"/>
+        </w:rPr>
+      </w:pPr>
       <w:r>
         <w:rPr>
           <w:lang w:val="es-CO"/>
         </w:rPr>
-        <w:t>precisamente el trabajo del módulo de control de proyectos, que opera contra un APU propio del proyecto sin tocar el catálogo maestro; anticipar una versión pobre de eso en el MVP crearía un comportamiento que después habría que deshacer.</w:t>
-      </w:r>
-    </w:p>
-    <w:p>
-      <w:pPr>
-        <w:spacing w:after="120"/>
-        <w:rPr>
-          <w:lang w:val="es-CO"/>
-        </w:rPr>
-      </w:pPr>
-      <w:r>
-        <w:rPr>
-          <w:lang w:val="es-CO"/>
-        </w:rPr>
-        <w:t>Para modificar un</w:t>
-      </w:r>
-      <w:r>
-        <w:rPr>
-          <w:lang w:val="es-CO"/>
-        </w:rPr>
-        <w:t xml:space="preserve"> presupuesto activo, el Administrador lo reabre dejando por escrito el motivo, lo edita en estado Abierto y vuelve a activarlo. El sistema guarda una versión antes de habilitar la edición, de modo que la línea base anterior queda archivada y consultable. E</w:t>
-      </w:r>
-      <w:r>
-        <w:rPr>
-          <w:lang w:val="es-CO"/>
-        </w:rPr>
-        <w:t>se camino tiene una sola puerta en la base de datos: la función app.fn_reabrir_presupuesto, que en una misma transacción exige el motivo, comprueba que quien reabre sea Administrador, archiva la línea base y deja la reapertura en el historial. Cambiar el e</w:t>
-      </w:r>
-      <w:r>
-        <w:rPr>
-          <w:lang w:val="es-CO"/>
-        </w:rPr>
-        <w:t>stado por fuera de ella queda rechazado, porque una reapertura sin línea base archivada no se puede deshacer después.</w:t>
-      </w:r>
-    </w:p>
-    <w:p>
-      <w:pPr>
-        <w:spacing w:after="120"/>
-        <w:rPr>
-          <w:lang w:val="es-CO"/>
-        </w:rPr>
-      </w:pPr>
-      <w:r>
-        <w:rPr>
-          <w:lang w:val="es-CO"/>
-        </w:rPr>
-        <w:t>Consecuencia sobre la propagación de precios: la pregunta «¿desea actualizar este APU en los presupuestos donde está en uso?» alcanza únic</w:t>
-      </w:r>
-      <w:r>
-        <w:rPr>
-          <w:lang w:val="es-CO"/>
-        </w:rPr>
-        <w:t>amente a los presupuestos Abiertos. Los activos y los cerrados quedan fuera en todos los casos.</w:t>
+        <w:t>Consecuencia sobre la propagación de precios: la pregunta «¿desea actualizar este APU en los presupuestos donde está en uso?» alcanza únicamente a los presupuestos Abiertos. Los activos y los cerrados quedan fuera en todos los casos.</w:t>
       </w:r>
     </w:p>
     <w:tbl>
@@ -20762,36 +20630,22 @@
                 <w:sz w:val="19"/>
                 <w:lang w:val="es-CO"/>
               </w:rPr>
-              <w:t xml:space="preserve">El módulo de control introduce el «valor actual modificado»: la línea base ajustada por otrosíes y mayores </w:t>
-            </w:r>
+              <w:t xml:space="preserve">El módulo de control introduce el «valor actual modificado»: la línea base ajustada por otrosíes y mayores cantidades. Quien llegue a construirlo va a encontrar los triggers que congelan el presupuesto activo y va a pensar que son el obstáculo. No lo son, y no se quitan.</w:t>
+            </w:r>
+          </w:p>
+          <w:p>
+            <w:pPr>
+              <w:spacing w:before="40" w:after="40"/>
+              <w:rPr>
+                <w:lang w:val="es-CO"/>
+              </w:rPr>
+            </w:pPr>
             <w:r>
               <w:rPr>
                 <w:sz w:val="19"/>
                 <w:lang w:val="es-CO"/>
               </w:rPr>
-              <w:t>cantidades. Quien llegue a construirlo va a encontrar los triggers que congelan el presupuesto activo y va a pensar que son el obstáculo. No lo son, y no se quitan.</w:t>
-            </w:r>
-          </w:p>
-          <w:p>
-            <w:pPr>
-              <w:spacing w:before="40" w:after="40"/>
-              <w:rPr>
-                <w:lang w:val="es-CO"/>
-              </w:rPr>
-            </w:pPr>
-            <w:r>
-              <w:rPr>
-                <w:sz w:val="19"/>
-                <w:lang w:val="es-CO"/>
-              </w:rPr>
-              <w:t>La línea base original se conserva intacta —el propio documento de reportes lo exige como r</w:t>
-            </w:r>
-            <w:r>
-              <w:rPr>
-                <w:sz w:val="19"/>
-                <w:lang w:val="es-CO"/>
-              </w:rPr>
-              <w:t>eferencia histórica inalterable— y el otrosí añade una cifra al lado, en su propia columna. Desarmar el congelamiento para permitir otrosíes destruiría la única garantía que el producto vende.</w:t>
+              <w:t>La línea base original se conserva intacta —el propio documento de reportes lo exige como referencia histórica inalterable— y el otrosí añade una cifra al lado, en su propia columna. Desarmar el congelamiento para permitir otrosíes destruiría la única garantía que el producto vende.</w:t>
             </w:r>
           </w:p>
         </w:tc>
@@ -20823,33 +20677,21 @@
         <w:rPr>
           <w:lang w:val="es-CO"/>
         </w:rPr>
-        <w:t>Cada empresa opera en una so</w:t>
+        <w:t>Cada empresa opera en una sola moneda, definida en su configuración, y el proyecto la hereda. El catálogo de divisas vive en plataforma.moneda y el MVP trae una sola: el peso colombiano. No hay elección de moneda por proyecto ni mecanismo de conversión.</w:t>
       </w:r>
+    </w:p>
+    <w:p>
+      <w:pPr>
+        <w:spacing w:after="120"/>
+        <w:rPr>
+          <w:lang w:val="es-CO"/>
+        </w:rPr>
+      </w:pPr>
       <w:r>
         <w:rPr>
           <w:lang w:val="es-CO"/>
         </w:rPr>
-        <w:t>la moneda, definida en su configuración, y el proyecto la hereda. El catálogo de divisas vive en plataforma.moneda y el MVP trae una sola: el peso colombiano. No hay elección de moneda por proyecto ni mecanismo de conversión.</w:t>
-      </w:r>
-    </w:p>
-    <w:p>
-      <w:pPr>
-        <w:spacing w:after="120"/>
-        <w:rPr>
-          <w:lang w:val="es-CO"/>
-        </w:rPr>
-      </w:pPr>
-      <w:r>
-        <w:rPr>
-          <w:lang w:val="es-CO"/>
-        </w:rPr>
-        <w:t>Conviene separar dos necesidade</w:t>
-      </w:r>
-      <w:r>
-        <w:rPr>
-          <w:lang w:val="es-CO"/>
-        </w:rPr>
-        <w:t>s que suenan parecidas y cuestan muy distinto:</w:t>
+        <w:t>Conviene separar dos necesidades que suenan parecidas y cuestan muy distinto:</w:t>
       </w:r>
     </w:p>
     <w:p>
@@ -20864,13 +20706,7 @@
         <w:rPr>
           <w:lang w:val="es-CO"/>
         </w:rPr>
-        <w:t>•  Expandirse a otro país —una constructora peruana que trabaja íntegramente en soles— no exige rediseñar nada: basta agregar la divisa al catálogo y crear la empresa con esa moneda base, y eso llega cuando aparezca el primer cliente fuera de Colombia. Su catálogo, sus APU y sus pre</w:t>
-      </w:r>
-      <w:r>
-        <w:rPr>
-          <w:lang w:val="es-CO"/>
-        </w:rPr>
-        <w:t>supuestos viven en soles y nunca se cruzan con los de otro país.</w:t>
+        <w:t>•  Expandirse a otro país —una constructora peruana que trabaja íntegramente en soles— no exige rediseñar nada: basta agregar la divisa al catálogo y crear la empresa con esa moneda base, y eso llega cuando aparezca el primer cliente fuera de Colombia. Su catálogo, sus APU y sus presupuestos viven en soles y nunca se cruzan con los de otro país.</w:t>
       </w:r>
     </w:p>
     <w:p>
@@ -20885,13 +20721,7 @@
         <w:rPr>
           <w:lang w:val="es-CO"/>
         </w:rPr>
-        <w:t>•  Multimoneda dentro de una misma empresa —catálogo en pesos, oferta en dólares— es otra cosa: exige tabla de tasas de cambio, moneda en cada precio y congelamiento de la tasa aplicada junto</w:t>
-      </w:r>
-      <w:r>
-        <w:rPr>
-          <w:lang w:val="es-CO"/>
-        </w:rPr>
-        <w:t xml:space="preserve"> con la línea base. No se construye hasta que un cliente real lo necesite.</w:t>
+        <w:t xml:space="preserve">•  Multimoneda dentro de una misma empresa —catálogo en pesos, oferta en dólares— es otra cosa: exige tabla de tasas de cambio, moneda en cada precio y congelamiento de la tasa aplicada junto con la línea base. No se construye hasta que un cliente real lo necesite.</w:t>
       </w:r>
     </w:p>
     <w:p>
@@ -20921,33 +20751,21 @@
         <w:rPr>
           <w:lang w:val="es-CO"/>
         </w:rPr>
-        <w:t>El ingeniero crea a su asistente con correo, rol y permisos, pero no le fija la contraseña: el sistema le envía un enlace</w:t>
+        <w:t xml:space="preserve">El ingeniero crea a su asistente con correo, rol y permisos, pero no le fija la contraseña: el sistema le envía un enlace de activación de un solo uso y el asistente elige la suya al abrirlo. El estado «Pendiente» significa «invitado, aún sin activar».</w:t>
       </w:r>
+    </w:p>
+    <w:p>
+      <w:pPr>
+        <w:spacing w:after="120"/>
+        <w:rPr>
+          <w:lang w:val="es-CO"/>
+        </w:rPr>
+      </w:pPr>
       <w:r>
         <w:rPr>
           <w:lang w:val="es-CO"/>
         </w:rPr>
-        <w:t xml:space="preserve"> de activación de un solo uso y el asistente elige la suya al abrirlo. El estado «Pendiente» significa «invitado, aún sin activar».</w:t>
-      </w:r>
-    </w:p>
-    <w:p>
-      <w:pPr>
-        <w:spacing w:after="120"/>
-        <w:rPr>
-          <w:lang w:val="es-CO"/>
-        </w:rPr>
-      </w:pPr>
-      <w:r>
-        <w:rPr>
-          <w:lang w:val="es-CO"/>
-        </w:rPr>
-        <w:t>El motivo no es la comodidad, es la trazabilidad: si el administrador fija la contraseña, el administrador la conoce, y el d</w:t>
-      </w:r>
-      <w:r>
-        <w:rPr>
-          <w:lang w:val="es-CO"/>
-        </w:rPr>
-        <w:t>ía que se discuta quién cambió una cantidad en un presupuesto firmado la respuesta honesta sería «no se puede saber». El historial de cambios es una de las tres promesas del producto y esto es lo que la sostiene.</w:t>
+        <w:t>El motivo no es la comodidad, es la trazabilidad: si el administrador fija la contraseña, el administrador la conoce, y el día que se discuta quién cambió una cantidad en un presupuesto firmado la respuesta honesta sería «no se puede saber». El historial de cambios es una de las tres promesas del producto y esto es lo que la sostiene.</w:t>
       </w:r>
     </w:p>
     <w:tbl>
@@ -21008,36 +20826,22 @@
                 <w:sz w:val="19"/>
                 <w:lang w:val="es-CO"/>
               </w:rPr>
-              <w:t>El enlace de activación reutiliza la maquinaria de «olvidé mi contraseña», que el esquema ya tiene: app.token_recuperacion guarda el hash del token, no el token; el enlace es de un solo uso; y la función que lo resuelve ya está escrita. Lo único que cambia</w:t>
-            </w:r>
+              <w:t xml:space="preserve">El enlace de activación reutiliza la maquinaria de «olvidé mi contraseña», que el esquema ya tiene: app.token_recuperacion guarda el hash del token, no el token; el enlace es de un solo uso; y la función que lo resuelve ya está escrita. Lo único que cambia es el propósito y la vigencia.</w:t>
+            </w:r>
+          </w:p>
+          <w:p>
+            <w:pPr>
+              <w:spacing w:before="40" w:after="40"/>
+              <w:rPr>
+                <w:lang w:val="es-CO"/>
+              </w:rPr>
+            </w:pPr>
             <w:r>
               <w:rPr>
                 <w:sz w:val="19"/>
                 <w:lang w:val="es-CO"/>
               </w:rPr>
-              <w:t xml:space="preserve"> es el propósito y la vigencia.</w:t>
-            </w:r>
-          </w:p>
-          <w:p>
-            <w:pPr>
-              <w:spacing w:before="40" w:after="40"/>
-              <w:rPr>
-                <w:lang w:val="es-CO"/>
-              </w:rPr>
-            </w:pPr>
-            <w:r>
-              <w:rPr>
-                <w:sz w:val="19"/>
-                <w:lang w:val="es-CO"/>
-              </w:rPr>
-              <w:t xml:space="preserve">Las vigencias difieren a propósito. La recuperación dura 30 minutos porque la pide el propio usuario, que está esperando el correo. La activación dura 72 horas porque la dispara el administrador y el invitado puede verla al </w:t>
-            </w:r>
-            <w:r>
-              <w:rPr>
-                <w:sz w:val="19"/>
-                <w:lang w:val="es-CO"/>
-              </w:rPr>
-              <w:t>día siguiente.</w:t>
+              <w:t xml:space="preserve">Las vigencias difieren a propósito. La recuperación dura 30 minutos porque la pide el propio usuario, que está esperando el correo. La activación dura 72 horas porque la dispara el administrador y el invitado puede verla al día siguiente.</w:t>
             </w:r>
           </w:p>
         </w:tc>
@@ -21069,33 +20873,21 @@
         <w:rPr>
           <w:lang w:val="es-CO"/>
         </w:rPr>
-        <w:t>La clasificación se elige una sola vez, en el capítulo de primer nivel, y baja a todos sus subcapítulos y actividades. El esquema lo impone con CHECK ((clasificacion IS NOT NULL) = (nivel =</w:t>
+        <w:t xml:space="preserve">La clasificación se elige una sola vez, en el capítulo de primer nivel, y baja a todos sus subcapítulos y actividades. El esquema lo impone con CHECK ((clasificacion IS NOT NULL) = (nivel = 1)): un subcapítulo no puede llevar clasificación propia, ni siquiera por error de la interfaz.</w:t>
       </w:r>
+    </w:p>
+    <w:p>
+      <w:pPr>
+        <w:spacing w:after="120"/>
+        <w:rPr>
+          <w:lang w:val="es-CO"/>
+        </w:rPr>
+      </w:pPr>
       <w:r>
         <w:rPr>
           <w:lang w:val="es-CO"/>
         </w:rPr>
-        <w:t xml:space="preserve"> 1)): un subcapítulo no puede llevar clasificación propia, ni siquiera por error de la interfaz.</w:t>
-      </w:r>
-    </w:p>
-    <w:p>
-      <w:pPr>
-        <w:spacing w:after="120"/>
-        <w:rPr>
-          <w:lang w:val="es-CO"/>
-        </w:rPr>
-      </w:pPr>
-      <w:r>
-        <w:rPr>
-          <w:lang w:val="es-CO"/>
-        </w:rPr>
-        <w:t xml:space="preserve">Pedirla en cada nivel permitiría un subcapítulo directo colgando de un capítulo indirecto, que no significa nada y distorsionaría la base del AIU sin que nada </w:t>
-      </w:r>
-      <w:r>
-        <w:rPr>
-          <w:lang w:val="es-CO"/>
-        </w:rPr>
-        <w:t>falle.</w:t>
+        <w:t xml:space="preserve">Pedirla en cada nivel permitiría un subcapítulo directo colgando de un capítulo indirecto, que no significa nada y distorsionaría la base del AIU sin que nada falle.</w:t>
       </w:r>
     </w:p>
     <w:p>
@@ -21124,39 +20916,21 @@
         <w:rPr>
           <w:lang w:val="es-CO"/>
         </w:rPr>
-        <w:t>Incidencia del capítulo = costo directo del capítulo ÷ costo directo total de la obra × 100. El denominador es la suma de todos los capítulos de obra física; el AIU no entra, porque no es un capítul</w:t>
+        <w:t>Incidencia del capítulo = costo directo del capítulo ÷ costo directo total de la obra × 100. El denominador es la suma de todos los capítulos de obra física; el AIU no entra, porque no es un capítulo comparable con cimentación o acabados sino un porcentaje que se aplica sobre el total.</w:t>
       </w:r>
+    </w:p>
+    <w:p>
+      <w:pPr>
+        <w:spacing w:after="120"/>
+        <w:rPr>
+          <w:lang w:val="es-CO"/>
+        </w:rPr>
+      </w:pPr>
       <w:r>
         <w:rPr>
           <w:lang w:val="es-CO"/>
         </w:rPr>
-        <w:t>o comparable con cimentación o acabados sino un porcentaje que se aplica sobre el total.</w:t>
-      </w:r>
-    </w:p>
-    <w:p>
-      <w:pPr>
-        <w:spacing w:after="120"/>
-        <w:rPr>
-          <w:lang w:val="es-CO"/>
-        </w:rPr>
-      </w:pPr>
-      <w:r>
-        <w:rPr>
-          <w:lang w:val="es-CO"/>
-        </w:rPr>
-        <w:t>La consecuencia práctica es que las incidencias de los capítulos directos de primer nivel suman exactamente 100%, que es lo que el presupuestador espera ver y lo que h</w:t>
-      </w:r>
-      <w:r>
-        <w:rPr>
-          <w:lang w:val="es-CO"/>
-        </w:rPr>
-        <w:t>ace que la cifra sirva para comparar obras entre sí. Los capítulos indirectos muestran su incidencia contra esa misma base, pero quedan fuera del 100%: un presupuesto puede tener un capítulo indirecto que pese un 50% del costo directo sin que eso rompa nad</w:t>
-      </w:r>
-      <w:r>
-        <w:rPr>
-          <w:lang w:val="es-CO"/>
-        </w:rPr>
-        <w:t>a.</w:t>
+        <w:t>La consecuencia práctica es que las incidencias de los capítulos directos de primer nivel suman exactamente 100%, que es lo que el presupuestador espera ver y lo que hace que la cifra sirva para comparar obras entre sí. Los capítulos indirectos muestran su incidencia contra esa misma base, pero quedan fuera del 100%: un presupuesto puede tener un capítulo indirecto que pese un 50% del costo directo sin que eso rompa nada.</w:t>
       </w:r>
     </w:p>
     <w:p>
@@ -21230,6 +21004,14 @@
         </w:rPr>
         <w:t>Protegía al ítem con avance registrado: no se podía eliminar ni bajar su cantidad por debajo de lo ejecutado. Queda reservada hasta que el módulo de control de obra traiga el avance (D-43), y entonces vuelve tal cual: el avance ejecutado es registro histórico de la obra y borrarlo dejaría el historial contando una obra que no ocurrió.</w:t>
       </w:r>
+    </w:p>
+    <w:p>
+      <w:pPr>
+        <w:spacing w:after="120"/>
+        <w:rPr>
+          <w:lang w:val="es-CO"/>
+        </w:rPr>
+      </w:pPr>
       <w:r>
         <w:rPr>
           <w:lang w:val="es-CO"/>
@@ -21243,29 +21025,6 @@
           <w:lang w:val="es-CO"/>
         </w:rPr>
       </w:pPr>
-      <w:r>
-        <w:rPr>
-          <w:lang w:val="es-CO"/>
-        </w:rPr>
-      </w:r>
-      <w:r>
-        <w:rPr>
-          <w:lang w:val="es-CO"/>
-        </w:rPr>
-      </w:r>
-    </w:p>
-    <w:p>
-      <w:pPr>
-        <w:spacing w:after="120"/>
-        <w:rPr>
-          <w:lang w:val="es-CO"/>
-        </w:rPr>
-      </w:pPr>
-      <w:r>
-        <w:rPr>
-          <w:lang w:val="es-CO"/>
-        </w:rPr>
-      </w:r>
       <w:r>
         <w:rPr>
           <w:lang w:val="es-CO"/>
@@ -21284,13 +21043,7 @@
         <w:rPr>
           <w:lang w:val="es-CO"/>
         </w:rPr>
-        <w:t xml:space="preserve">D-13 · El cobro es manual </w:t>
-      </w:r>
-      <w:r>
-        <w:rPr>
-          <w:lang w:val="es-CO"/>
-        </w:rPr>
-        <w:t>en el MVP</w:t>
+        <w:t xml:space="preserve">D-13 · El cobro es manual en el MVP</w:t>
       </w:r>
     </w:p>
     <w:p>
@@ -21319,19 +21072,7 @@
         <w:rPr>
           <w:lang w:val="es-CO"/>
         </w:rPr>
-        <w:t>El motivo es de secuencia</w:t>
-      </w:r>
-      <w:r>
-        <w:rPr>
-          <w:lang w:val="es-CO"/>
-        </w:rPr>
-        <w:t>, no de pereza. Cobrar automáticamente exige checkout, tokenización de tarjeta, motor de cobro programado, reintentos ante rechazo, gestión de tarjetas vencidas y conciliación: un módulo del tamaño de la fase 4. Con diez o veinte clientes, registrar los pa</w:t>
-      </w:r>
-      <w:r>
-        <w:rPr>
-          <w:lang w:val="es-CO"/>
-        </w:rPr>
-        <w:t>gos a mano son treinta minutos al mes.</w:t>
+        <w:t>El motivo es de secuencia, no de pereza. Cobrar automáticamente exige checkout, tokenización de tarjeta, motor de cobro programado, reintentos ante rechazo, gestión de tarjetas vencidas y conciliación: un módulo del tamaño de la fase 4. Con diez o veinte clientes, registrar los pagos a mano son treinta minutos al mes.</w:t>
       </w:r>
     </w:p>
     <w:tbl>
@@ -21392,33 +21133,19 @@
                 <w:sz w:val="19"/>
                 <w:lang w:val="es-CO"/>
               </w:rPr>
-              <w:t xml:space="preserve">PayU descontinuó su API de pagos recurrentes y no la va a reactivar: con PayU habría que construir el motor de suscripciones sobre tokenización. Wompi tiene tokenización propia </w:t>
-            </w:r>
+              <w:t xml:space="preserve">PayU descontinuó su API de pagos recurrentes y no la va a reactivar: con PayU habría que construir el motor de suscripciones sobre tokenización. Wompi tiene tokenización propia y tarifa plana, y existen capas de suscripción sobre pasarela que evitan escribir ese motor.</w:t>
+            </w:r>
+          </w:p>
+          <w:p>
+            <w:pPr>
+              <w:spacing w:before="40" w:after="40"/>
+            </w:pPr>
             <w:r>
               <w:rPr>
                 <w:sz w:val="19"/>
                 <w:lang w:val="es-CO"/>
               </w:rPr>
-              <w:t>y tarifa plana, y existen capas de suscripción sobre pasarela que evitan escribir ese motor.</w:t>
-            </w:r>
-          </w:p>
-          <w:p>
-            <w:pPr>
-              <w:spacing w:before="40" w:after="40"/>
-            </w:pPr>
-            <w:r>
-              <w:rPr>
-                <w:sz w:val="19"/>
-                <w:lang w:val="es-CO"/>
-              </w:rPr>
-              <w:t>El paso intermedio natural, antes del cobro automático, es el enlace de pago por período: la pasarela genera el link, el cliente paga y un webhook extiende el venc</w:t>
-            </w:r>
-            <w:r>
-              <w:rPr>
-                <w:sz w:val="19"/>
-                <w:lang w:val="es-CO"/>
-              </w:rPr>
-              <w:t xml:space="preserve">imiento. </w:t>
+              <w:t xml:space="preserve">El paso intermedio natural, antes del cobro automático, es el enlace de pago por período: la pasarela genera el link, el cliente paga y un webhook extiende el vencimiento. </w:t>
             </w:r>
             <w:r>
               <w:rPr>
@@ -21456,33 +21183,21 @@
         <w:rPr>
           <w:lang w:val="es-CO"/>
         </w:rPr>
-        <w:t xml:space="preserve">Al registrarse, la empresa recibe una suscripción en estado Prueba con 15 días de vigencia. La duración es un parámetro del plan, no un número escrito en el código, </w:t>
+        <w:t xml:space="preserve">Al registrarse, la empresa recibe una suscripción en estado Prueba con 15 días de vigencia. La duración es un parámetro del plan, no un número escrito en el código, de modo que cambiarla no exige tocar el sistema.</w:t>
       </w:r>
+    </w:p>
+    <w:p>
+      <w:pPr>
+        <w:spacing w:after="120"/>
+        <w:rPr>
+          <w:lang w:val="es-CO"/>
+        </w:rPr>
+      </w:pPr>
       <w:r>
         <w:rPr>
           <w:lang w:val="es-CO"/>
         </w:rPr>
-        <w:t>de modo que cambiarla no exige tocar el sistema.</w:t>
-      </w:r>
-    </w:p>
-    <w:p>
-      <w:pPr>
-        <w:spacing w:after="120"/>
-        <w:rPr>
-          <w:lang w:val="es-CO"/>
-        </w:rPr>
-      </w:pPr>
-      <w:r>
-        <w:rPr>
-          <w:lang w:val="es-CO"/>
-        </w:rPr>
-        <w:t>Dos días antes del vencimiento el sistema avisa por correo, para que el cliente decida a tiempo. Al vencer sin pago, el acceso se corta: el usuario puede iniciar sesión pero no abrir Recursos, APU ni Presupu</w:t>
-      </w:r>
-      <w:r>
-        <w:rPr>
-          <w:lang w:val="es-CO"/>
-        </w:rPr>
-        <w:t>estos.</w:t>
+        <w:t>Dos días antes del vencimiento el sistema avisa por correo, para que el cliente decida a tiempo. Al vencer sin pago, el acceso se corta: el usuario puede iniciar sesión pero no abrir Recursos, APU ni Presupuestos.</w:t>
       </w:r>
     </w:p>
     <w:tbl>
@@ -21558,14 +21273,7 @@
                 <w:sz w:val="19"/>
                 <w:lang w:val="es-CO"/>
               </w:rPr>
-              <w:t xml:space="preserve">Una empresa que agota la prueba sin pagar nunca llegó a ser cliente. Sus datos se conservan 10 días por si se decide, y a partir de ahí el superadministrador puede eliminarlos desde el panel. Esa </w:t>
-            </w:r>
-            <w:r>
-              <w:rPr>
-                <w:sz w:val="19"/>
-                <w:lang w:val="es-CO"/>
-              </w:rPr>
-              <w:t>eliminación es siempre manual y deliberada, nunca un proceso automático: borrar el trabajo de alguien no debe poder ocurrir por un error de programación.</w:t>
+              <w:t xml:space="preserve">Una empresa que agota la prueba sin pagar nunca llegó a ser cliente. Sus datos se conservan 10 días por si se decide, y a partir de ahí el superadministrador puede eliminarlos desde el panel. Esa eliminación es siempre manual y deliberada, nunca un proceso automático: borrar el trabajo de alguien no debe poder ocurrir por un error de programación.</w:t>
             </w:r>
           </w:p>
         </w:tc>
@@ -21597,13 +21305,7 @@
         <w:rPr>
           <w:lang w:val="es-CO"/>
         </w:rPr>
-        <w:t xml:space="preserve">Al crear la empresa, el sistema precarga las doce unidades </w:t>
-      </w:r>
-      <w:r>
-        <w:rPr>
-          <w:lang w:val="es-CO"/>
-        </w:rPr>
-        <w:t>estándar de la construcción en Colombia. Sin ellas una cuenta nueva nace inservible: el formulario de recursos exige unidad de medida y el selector no ofrecería ninguna.</w:t>
+        <w:t xml:space="preserve">Al crear la empresa, el sistema precarga las doce unidades estándar de la construcción en Colombia. Sin ellas una cuenta nueva nace inservible: el formulario de recursos exige unidad de medida y el selector no ofrecería ninguna.</w:t>
       </w:r>
     </w:p>
     <w:tbl>
@@ -22347,13 +22049,7 @@
         <w:rPr>
           <w:lang w:val="es-CO"/>
         </w:rPr>
-        <w:t xml:space="preserve">No son una lista cerrada. El usuario puede renombrarlas, eliminar las que no use y crear las suyas, incluidas las de otro sistema de medida si trabaja </w:t>
-      </w:r>
-      <w:r>
-        <w:rPr>
-          <w:lang w:val="es-CO"/>
-        </w:rPr>
-        <w:t xml:space="preserve">fuera de Colombia (RF-CFG-17 a RF-CFG-20). </w:t>
+        <w:t xml:space="preserve">No son una lista cerrada. El usuario puede renombrarlas, eliminar las que no use y crear las suyas, incluidas las de otro sistema de medida si trabaja fuera de Colombia (RF-CFG-17 a RF-CFG-20). </w:t>
       </w:r>
       <w:r>
         <w:t>La precarga solo evita que el sistema arranque inservible.</w:t>
@@ -22418,21 +22114,7 @@
                 <w:sz w:val="19"/>
                 <w:lang w:val="es-CO"/>
               </w:rPr>
-              <w:t>app.unidad_medida lleva tenant_id, de modo que las filas no pueden sembrarse con un INSERT en el esquema: nacen cuando nace la empresa.</w:t>
-            </w:r>
-            <w:r>
-              <w:rPr>
-                <w:sz w:val="19"/>
-                <w:lang w:val="es-CO"/>
-              </w:rPr>
-              <w:t xml:space="preserve"> El esquema trae la función app.fn_crear_unidades_estandar(tenant_id), que debe llamarse dentro de la misma transacción que da de alta el inquilino, junto con el rol Administrador, las secuencias de código y la configuración por defecto. La función es idem</w:t>
-            </w:r>
-            <w:r>
-              <w:rPr>
-                <w:sz w:val="19"/>
-                <w:lang w:val="es-CO"/>
-              </w:rPr>
-              <w:t>potente: volver a llamarla no duplica filas ni pisa los cambios que el usuario haya hecho.</w:t>
+              <w:t xml:space="preserve">app.unidad_medida lleva tenant_id, de modo que las filas no pueden sembrarse con un INSERT en el esquema: nacen cuando nace la empresa. El esquema trae la función app.fn_crear_unidades_estandar(tenant_id), que debe llamarse dentro de la misma transacción que da de alta el inquilino, junto con el rol Administrador, las secuencias de código y la configuración por defecto. La función es idempotente: volver a llamarla no duplica filas ni pisa los cambios que el usuario haya hecho.</w:t>
             </w:r>
           </w:p>
         </w:tc>
@@ -22464,33 +22146,21 @@
         <w:rPr>
           <w:lang w:val="es-CO"/>
         </w:rPr>
-        <w:t xml:space="preserve">Un presupuesto de obra lleva, con toda normalidad, capítulos que no son obra física: un capítulo de preliminares con </w:t>
+        <w:t xml:space="preserve">Un presupuesto de obra lleva, con toda normalidad, capítulos que no son obra física: un capítulo de preliminares con la topografía, el estudio de suelos y el sueldo del director de obra es el caso corriente.</w:t>
       </w:r>
+    </w:p>
+    <w:p>
+      <w:pPr>
+        <w:spacing w:after="120"/>
+        <w:rPr>
+          <w:lang w:val="es-CO"/>
+        </w:rPr>
+      </w:pPr>
       <w:r>
         <w:rPr>
           <w:lang w:val="es-CO"/>
         </w:rPr>
-        <w:t>la topografía, el estudio de suelos y el sueldo del director de obra es el caso corriente.</w:t>
-      </w:r>
-    </w:p>
-    <w:p>
-      <w:pPr>
-        <w:spacing w:after="120"/>
-        <w:rPr>
-          <w:lang w:val="es-CO"/>
-        </w:rPr>
-      </w:pPr>
-      <w:r>
-        <w:rPr>
-          <w:lang w:val="es-CO"/>
-        </w:rPr>
-        <w:t>Cada capítulo de primer nivel se clasifica como Costo Directo o Costo Indirecto. Es obligatorio y no tiene valor por defecto: el sistema obliga a elegir, porque un c</w:t>
-      </w:r>
-      <w:r>
-        <w:rPr>
-          <w:lang w:val="es-CO"/>
-        </w:rPr>
-        <w:t>apítulo de indirectos contado como obra física distorsiona el AIU sin que nada falle. Los subcapítulos y actividades heredan la clasificación de su capítulo raíz (D-8).</w:t>
+        <w:t>Cada capítulo de primer nivel se clasifica como Costo Directo o Costo Indirecto. Es obligatorio y no tiene valor por defecto: el sistema obliga a elegir, porque un capítulo de indirectos contado como obra física distorsiona el AIU sin que nada falle. Los subcapítulos y actividades heredan la clasificación de su capítulo raíz (D-8).</w:t>
       </w:r>
     </w:p>
     <w:p>
@@ -22649,14 +22319,7 @@
                 <w:sz w:val="19"/>
                 <w:lang w:val="es-CO"/>
               </w:rPr>
-              <w:t xml:space="preserve"> de </w:t>
-            </w:r>
-            <w:r>
-              <w:rPr>
-                <w:sz w:val="19"/>
-                <w:lang w:val="es-CO"/>
-              </w:rPr>
-              <w:t>los capítulos clasificados como directos</w:t>
+              <w:t xml:space="preserve"> de los capítulos clasificados como directos</w:t>
             </w:r>
           </w:p>
         </w:tc>
@@ -22885,14 +22548,7 @@
                 <w:sz w:val="19"/>
                 <w:lang w:val="es-CO"/>
               </w:rPr>
-              <w:t xml:space="preserve">Valor Total = Costo Directo + </w:t>
-            </w:r>
-            <w:r>
-              <w:rPr>
-                <w:sz w:val="19"/>
-                <w:lang w:val="es-CO"/>
-              </w:rPr>
-              <w:t>Costo Indirecto + AIU + IVA(Utilidad)</w:t>
+              <w:t xml:space="preserve">Valor Total = Costo Directo + Costo Indirecto + AIU + IVA(Utilidad)</w:t>
             </w:r>
           </w:p>
         </w:tc>
@@ -22951,36 +22607,23 @@
                 <w:sz w:val="19"/>
                 <w:lang w:val="es-CO"/>
               </w:rPr>
-              <w:t>Si el sueldo del director de obra ya está cuantificado peso a peso dentro de un capítulo, aplicarle encima el porcentaje de Administración sería cobrar dos veces lo mismo. La A de</w:t>
-            </w:r>
+              <w:t>Si el sueldo del director de obra ya está cuantificado peso a peso dentro de un capítulo, aplicarle encima el porcentaje de Administración sería cobrar dos veces lo mismo. La A del AIU existe precisamente para estimar esa administración cuando NO se detalla; donde sí se detalla, sobra.</w:t>
+            </w:r>
+          </w:p>
+          <w:p>
+            <w:pPr>
+              <w:spacing w:before="40" w:after="40"/>
+              <w:rPr>
+                <w:lang w:val="es-CO"/>
+              </w:rPr>
+            </w:pPr>
             <w:r>
               <w:rPr>
                 <w:sz w:val="19"/>
                 <w:lang w:val="es-CO"/>
               </w:rPr>
-              <w:t>l AIU existe precisamente para estimar esa administración cuando NO se detalla; donde sí se detalla, sobra.</w:t>
-            </w:r>
-          </w:p>
-          <w:p>
-            <w:pPr>
-              <w:spacing w:before="40" w:after="40"/>
-              <w:rPr>
-                <w:lang w:val="es-CO"/>
-              </w:rPr>
-            </w:pPr>
-            <w:r>
-              <w:rPr>
-                <w:sz w:val="19"/>
-                <w:lang w:val="es-CO"/>
-              </w:rPr>
               <w:t>Sobre el presupuesto de la sección 8 del documento 06 —$105.490.000 de costo directo y un capítulo de preliminares de $53.000.000—, un AIU de 10/5/5 da $21.098.000, el IVA sobre la utilidad $1.002.155 y el valor total $180.590.155. Si la base del AIU incluyera los indirectos, el AIU sería $31.698.000: $10.600.000 que el cliente pagaría por una administración que ya le facturaron en detalle.</w:t>
             </w:r>
-            <w:r>
-              <w:rPr>
-                <w:sz w:val="19"/>
-                <w:lang w:val="es-CO"/>
-              </w:rPr>
-            </w:r>
           </w:p>
         </w:tc>
       </w:tr>
@@ -22996,13 +22639,7 @@
         <w:rPr>
           <w:lang w:val="es-CO"/>
         </w:rPr>
-        <w:t>Consecuencia sobre la incidencia: el denominador sigue siendo el costo directo total (D-9). Los capítulos directos suman 100% entre ellos y los indirectos muestran su incidencia contra esa misma base, fuera del 100%. En ese mismo presupuesto, el capítulo d</w:t>
-      </w:r>
-      <w:r>
-        <w:rPr>
-          <w:lang w:val="es-CO"/>
-        </w:rPr>
-        <w:t>e preliminares pesa un 50,24% del costo directo ($53.000.000 ÷ $105.490.000) y los dos capítulos directos dan 64,74% y 35,26%, que suman exactamente cien. Son dos naturalezas distintas que no se suman en el mismo porcentaje.</w:t>
+        <w:t>Consecuencia sobre la incidencia: el denominador sigue siendo el costo directo total (D-9). Los capítulos directos suman 100% entre ellos y los indirectos muestran su incidencia contra esa misma base, fuera del 100%. En ese mismo presupuesto, el capítulo de preliminares pesa un 50,24% del costo directo ($53.000.000 ÷ $105.490.000) y los dos capítulos directos dan 64,74% y 35,26%, que suman exactamente cien. Son dos naturalezas distintas que no se suman en el mismo porcentaje.</w:t>
       </w:r>
     </w:p>
     <w:p>
@@ -23017,33 +22654,21 @@
         <w:rPr>
           <w:lang w:val="es-CO"/>
         </w:rPr>
-        <w:t>D-17 · Solo obra de construcció</w:t>
+        <w:t>D-17 · Solo obra de construcción, con la puerta abierta</w:t>
       </w:r>
+    </w:p>
+    <w:p>
+      <w:pPr>
+        <w:spacing w:after="120"/>
+        <w:rPr>
+          <w:lang w:val="es-CO"/>
+        </w:rPr>
+      </w:pPr>
       <w:r>
         <w:rPr>
           <w:lang w:val="es-CO"/>
         </w:rPr>
-        <w:t>n, con la puerta abierta</w:t>
-      </w:r>
-    </w:p>
-    <w:p>
-      <w:pPr>
-        <w:spacing w:after="120"/>
-        <w:rPr>
-          <w:lang w:val="es-CO"/>
-        </w:rPr>
-      </w:pPr>
-      <w:r>
-        <w:rPr>
-          <w:lang w:val="es-CO"/>
-        </w:rPr>
-        <w:t>El MVP presupuesta obra de construcción y nada más. Un presupuesto en el que todos los capítulos fueran indirectos dejaría el costo directo en cero, y con él el AIU, porque su base es precisamente el costo directo. Ese caso corresp</w:t>
-      </w:r>
-      <w:r>
-        <w:rPr>
-          <w:lang w:val="es-CO"/>
-        </w:rPr>
-        <w:t>onde a una oferta de servicios —interventoría, consultoría, gerencia de proyecto— y no a una obra.</w:t>
+        <w:t>El MVP presupuesta obra de construcción y nada más. Un presupuesto en el que todos los capítulos fueran indirectos dejaría el costo directo en cero, y con él el AIU, porque su base es precisamente el costo directo. Ese caso corresponde a una oferta de servicios —interventoría, consultoría, gerencia de proyecto— y no a una obra.</w:t>
       </w:r>
     </w:p>
     <w:tbl>
@@ -23104,45 +22729,25 @@
                 <w:sz w:val="19"/>
                 <w:lang w:val="es-CO"/>
               </w:rPr>
-              <w:t>«Indirecto» es relativo al objeto del contrato. El sueldo del director de obra es un costo indirecto en un contrato de</w:t>
-            </w:r>
+              <w:t xml:space="preserve">«Indirecto» es relativo al objeto del contrato. El sueldo del director de obra es un costo indirecto en un contrato de construcción, pero el equipo profesional ES el costo directo de un contrato de interventoría. La </w:t>
+              <w:lastRenderedPageBreak/>
+              <w:t>aritmética del AIU sobre el costo directo sirve igual para los dos: lo que cambia es qué se clasifica como directo, y eso lo decide el usuario capítulo por capítulo.</w:t>
+            </w:r>
+          </w:p>
+          <w:p>
+            <w:pPr>
+              <w:spacing w:before="40" w:after="40"/>
+            </w:pPr>
             <w:r>
               <w:rPr>
                 <w:sz w:val="19"/>
                 <w:lang w:val="es-CO"/>
               </w:rPr>
-              <w:t xml:space="preserve"> construcción, pero el equipo profesional ES el costo directo de un contrato de interventoría. La </w:t>
+              <w:t xml:space="preserve">Por eso el gancho no es un interruptor de cálculo. Cuando existan más tipos gobernará el vocabulario de la interfaz, la clasificación sugerida al crear un capítulo y las validaciones de coherencia. </w:t>
             </w:r>
             <w:r>
               <w:rPr>
                 <w:sz w:val="19"/>
-                <w:lang w:val="es-CO"/>
-              </w:rPr>
-              <w:lastRenderedPageBreak/>
-              <w:t>aritmética del AIU sobre el costo directo sirve igual para los dos: lo que cambia es qué se clasifica como directo, y eso lo decide el usuario capítulo por ca</w:t>
-            </w:r>
-            <w:r>
-              <w:rPr>
-                <w:sz w:val="19"/>
-                <w:lang w:val="es-CO"/>
-              </w:rPr>
-              <w:t>pítulo.</w:t>
-            </w:r>
-          </w:p>
-          <w:p>
-            <w:pPr>
-              <w:spacing w:before="40" w:after="40"/>
-            </w:pPr>
-            <w:r>
-              <w:rPr>
-                <w:sz w:val="19"/>
-                <w:lang w:val="es-CO"/>
-              </w:rPr>
-              <w:t xml:space="preserve">Por eso el gancho no es un interruptor de cálculo. Cuando existan más tipos gobernará el vocabulario de la interfaz, la clasificación sugerida al crear un capítulo y las validaciones de coherencia. </w:t>
-            </w:r>
-            <w:r>
-              <w:rPr>
-                <w:sz w:val="19"/>
               </w:rPr>
               <w:t>Nada más.</w:t>
             </w:r>
@@ -23162,33 +22767,21 @@
           <w:lang w:val="es-CO"/>
         </w:rPr>
         <w:lastRenderedPageBreak/>
-        <w:t>Implementación: la columna presupuesto.</w:t>
+        <w:t>Implementación: la columna presupuesto.tipo_proyecto admite un único valor, CONSTRUCCION, que es también su valor por defecto. Añadir un tipo nuevo es ampliar esa restricción y nada más. Es el mismo patrón que ya usa apu_version.ambito.</w:t>
       </w:r>
+    </w:p>
+    <w:p>
+      <w:pPr>
+        <w:spacing w:after="120"/>
+        <w:rPr>
+          <w:lang w:val="es-CO"/>
+        </w:rPr>
+      </w:pPr>
       <w:r>
         <w:rPr>
           <w:lang w:val="es-CO"/>
         </w:rPr>
-        <w:t>tipo_proyecto admite un único valor, CONSTRUCCION, que es también su valor por defecto. Añadir un tipo nuevo es ampliar esa restricción y nada más. Es el mismo patrón que ya usa apu_version.ambito.</w:t>
-      </w:r>
-    </w:p>
-    <w:p>
-      <w:pPr>
-        <w:spacing w:after="120"/>
-        <w:rPr>
-          <w:lang w:val="es-CO"/>
-        </w:rPr>
-      </w:pPr>
-      <w:r>
-        <w:rPr>
-          <w:lang w:val="es-CO"/>
-        </w:rPr>
-        <w:t>Mientras haya un solo tipo, la i</w:t>
-      </w:r>
-      <w:r>
-        <w:rPr>
-          <w:lang w:val="es-CO"/>
-        </w:rPr>
-        <w:t>nterfaz no muestra ningún selector: sería pedirle al usuario una decisión que no tiene alternativas. Por eso D-17 no genera ningún requisito funcional.</w:t>
+        <w:t>Mientras haya un solo tipo, la interfaz no muestra ningún selector: sería pedirle al usuario una decisión que no tiene alternativas. Por eso D-17 no genera ningún requisito funcional.</w:t>
       </w:r>
     </w:p>
     <w:p>
@@ -23217,39 +22810,21 @@
         <w:rPr>
           <w:lang w:val="es-CO"/>
         </w:rPr>
-        <w:t>Archivar es la operación de uso diario: es reve</w:t>
+        <w:t>Archivar es la operación de uso diario: es reversible, está disponible en cualquier estado, no borra nada y saca al presupuesto de la vista maestra, que por defecto solo muestra los no archivados y ofrece un filtro «Ver archivados». Es lo que se usa con una licitación que no se ganó o un proyecto que no salió rentable.</w:t>
       </w:r>
+    </w:p>
+    <w:p>
+      <w:pPr>
+        <w:spacing w:after="120"/>
+        <w:rPr>
+          <w:lang w:val="es-CO"/>
+        </w:rPr>
+      </w:pPr>
       <w:r>
         <w:rPr>
           <w:lang w:val="es-CO"/>
         </w:rPr>
-        <w:t>rsible, está disponible en cualquier estado, no borra nada y saca al presupuesto de la vista maestra, que por defecto solo muestra los no archivados y ofrece un filtro «Ver archivados». Es lo que se usa con una licitación que no se ganó o un proyecto que n</w:t>
-      </w:r>
-      <w:r>
-        <w:rPr>
-          <w:lang w:val="es-CO"/>
-        </w:rPr>
-        <w:t>o salió rentable.</w:t>
-      </w:r>
-    </w:p>
-    <w:p>
-      <w:pPr>
-        <w:spacing w:after="120"/>
-        <w:rPr>
-          <w:lang w:val="es-CO"/>
-        </w:rPr>
-      </w:pPr>
-      <w:r>
-        <w:rPr>
-          <w:lang w:val="es-CO"/>
-        </w:rPr>
-        <w:t xml:space="preserve">Eliminar existe solo para presupuestos que nunca fueron activados, y borra en cascada sus capítulos, actividades, versiones y eventos. Un presupuesto que alguna vez estuvo Activo no se puede eliminar nunca, por ningún rol, ni siquiera el </w:t>
-      </w:r>
-      <w:r>
-        <w:rPr>
-          <w:lang w:val="es-CO"/>
-        </w:rPr>
-        <w:t>Administrador: su línea base es registro contractual. Se archiva.</w:t>
+        <w:t xml:space="preserve">Eliminar existe solo para presupuestos que nunca fueron activados, y borra en cascada sus capítulos, actividades, versiones y eventos. Un presupuesto que alguna vez estuvo Activo no se puede eliminar nunca, por ningún rol, ni siquiera el Administrador: su línea base es registro contractual. Se archiva.</w:t>
       </w:r>
     </w:p>
     <w:p>
@@ -23309,17 +22884,7 @@
                 <w:sz w:val="18"/>
                 <w:lang w:val="es-CO"/>
               </w:rPr>
-              <w:t>No existe la transición Abierto → Cerra</w:t>
-            </w:r>
-            <w:r>
-              <w:rPr>
-                <w:b/>
-                <w:caps/>
-                <w:color w:val="13496B"/>
-                <w:sz w:val="18"/>
-                <w:lang w:val="es-CO"/>
-              </w:rPr>
-              <w:t>do</w:t>
+              <w:t>No existe la transición Abierto → Cerrado</w:t>
             </w:r>
           </w:p>
           <w:p>
@@ -23357,11 +22922,6 @@
         </w:rPr>
         <w:t>D-19 · Duplicar copia la oferta</w:t>
       </w:r>
-      <w:r>
-        <w:rPr>
-          <w:lang w:val="es-CO"/>
-        </w:rPr>
-      </w:r>
     </w:p>
     <w:p>
       <w:pPr>
@@ -23376,10 +22936,19 @@
         </w:rPr>
         <w:t>La copia toma exactamente lo que tenía el original: la misma versión de cada APU, el mismo precio unitario, las mismas cantidades y los mismos porcentajes de AIU e IVA. Nace ABIERTA y guarda a qué presupuesto duplica.</w:t>
       </w:r>
+    </w:p>
+    <w:p>
+      <w:pPr>
+        <w:spacing w:after="120"/>
+        <w:rPr>
+          <w:lang w:val="es-CO"/>
+        </w:rPr>
+      </w:pPr>
       <w:r>
         <w:rPr>
           <w:lang w:val="es-CO"/>
         </w:rPr>
+        <w:t xml:space="preserve">Antes de confirmar, el sistema muestra qué APU quedaron desactualizados —aquellos cuya versión en el original ya no es la vigente del catálogo— y ofrece actualizarlos en la copia. Si el usuario acepta, el diálogo muestra el valor total antes y después: actualizar cambia la oferta, y esa cifra es la que el ingeniero va a firmar.</w:t>
       </w:r>
     </w:p>
     <w:p>
@@ -23393,33 +22962,7 @@
         <w:rPr>
           <w:lang w:val="es-CO"/>
         </w:rPr>
-        <w:t xml:space="preserve">Antes de confirmar, el sistema muestra qué APU quedaron desactualizados —aquellos cuya versión en el original ya no es la vigente del catálogo— y ofrece actualizarlos en la copia. Si el </w:t>
-      </w:r>
-      <w:r>
-        <w:rPr>
-          <w:lang w:val="es-CO"/>
-        </w:rPr>
-        <w:t>usuario acepta, el diálogo muestra el valor total antes y después: actualizar cambia la oferta, y esa cifra es la que el ingeniero va a firmar.</w:t>
-      </w:r>
-    </w:p>
-    <w:p>
-      <w:pPr>
-        <w:spacing w:after="120"/>
-        <w:rPr>
-          <w:lang w:val="es-CO"/>
-        </w:rPr>
-      </w:pPr>
-      <w:r>
-        <w:rPr>
-          <w:lang w:val="es-CO"/>
-        </w:rPr>
-        <w:t>Al duplicar un proyecto cerrado hace dos años se va a marcar casi todo, y eso es correcto: el sistema le está di</w:t>
-      </w:r>
-      <w:r>
-        <w:rPr>
-          <w:lang w:val="es-CO"/>
-        </w:rPr>
-        <w:t>ciendo al presupuestador que está a punto de reutilizar precios viejos.</w:t>
+        <w:t>Al duplicar un proyecto cerrado hace dos años se va a marcar casi todo, y eso es correcto: el sistema le está diciendo al presupuestador que está a punto de reutilizar precios viejos.</w:t>
       </w:r>
     </w:p>
     <w:p>
@@ -23448,13 +22991,21 @@
         <w:rPr>
           <w:lang w:val="es-CO"/>
         </w:rPr>
-        <w:t>Un presupuesto sin ninguna actividad no se puede activar, y uno cuyo valor total sea cero tampoco. Son dos errores distintos y llevan dos mensa</w:t>
+        <w:t>Un presupuesto sin ninguna actividad no se puede activar, y uno cuyo valor total sea cero tampoco. Son dos errores distintos y llevan dos mensajes distintos: el primero dice que no hay actividades, el segundo pide revisar las cantidades de obra, que es el caso de quien armó el árbol de capítulos y dejó todas las cantidades en cero.</w:t>
       </w:r>
+    </w:p>
+    <w:p>
+      <w:pPr>
+        <w:spacing w:after="120"/>
+        <w:rPr>
+          <w:lang w:val="es-CO"/>
+        </w:rPr>
+      </w:pPr>
       <w:r>
         <w:rPr>
           <w:lang w:val="es-CO"/>
         </w:rPr>
-        <w:t>jes distintos: el primero dice que no hay actividades, el segundo pide revisar las cantidades de obra, que es el caso de quien armó el árbol de capítulos y dejó todas las cantidades en cero.</w:t>
+        <w:t>La validación vive en la base de datos, dentro de fn_transicion_estado, no solo en la interfaz: la operación debe rechazarse aunque la petición se construya a mano (RNF-21).</w:t>
       </w:r>
     </w:p>
     <w:p>
@@ -23468,33 +23019,7 @@
         <w:rPr>
           <w:lang w:val="es-CO"/>
         </w:rPr>
-        <w:t>La validación vive en la base de datos, dentro de fn_transicion_e</w:t>
-      </w:r>
-      <w:r>
-        <w:rPr>
-          <w:lang w:val="es-CO"/>
-        </w:rPr>
-        <w:t>stado, no solo en la interfaz: la operación debe rechazarse aunque la petición se construya a mano (RNF-21).</w:t>
-      </w:r>
-    </w:p>
-    <w:p>
-      <w:pPr>
-        <w:spacing w:after="120"/>
-        <w:rPr>
-          <w:lang w:val="es-CO"/>
-        </w:rPr>
-      </w:pPr>
-      <w:r>
-        <w:rPr>
-          <w:lang w:val="es-CO"/>
-        </w:rPr>
-        <w:t xml:space="preserve">El aviso de RF-PRE-35, el que advierte al activar con el AIU en cero, es otra cosa y sigue siendo no bloqueante. Hay obras que se ofertan a costo; </w:t>
-      </w:r>
-      <w:r>
-        <w:rPr>
-          <w:lang w:val="es-CO"/>
-        </w:rPr>
-        <w:t>no hay obras sin actividades.</w:t>
+        <w:t xml:space="preserve">El aviso de RF-PRE-35, el que advierte al activar con el AIU en cero, es otra cosa y sigue siendo no bloqueante. Hay obras que se ofertan a costo; no hay obras sin actividades.</w:t>
       </w:r>
     </w:p>
     <w:p>
@@ -23523,13 +23048,7 @@
         <w:rPr>
           <w:lang w:val="es-CO"/>
         </w:rPr>
-        <w:t>No se puede guardar una versión de APU sin al menos una línea de recurso, y el costo directo de la versión tiene que ser igual a la suma de los subtotales de sus líneas. Las dos cosas las ver</w:t>
-      </w:r>
-      <w:r>
-        <w:rPr>
-          <w:lang w:val="es-CO"/>
-        </w:rPr>
-        <w:t>ifica la base de datos, no la interfaz.</w:t>
+        <w:t>No se puede guardar una versión de APU sin al menos una línea de recurso, y el costo directo de la versión tiene que ser igual a la suma de los subtotales de sus líneas. Las dos cosas las verifica la base de datos, no la interfaz.</w:t>
       </w:r>
     </w:p>
     <w:p>
@@ -23605,21 +23124,7 @@
                 <w:sz w:val="19"/>
                 <w:lang w:val="es-CO"/>
               </w:rPr>
-              <w:t xml:space="preserve">El esquema obliga </w:t>
-            </w:r>
-            <w:r>
-              <w:rPr>
-                <w:sz w:val="19"/>
-                <w:lang w:val="es-CO"/>
-              </w:rPr>
-              <w:t>a insertar la cabecera de la versión antes que las líneas, porque costo_directo no tiene DEFAULT y la tabla no admite UPDATE. En el momento del INSERT de la cabecera todavía no hay líneas que contar, así que ningún CHECK ni ningún trigger normal puede vali</w:t>
-            </w:r>
-            <w:r>
-              <w:rPr>
-                <w:sz w:val="19"/>
-                <w:lang w:val="es-CO"/>
-              </w:rPr>
-              <w:t>dar esto.</w:t>
+              <w:t xml:space="preserve">El esquema obliga a insertar la cabecera de la versión antes que las líneas, porque costo_directo no tiene DEFAULT y la tabla no admite UPDATE. En el momento del INSERT de la cabecera todavía no hay líneas que contar, así que ningún CHECK ni ningún trigger normal puede validar esto.</w:t>
             </w:r>
           </w:p>
           <w:p>
@@ -23652,33 +23157,21 @@
         <w:rPr>
           <w:lang w:val="es-CO"/>
         </w:rPr>
-        <w:t xml:space="preserve">D-22 · </w:t>
+        <w:t xml:space="preserve">D-22 · Editar siempre crea versión; la pregunta solo mueve presupuestos abiertos</w:t>
       </w:r>
+    </w:p>
+    <w:p>
+      <w:pPr>
+        <w:spacing w:after="120"/>
+        <w:rPr>
+          <w:lang w:val="es-CO"/>
+        </w:rPr>
+      </w:pPr>
       <w:r>
         <w:rPr>
           <w:lang w:val="es-CO"/>
         </w:rPr>
-        <w:t>Editar siempre crea versión; la pregunta solo mueve presupuestos abiertos</w:t>
-      </w:r>
-    </w:p>
-    <w:p>
-      <w:pPr>
-        <w:spacing w:after="120"/>
-        <w:rPr>
-          <w:lang w:val="es-CO"/>
-        </w:rPr>
-      </w:pPr>
-      <w:r>
-        <w:rPr>
-          <w:lang w:val="es-CO"/>
-        </w:rPr>
-        <w:t xml:space="preserve">Editar un recurso o un APU crea una versión nueva del APU afectado, y esa versión siempre queda como vigente. El catálogo refleja el precio actual, sin excepción, y la vista maestra </w:t>
-      </w:r>
-      <w:r>
-        <w:rPr>
-          <w:lang w:val="es-CO"/>
-        </w:rPr>
-        <w:t>del APU muestra el costo de la versión vigente.</w:t>
+        <w:t xml:space="preserve">Editar un recurso o un APU crea una versión nueva del APU afectado, y esa versión siempre queda como vigente. El catálogo refleja el precio actual, sin excepción, y la vista maestra del APU muestra el costo de la versión vigente.</w:t>
       </w:r>
     </w:p>
     <w:p>
@@ -23707,13 +23200,7 @@
         <w:rPr>
           <w:lang w:val="es-CO"/>
         </w:rPr>
-        <w:t>•  Sí: los ítems de los presup</w:t>
-      </w:r>
-      <w:r>
-        <w:rPr>
-          <w:lang w:val="es-CO"/>
-        </w:rPr>
-        <w:t>uestos abiertos seleccionados pasan a la versión nueva, se actualizan su precio unitario y su costo total, y se recalculan los totales de esos presupuestos.</w:t>
+        <w:t>•  Sí: los ítems de los presupuestos abiertos seleccionados pasan a la versión nueva, se actualizan su precio unitario y su costo total, y se recalculan los totales de esos presupuestos.</w:t>
       </w:r>
     </w:p>
     <w:p>
@@ -23728,13 +23215,7 @@
         <w:rPr>
           <w:lang w:val="es-CO"/>
         </w:rPr>
-        <w:t xml:space="preserve">•  No: los presupuestos abiertos quedan exactamente como estaban, apuntando a su versión anterior. </w:t>
-      </w:r>
-      <w:r>
-        <w:rPr>
-          <w:lang w:val="es-CO"/>
-        </w:rPr>
-        <w:t>Los proyectos que se creen de aquí en adelante toman la versión nueva, porque es la vigente.</w:t>
+        <w:t xml:space="preserve">•  No: los presupuestos abiertos quedan exactamente como estaban, apuntando a su versión anterior. Los proyectos que se creen de aquí en adelante toman la versión nueva, porque es la vigente.</w:t>
       </w:r>
     </w:p>
     <w:p>
@@ -23762,13 +23243,7 @@
         <w:rPr>
           <w:lang w:val="es-CO"/>
         </w:rPr>
-        <w:t>Sobre el volumen: si el recurso está en cuarenta APU, se crean cuarenta vers</w:t>
-      </w:r>
-      <w:r>
-        <w:rPr>
-          <w:lang w:val="es-CO"/>
-        </w:rPr>
-        <w:t>iones, pero se muestra un solo diálogo, no cuarenta. El diálogo habla de presupuestos, no de APU: «este recurso se usa en 40 APU, presentes en 7 presupuestos abiertos», con la lista de los siete y una casilla por cada uno.</w:t>
+        <w:t>Sobre el volumen: si el recurso está en cuarenta APU, se crean cuarenta versiones, pero se muestra un solo diálogo, no cuarenta. El diálogo habla de presupuestos, no de APU: «este recurso se usa en 40 APU, presentes en 7 presupuestos abiertos», con la lista de los siete y una casilla por cada uno.</w:t>
       </w:r>
     </w:p>
     <w:p>
@@ -23785,29 +23260,19 @@
         </w:rPr>
         <w:t>D-23 · Reservada — vuelve con el control de obra</w:t>
       </w:r>
+    </w:p>
+    <w:p>
+      <w:pPr>
+        <w:spacing w:after="120"/>
+        <w:rPr>
+          <w:lang w:val="es-CO"/>
+        </w:rPr>
+      </w:pPr>
       <w:r>
         <w:rPr>
           <w:lang w:val="es-CO"/>
         </w:rPr>
-      </w:r>
-    </w:p>
-    <w:p>
-      <w:pPr>
-        <w:spacing w:after="120"/>
-        <w:rPr>
-          <w:lang w:val="es-CO"/>
-        </w:rPr>
-      </w:pPr>
-      <w:r>
-        <w:rPr>
-          <w:lang w:val="es-CO"/>
-        </w:rPr>
         <w:t>Definía el valor ejecutado como columna derivada que la base recalcula sola. Queda reservada con el resto del avance (D-43). Lo que sí sigue en pie es su motivo de fondo: el MVP no lleva precios con fecha de vigencia, y esa es justamente la frontera entre presupuestar y controlar obra.</w:t>
-      </w:r>
-      <w:r>
-        <w:rPr>
-          <w:lang w:val="es-CO"/>
-        </w:rPr>
       </w:r>
     </w:p>
     <w:p>
@@ -23866,17 +23331,7 @@
                 <w:sz w:val="18"/>
                 <w:lang w:val="es-CO"/>
               </w:rPr>
-              <w:t>El límit</w:t>
-            </w:r>
-            <w:r>
-              <w:rPr>
-                <w:b/>
-                <w:caps/>
-                <w:color w:val="13496B"/>
-                <w:sz w:val="18"/>
-                <w:lang w:val="es-CO"/>
-              </w:rPr>
-              <w:t>e del MVP, dicho en voz alta</w:t>
+              <w:t>El límite del MVP, dicho en voz alta</w:t>
             </w:r>
           </w:p>
           <w:p>
@@ -23891,19 +23346,27 @@
                 <w:sz w:val="19"/>
                 <w:lang w:val="es-CO"/>
               </w:rPr>
-              <w:t>El MVP no lleva precios con fecha de vigencia. Un ítem tiene un solo precio unitario, así que no se puede valorar lo ejecutado antes del ajuste al precio viejo y lo posterior al nuevo. Si el ajuste es un reajuste que aplica a t</w:t>
-            </w:r>
+              <w:t>El MVP no lleva precios con fecha de vigencia. Un ítem tiene un solo precio unitario, así que no se puede valorar lo ejecutado antes del ajuste al precio viejo y lo posterior al nuevo. Si el ajuste es un reajuste que aplica a toda la obra, la revaluación completa es lo correcto. Si el ajuste solo debía aplicar desde una fecha, el MVP no lo sabe representar.</w:t>
+            </w:r>
+          </w:p>
+          <w:p>
+            <w:pPr>
+              <w:spacing w:before="40" w:after="100"/>
+              <w:rPr>
+                <w:lang w:val="es-CO"/>
+              </w:rPr>
+            </w:pPr>
             <w:r>
               <w:rPr>
                 <w:sz w:val="19"/>
                 <w:lang w:val="es-CO"/>
               </w:rPr>
-              <w:t>oda la obra, la revaluación completa es lo correcto. Si el ajuste solo debía aplicar desde una fecha, el MVP no lo sabe representar.</w:t>
-            </w:r>
-          </w:p>
-          <w:p>
-            <w:pPr>
-              <w:spacing w:before="40" w:after="100"/>
+              <w:t xml:space="preserve">Eso no es un descuido: es exactamente la frontera entre presupuestar y controlar obra, y es la razón por la que los ERP del sector venden el control de obra como un producto aparte. En la fase 2, el módulo de control introduce un presupuesto de control con precios fechados y mediciones valoradas a la fecha de corte.</w:t>
+            </w:r>
+          </w:p>
+          <w:p>
+            <w:pPr>
+              <w:spacing w:before="40" w:after="40"/>
               <w:rPr>
                 <w:lang w:val="es-CO"/>
               </w:rPr>
@@ -23913,36 +23376,7 @@
                 <w:sz w:val="19"/>
                 <w:lang w:val="es-CO"/>
               </w:rPr>
-              <w:t>Eso no es un descuido: es exactamente la frontera entre presupuestar y controlar obra, y es la razón por la que los ERP del</w:t>
-            </w:r>
-            <w:r>
-              <w:rPr>
-                <w:sz w:val="19"/>
-                <w:lang w:val="es-CO"/>
-              </w:rPr>
-              <w:t xml:space="preserve"> sector venden el control de obra como un producto aparte. En la fase 2, el módulo de control introduce un presupuesto de control con precios fechados y mediciones valoradas a la fecha de corte.</w:t>
-            </w:r>
-          </w:p>
-          <w:p>
-            <w:pPr>
-              <w:spacing w:before="40" w:after="40"/>
-              <w:rPr>
-                <w:lang w:val="es-CO"/>
-              </w:rPr>
-            </w:pPr>
-            <w:r>
-              <w:rPr>
-                <w:sz w:val="19"/>
-                <w:lang w:val="es-CO"/>
-              </w:rPr>
-              <w:t>Hasta entonces la trazabilidad no se pierde: la versión que s</w:t>
-            </w:r>
-            <w:r>
-              <w:rPr>
-                <w:sz w:val="19"/>
-                <w:lang w:val="es-CO"/>
-              </w:rPr>
-              <w:t>e guarda automáticamente antes de reabrir conserva los precios anteriores, y avance_medicion conserva cada cantidad con su fecha, así que comparar la línea base contra lo vigente es leer esa versión contra el estado actual.</w:t>
+              <w:t>Hasta entonces la trazabilidad no se pierde: la versión que se guarda automáticamente antes de reabrir conserva los precios anteriores, y avance_medicion conserva cada cantidad con su fecha, así que comparar la línea base contra lo vigente es leer esa versión contra el estado actual.</w:t>
             </w:r>
           </w:p>
         </w:tc>
@@ -23960,13 +23394,21 @@
         <w:rPr>
           <w:lang w:val="es-CO"/>
         </w:rPr>
-        <w:t xml:space="preserve">D-24 · Códigos automáticos </w:t>
+        <w:t xml:space="preserve">D-24 · Códigos automáticos REC-0001 y APU-0001</w:t>
       </w:r>
+    </w:p>
+    <w:p>
+      <w:pPr>
+        <w:spacing w:after="120"/>
+        <w:rPr>
+          <w:lang w:val="es-CO"/>
+        </w:rPr>
+      </w:pPr>
       <w:r>
         <w:rPr>
           <w:lang w:val="es-CO"/>
         </w:rPr>
-        <w:t>REC-0001 y APU-0001</w:t>
+        <w:t>Un contador por entidad y por empresa, en app.secuencia_codigo, con el prefijo guardado en la propia fila para que sea configurable sin tocar código. El formato es el prefijo, un guion y el consecutivo con cuatro dígitos como mínimo: REC-0001, APU-0001. Al pasar de 9999 el consecutivo continúa con cinco dígitos, sin truncar ni reutilizar.</w:t>
       </w:r>
     </w:p>
     <w:p>
@@ -23980,13 +23422,22 @@
         <w:rPr>
           <w:lang w:val="es-CO"/>
         </w:rPr>
-        <w:t>Un contador por entidad y por empresa, en app.secuencia_codigo, con el prefijo guardado en la propia fila para que sea configurable sin tocar código. El formato es el prefijo, un guion y el consecutivo con cuatro dígitos como mínimo: RE</w:t>
+        <w:lastRenderedPageBreak/>
+        <w:t xml:space="preserve">Las dos filas, RECURSO y APU, se crean en la misma transacción que da de alta la empresa, junto con las doce unidades de medida estándar. Sin ellas, el primer recurso que intente crear un cliente nuevo falla.</w:t>
       </w:r>
+    </w:p>
+    <w:p>
+      <w:pPr>
+        <w:spacing w:after="120"/>
+        <w:rPr>
+          <w:lang w:val="es-CO"/>
+        </w:rPr>
+      </w:pPr>
       <w:r>
         <w:rPr>
           <w:lang w:val="es-CO"/>
         </w:rPr>
-        <w:t>C-0001, APU-0001. Al pasar de 9999 el consecutivo continúa con cinco dígitos, sin truncar ni reutilizar.</w:t>
+        <w:t xml:space="preserve">No se usa prefijo por tipo de recurso —MAT, EQ, MO, AC—. El tipo de un recurso es editable y el código es inmutable por RN-02, así que el día que alguien reclasifique un insumo quedaría un MAT-0042 que es personal. Un código que miente es peor que un código sin información.</w:t>
       </w:r>
     </w:p>
     <w:p>
@@ -24000,54 +23451,7 @@
         <w:rPr>
           <w:lang w:val="es-CO"/>
         </w:rPr>
-        <w:lastRenderedPageBreak/>
-        <w:t>Las dos filas, RECURSO y APU, se crean en la misma transacción que da de alta la empresa, junto con las doce unidades de medida estándar. Sin ellas, el</w:t>
-      </w:r>
-      <w:r>
-        <w:rPr>
-          <w:lang w:val="es-CO"/>
-        </w:rPr>
-        <w:t xml:space="preserve"> primer recurso que intente crear un cliente nuevo falla.</w:t>
-      </w:r>
-    </w:p>
-    <w:p>
-      <w:pPr>
-        <w:spacing w:after="120"/>
-        <w:rPr>
-          <w:lang w:val="es-CO"/>
-        </w:rPr>
-      </w:pPr>
-      <w:r>
-        <w:rPr>
-          <w:lang w:val="es-CO"/>
-        </w:rPr>
-        <w:t xml:space="preserve">No se usa prefijo por tipo de recurso —MAT, EQ, MO, AC—. El tipo de un recurso es editable y el código es inmutable por RN-02, así que el día que alguien reclasifique un insumo quedaría un MAT-0042 </w:t>
-      </w:r>
-      <w:r>
-        <w:rPr>
-          <w:lang w:val="es-CO"/>
-        </w:rPr>
-        <w:t>que es personal. Un código que miente es peor que un código sin información.</w:t>
-      </w:r>
-    </w:p>
-    <w:p>
-      <w:pPr>
-        <w:spacing w:after="120"/>
-        <w:rPr>
-          <w:lang w:val="es-CO"/>
-        </w:rPr>
-      </w:pPr>
-      <w:r>
-        <w:rPr>
-          <w:lang w:val="es-CO"/>
-        </w:rPr>
-        <w:t>app.fn_siguiente_codigo(tenant, entidad) hace UPDATE ... RETURNING sobre la fila del correlativo. El UPDATE bloquea la fila, de modo que dos usuarios creando recursos al mismo tie</w:t>
-      </w:r>
-      <w:r>
-        <w:rPr>
-          <w:lang w:val="es-CO"/>
-        </w:rPr>
-        <w:t>mpo no obtienen el mismo código. No se usa una SEQUENCE de PostgreSQL porque los consecutivos deben ser por empresa, no globales.</w:t>
+        <w:t>app.fn_siguiente_codigo(tenant, entidad) hace UPDATE ... RETURNING sobre la fila del correlativo. El UPDATE bloquea la fila, de modo que dos usuarios creando recursos al mismo tiempo no obtienen el mismo código. No se usa una SEQUENCE de PostgreSQL porque los consecutivos deben ser por empresa, no globales.</w:t>
       </w:r>
     </w:p>
     <w:p>
@@ -24091,13 +23495,7 @@
         <w:rPr>
           <w:lang w:val="es-CO"/>
         </w:rPr>
-        <w:t xml:space="preserve">•  </w:t>
-      </w:r>
-      <w:r>
-        <w:rPr>
-          <w:lang w:val="es-CO"/>
-        </w:rPr>
-        <w:t>El corte de acceso es automático y derivado de la fecha. Si el vencimiento ya pasó, el usuario inicia sesión pero cae en la pantalla de suscripción vencida. No cambia ningún estado y se revierte solo en el instante en que se registra el pago.</w:t>
+        <w:t xml:space="preserve">•  El corte de acceso es automático y derivado de la fecha. Si el vencimiento ya pasó, el usuario inicia sesión pero cae en la pantalla de suscripción vencida. No cambia ningún estado y se revierte solo en el instante en que se registra el pago.</w:t>
       </w:r>
     </w:p>
     <w:p>
@@ -24112,33 +23510,21 @@
         <w:rPr>
           <w:lang w:val="es-CO"/>
         </w:rPr>
-        <w:t>•  La cancela</w:t>
+        <w:t>•  La cancelación es manual y comercial. El superadministrador la ejecuta después de hablar con el cliente. Nunca ocurre sola.</w:t>
       </w:r>
+    </w:p>
+    <w:p>
+      <w:pPr>
+        <w:spacing w:after="120"/>
+        <w:rPr>
+          <w:lang w:val="es-CO"/>
+        </w:rPr>
+      </w:pPr>
       <w:r>
         <w:rPr>
           <w:lang w:val="es-CO"/>
         </w:rPr>
-        <w:t>ción es manual y comercial. El superadministrador la ejecuta después de hablar con el cliente. Nunca ocurre sola.</w:t>
-      </w:r>
-    </w:p>
-    <w:p>
-      <w:pPr>
-        <w:spacing w:after="120"/>
-        <w:rPr>
-          <w:lang w:val="es-CO"/>
-        </w:rPr>
-      </w:pPr>
-      <w:r>
-        <w:rPr>
-          <w:lang w:val="es-CO"/>
-        </w:rPr>
-        <w:t>Por eso suscripcion.estado admite exactamente tres valores: EN_PRUEBA, ACTIVA y CANCELADA. «Vencida» no es un estado almacenado sino una etiqu</w:t>
-      </w:r>
-      <w:r>
-        <w:rPr>
-          <w:lang w:val="es-CO"/>
-        </w:rPr>
-        <w:t>eta que la interfaz deriva de la fecha.</w:t>
+        <w:t>Por eso suscripcion.estado admite exactamente tres valores: EN_PRUEBA, ACTIVA y CANCELADA. «Vencida» no es un estado almacenado sino una etiqueta que la interfaz deriva de la fecha.</w:t>
       </w:r>
     </w:p>
     <w:p>
@@ -24166,59 +23552,35 @@
         <w:rPr>
           <w:lang w:val="es-CO"/>
         </w:rPr>
-        <w:t>Al registrar un pago, la nueva fe</w:t>
+        <w:t>Al registrar un pago, la nueva fecha de vencimiento es max(fecha_vencimiento_anterior, hoy) + periodo_meses. El max importa: sumar sobre el vencimiento anterior dejaría bloqueado a quien paga con retraso. Por eso plataforma.pago guarda el período que cubre el pago y hasta qué fecha lo cubre.</w:t>
       </w:r>
+    </w:p>
+    <w:p>
+      <w:pPr>
+        <w:spacing w:after="120"/>
+        <w:rPr>
+          <w:lang w:val="es-CO"/>
+        </w:rPr>
+      </w:pPr>
       <w:r>
         <w:rPr>
           <w:lang w:val="es-CO"/>
         </w:rPr>
-        <w:t>cha de vencimiento es max(fecha_vencimiento_anterior, hoy) + periodo_meses. El max importa: sumar sobre el vencimiento anterior dejaría bloqueado a quien paga con retraso. Por eso plataforma.pago guarda el período que cubre el pago y hasta qué fecha lo cub</w:t>
+        <w:t xml:space="preserve">Qué ve cada quien: una empresa con la suscripción vencida ve la pantalla de vencimiento con los datos para pagar; una empresa suspendida por el superadministrador ve una pantalla de cuenta suspendida con el contacto de soporte. Son dos textos distintos a propósito, para que soporte sepa cuál es cuál sin consultar la base de datos. En ambos casos los datos quedan intactos.</w:t>
       </w:r>
+    </w:p>
+    <w:p>
+      <w:pPr>
+        <w:spacing w:after="120"/>
+        <w:rPr>
+          <w:lang w:val="es-CO"/>
+        </w:rPr>
+      </w:pPr>
       <w:r>
         <w:rPr>
           <w:lang w:val="es-CO"/>
         </w:rPr>
-        <w:t>re.</w:t>
-      </w:r>
-    </w:p>
-    <w:p>
-      <w:pPr>
-        <w:spacing w:after="120"/>
-        <w:rPr>
-          <w:lang w:val="es-CO"/>
-        </w:rPr>
-      </w:pPr>
-      <w:r>
-        <w:rPr>
-          <w:lang w:val="es-CO"/>
-        </w:rPr>
-        <w:t>Qué ve cada quien: una empresa con la suscripción vencida ve la pantalla de vencimiento con los datos para pagar; una empresa suspendida por el superadministrador ve una pantalla de cuenta suspendida con el contacto de soporte. Son dos textos distintos</w:t>
-      </w:r>
-      <w:r>
-        <w:rPr>
-          <w:lang w:val="es-CO"/>
-        </w:rPr>
-        <w:t xml:space="preserve"> a propósito, para que soporte sepa cuál es cuál sin consultar la base de datos. En ambos casos los datos quedan intactos.</w:t>
-      </w:r>
-    </w:p>
-    <w:p>
-      <w:pPr>
-        <w:spacing w:after="120"/>
-        <w:rPr>
-          <w:lang w:val="es-CO"/>
-        </w:rPr>
-      </w:pPr>
-      <w:r>
-        <w:rPr>
-          <w:lang w:val="es-CO"/>
-        </w:rPr>
-        <w:t>El aviso previo es RF-SAD-10: el panel de cuentas por vencer en siete días es el tablero para llamar al cliente antes de que pierda e</w:t>
-      </w:r>
-      <w:r>
-        <w:rPr>
-          <w:lang w:val="es-CO"/>
-        </w:rPr>
-        <w:t>l acceso.</w:t>
+        <w:t>El aviso previo es RF-SAD-10: el panel de cuentas por vencer en siete días es el tablero para llamar al cliente antes de que pierda el acceso.</w:t>
       </w:r>
     </w:p>
     <w:p>
@@ -24247,33 +23609,21 @@
         <w:rPr>
           <w:lang w:val="es-CO"/>
         </w:rPr>
-        <w:t>El downgrade se bloquea mientras la cuenta exceda los límites del plan destino. RF-SAD-06 valida antes de ejecutar: la empresa debe tener como máximo dos usuarios activos y ningún rol pe</w:t>
+        <w:t>El downgrade se bloquea mientras la cuenta exceda los límites del plan destino. RF-SAD-06 valida antes de ejecutar: la empresa debe tener como máximo dos usuarios activos y ningún rol personalizado. Si no cumple, el mensaje nombra exactamente qué hay que quitar primero.</w:t>
       </w:r>
+    </w:p>
+    <w:p>
+      <w:pPr>
+        <w:spacing w:after="120"/>
+        <w:rPr>
+          <w:lang w:val="es-CO"/>
+        </w:rPr>
+      </w:pPr>
       <w:r>
         <w:rPr>
           <w:lang w:val="es-CO"/>
         </w:rPr>
-        <w:t>rsonalizado. Si no cumple, el mensaje nombra exactamente qué hay que quitar primero.</w:t>
-      </w:r>
-    </w:p>
-    <w:p>
-      <w:pPr>
-        <w:spacing w:after="120"/>
-        <w:rPr>
-          <w:lang w:val="es-CO"/>
-        </w:rPr>
-      </w:pPr>
-      <w:r>
-        <w:rPr>
-          <w:lang w:val="es-CO"/>
-        </w:rPr>
-        <w:t xml:space="preserve">El plan gobierna únicamente usuarios y roles. El catálogo de recursos, los APU y los presupuestos no dependen del plan y no se tocan en ningún escenario. Un downgrade que </w:t>
-      </w:r>
-      <w:r>
-        <w:rPr>
-          <w:lang w:val="es-CO"/>
-        </w:rPr>
-        <w:t>borrara roles u obligara a exportar proyectos sería una pérdida de datos provocada por un cambio administrativo, que es exactamente la clase de incidente que hunde la reputación de un producto nuevo.</w:t>
+        <w:t xml:space="preserve">El plan gobierna únicamente usuarios y roles. El catálogo de recursos, los APU y los presupuestos no dependen del plan y no se tocan en ningún escenario. Un downgrade que borrara roles u obligara a exportar proyectos sería una pérdida de datos provocada por un cambio administrativo, que es exactamente la clase de incidente que hunde la reputación de un producto nuevo.</w:t>
       </w:r>
     </w:p>
     <w:p>
@@ -24302,19 +23652,7 @@
         <w:rPr>
           <w:lang w:val="es-CO"/>
         </w:rPr>
-        <w:t>Los cambios de est</w:t>
-      </w:r>
-      <w:r>
-        <w:rPr>
-          <w:lang w:val="es-CO"/>
-        </w:rPr>
-        <w:t>ado del proyecto se notifican a todos los usuarios activos de la empresa; se excluyen los revocados. Los avisos de suscripción —fin de prueba y vencimiento— van solo a los usuarios con rol Administrador, que son los únicos que pueden hacer algo al respecto</w:t>
-      </w:r>
-      <w:r>
-        <w:rPr>
-          <w:lang w:val="es-CO"/>
-        </w:rPr>
-        <w:t>. Mandarle a un asistente un aviso de pago es ruido.</w:t>
+        <w:t>Los cambios de estado del proyecto se notifican a todos los usuarios activos de la empresa; se excluyen los revocados. Los avisos de suscripción —fin de prueba y vencimiento— van solo a los usuarios con rol Administrador, que son los únicos que pueden hacer algo al respecto. Mandarle a un asistente un aviso de pago es ruido.</w:t>
       </w:r>
     </w:p>
     <w:p>
@@ -24342,19 +23680,7 @@
         <w:rPr>
           <w:lang w:val="es-CO"/>
         </w:rPr>
-        <w:t>La suscripción lleva dos marcas de aviso distintas, aviso_prueba_en (fin de prueba</w:t>
-      </w:r>
-      <w:r>
-        <w:rPr>
-          <w:lang w:val="es-CO"/>
-        </w:rPr>
-        <w:t>, dos días antes) y aviso_vencimiento_en (vencimiento de la suscripción pagada, cinco días antes): con una sola, el segundo aviso no volvería a salir tras el primero. Tras registrar un pago se limpian ambas, o el aviso del período siguiente no se envía nun</w:t>
-      </w:r>
-      <w:r>
-        <w:rPr>
-          <w:lang w:val="es-CO"/>
-        </w:rPr>
-        <w:t>ca.</w:t>
+        <w:t>La suscripción lleva dos marcas de aviso distintas, aviso_prueba_en (fin de prueba, dos días antes) y aviso_vencimiento_en (vencimiento de la suscripción pagada, cinco días antes): con una sola, el segundo aviso no volvería a salir tras el primero. Tras registrar un pago se limpian ambas, o el aviso del período siguiente no se envía nunca.</w:t>
       </w:r>
     </w:p>
     <w:p>
@@ -24385,16 +23711,6 @@
           <w:lang w:val="es-CO"/>
         </w:rPr>
         <w:t>Cada versión del presupuesto guarda una fotografía completa en una columna jsonb, y exportar una versión no debe requerir consultar ninguna otra tabla. La estructura está fijada en el esquema y un exportador tiene que poder producir el PDF y el Excel leyendo solo eso: cabecera del presupuesto con moneda, estado, tipo de proyecto, AIU y totales; datos de la empresa; la lista de capítulos con su código WBS, nivel, clasificación, monto acumulado e incidencia; la lista de ítems con cantidad, precio unitario y costo total; y quién la generó, cuándo y por qué.</w:t>
-      </w:r>
-      <w:r>
-        <w:rPr>
-          <w:lang w:val="es-CO"/>
-        </w:rPr>
-      </w:r>
-      <w:r>
-        <w:rPr>
-          <w:lang w:val="es-CO"/>
-        </w:rPr>
       </w:r>
     </w:p>
     <w:tbl>
@@ -24455,55 +23771,34 @@
                 <w:sz w:val="19"/>
                 <w:lang w:val="es-CO"/>
               </w:rPr>
-              <w:t>Se guarda el nombre del usuario además de su identificador, y la razón social y el NIT de la em</w:t>
-            </w:r>
+              <w:t>Se guarda el nombre del usuario además de su identificador, y la razón social y el NIT de la empresa además de su identificador. Si mañana ese usuario se renombra o se revoca, o la empresa cambia de razón social, la reimpresión de la versión tiene que seguir diciendo lo que decía el día que se emitió.</w:t>
+            </w:r>
+          </w:p>
+          <w:p>
+            <w:pPr>
+              <w:spacing w:before="40" w:after="100"/>
+              <w:rPr>
+                <w:lang w:val="es-CO"/>
+              </w:rPr>
+            </w:pPr>
             <w:r>
               <w:rPr>
                 <w:sz w:val="19"/>
                 <w:lang w:val="es-CO"/>
               </w:rPr>
-              <w:t>presa además de su identificador. Si mañana ese usuario se renombra o se revoca, o la empresa cambia de razón social, la reimpresión de la versión tiene que seguir diciendo lo que decía el día que se emitió.</w:t>
-            </w:r>
-          </w:p>
-          <w:p>
-            <w:pPr>
-              <w:spacing w:before="40" w:after="100"/>
-              <w:rPr>
-                <w:lang w:val="es-CO"/>
-              </w:rPr>
+              <w:t xml:space="preserve">Todos los valores monetarios van como cadena, no como número JSON. Un numeric de veinticuatro dígitos no cabe sin pérdida en el número de punto flotante de JavaScript, y este es precisamente el archivo que no se puede permitir una desviación de centavos.</w:t>
+            </w:r>
+          </w:p>
+          <w:p>
+            <w:pPr>
+              <w:spacing w:before="40" w:after="40"/>
             </w:pPr>
             <w:r>
               <w:rPr>
                 <w:sz w:val="19"/>
                 <w:lang w:val="es-CO"/>
               </w:rPr>
-              <w:t>Todos los valores monetarios van como cadena, no</w:t>
-            </w:r>
-            <w:r>
-              <w:rPr>
-                <w:sz w:val="19"/>
-                <w:lang w:val="es-CO"/>
-              </w:rPr>
-              <w:t xml:space="preserve"> como número JSON. Un numeric de veinticuatro dígitos no cabe sin pérdida en el número de punto flotante de JavaScript, y este es precisamente el archivo que no se puede permitir una desviación de centavos.</w:t>
-            </w:r>
-          </w:p>
-          <w:p>
-            <w:pPr>
-              <w:spacing w:before="40" w:after="40"/>
-            </w:pPr>
-            <w:r>
-              <w:rPr>
-                <w:sz w:val="19"/>
-                <w:lang w:val="es-CO"/>
-              </w:rPr>
-              <w:t xml:space="preserve">Regla de evolución: nunca se cambia el </w:t>
-            </w:r>
-            <w:r>
-              <w:rPr>
-                <w:sz w:val="19"/>
-                <w:lang w:val="es-CO"/>
-              </w:rPr>
-              <w:t xml:space="preserve">significado de un campo existente. Si hace falta cambiar algo, se sube el número de schema y el exportador mantiene la rama anterior. </w:t>
+              <w:t xml:space="preserve">Regla de evolución: nunca se cambia el significado de un campo existente. Si hace falta cambiar algo, se sube el número de schema y el exportador mantiene la rama anterior. </w:t>
             </w:r>
             <w:r>
               <w:rPr>
@@ -24541,13 +23836,7 @@
         <w:rPr>
           <w:lang w:val="es-CO"/>
         </w:rPr>
-        <w:t>Tres cap</w:t>
-      </w:r>
-      <w:r>
-        <w:rPr>
-          <w:lang w:val="es-CO"/>
-        </w:rPr>
-        <w:t>as, de la más barata a la más cara:</w:t>
+        <w:t>Tres capas, de la más barata a la más cara:</w:t>
       </w:r>
     </w:p>
     <w:p>
@@ -24562,13 +23851,7 @@
         <w:rPr>
           <w:lang w:val="es-CO"/>
         </w:rPr>
-        <w:t xml:space="preserve">•  Prevención en la base de datos. No se puede revocar, desactivar, eliminar ni cambiar de rol al último usuario activo con rol Administrador de una empresa, ni degradar el rol que lo sostiene. El mensaje lo nombra: «es </w:t>
-      </w:r>
-      <w:r>
-        <w:rPr>
-          <w:lang w:val="es-CO"/>
-        </w:rPr>
-        <w:t>el único administrador activo de la empresa».</w:t>
+        <w:t xml:space="preserve">•  Prevención en la base de datos. No se puede revocar, desactivar, eliminar ni cambiar de rol al último usuario activo con rol Administrador de una empresa, ni degradar el rol que lo sostiene. El mensaje lo nombra: «es el único administrador activo de la empresa».</w:t>
       </w:r>
     </w:p>
     <w:p>
@@ -24598,19 +23881,7 @@
         <w:rPr>
           <w:lang w:val="es-CO"/>
         </w:rPr>
-        <w:t>•  Recuperación. RF-SAD-</w:t>
-      </w:r>
-      <w:r>
-        <w:rPr>
-          <w:lang w:val="es-CO"/>
-        </w:rPr>
-        <w:t>14, «Designar administrador»: el superadministrador toma un usuario activo de la empresa y le asigna el rol Administrador, o crea uno nuevo y le envía el enlace de activación. Exige justificación escrita y deja evento en auditoría con entidad TENANT y tipo</w:t>
-      </w:r>
-      <w:r>
-        <w:rPr>
-          <w:lang w:val="es-CO"/>
-        </w:rPr>
-        <w:t xml:space="preserve"> de evento ADMIN_RESTABLECIDO.</w:t>
+        <w:t xml:space="preserve">•  Recuperación. RF-SAD-14, «Designar administrador»: el superadministrador toma un usuario activo de la empresa y le asigna el rol Administrador, o crea uno nuevo y le envía el enlace de activación. Exige justificación escrita y deja evento en auditoría con entidad TENANT y tipo de evento ADMIN_RESTABLECIDO.</w:t>
       </w:r>
     </w:p>
     <w:tbl>
@@ -24671,36 +23942,22 @@
                 <w:sz w:val="19"/>
                 <w:lang w:val="es-CO"/>
               </w:rPr>
-              <w:t>Esta es la puerta de entrada de ingeniería social más grande del producto: quien logre convencer a soporte por teléfono se queda con la cuenta completa de una constructora, con su catálogo de pr</w:t>
-            </w:r>
+              <w:t>Esta es la puerta de entrada de ingeniería social más grande del producto: quien logre convencer a soporte por teléfono se queda con la cuenta completa de una constructora, con su catálogo de precios y sus ofertas. El control efectivo es el procedimiento de verificación, no el botón.</w:t>
+            </w:r>
+          </w:p>
+          <w:p>
+            <w:pPr>
+              <w:spacing w:before="40" w:after="40"/>
+              <w:rPr>
+                <w:lang w:val="es-CO"/>
+              </w:rPr>
+            </w:pPr>
             <w:r>
               <w:rPr>
                 <w:sz w:val="19"/>
                 <w:lang w:val="es-CO"/>
               </w:rPr>
-              <w:t>ecios y sus ofertas. El control efectivo es el procedimiento de verificación, no el botón.</w:t>
-            </w:r>
-          </w:p>
-          <w:p>
-            <w:pPr>
-              <w:spacing w:before="40" w:after="40"/>
-              <w:rPr>
-                <w:lang w:val="es-CO"/>
-              </w:rPr>
-            </w:pPr>
-            <w:r>
-              <w:rPr>
-                <w:sz w:val="19"/>
-                <w:lang w:val="es-CO"/>
-              </w:rPr>
-              <w:t xml:space="preserve">El procedimiento mínimo: la solicitud debe llegar desde el dominio del correo registrado de la empresa, o acompañada de copia del RUT o del certificado de cámara de </w:t>
-            </w:r>
-            <w:r>
-              <w:rPr>
-                <w:sz w:val="19"/>
-                <w:lang w:val="es-CO"/>
-              </w:rPr>
-              <w:t>comercio cuyo NIT coincida con el del inquilino. El campo de justificación debe decir cómo se verificó, no solo que se verificó. Hay que escribirlo y entrenarlo antes de tener el primer cliente.</w:t>
+              <w:t xml:space="preserve">El procedimiento mínimo: la solicitud debe llegar desde el dominio del correo registrado de la empresa, o acompañada de copia del RUT o del certificado de cámara de comercio cuyo NIT coincida con el del inquilino. El campo de justificación debe decir cómo se verificó, no solo que se verificó. Hay que escribirlo y entrenarlo antes de tener el primer cliente.</w:t>
             </w:r>
           </w:p>
         </w:tc>
@@ -24717,13 +23974,7 @@
         <w:rPr>
           <w:lang w:val="es-CO"/>
         </w:rPr>
-        <w:t xml:space="preserve">Un usuario puede quedar revocado aunque nunca haya iniciado </w:t>
-      </w:r>
-      <w:r>
-        <w:rPr>
-          <w:lang w:val="es-CO"/>
-        </w:rPr>
-        <w:t>sesión: alguien creado por error, o que se fue de la empresa antes de entrar por primera vez, tiene que poder cerrarse.</w:t>
+        <w:t xml:space="preserve">Un usuario puede quedar revocado aunque nunca haya iniciado sesión: alguien creado por error, o que se fue de la empresa antes de entrar por primera vez, tiene que poder cerrarse.</w:t>
       </w:r>
     </w:p>
     <w:p>
@@ -24752,39 +24003,21 @@
         <w:rPr>
           <w:lang w:val="es-CO"/>
         </w:rPr>
-        <w:t>Logotipos y adjuntos van a almacenamiento de objetos —S3, Cloudflare R2 o DigitalOce</w:t>
+        <w:t>Logotipos y adjuntos van a almacenamiento de objetos —S3, Cloudflare R2 o DigitalOcean Spaces—, en un bucket privado, servidos por URL firmada con vencimiento corto. En la base de datos queda la llave del objeto, no una ruta de disco.</w:t>
       </w:r>
+    </w:p>
+    <w:p>
+      <w:pPr>
+        <w:spacing w:after="120"/>
+        <w:rPr>
+          <w:lang w:val="es-CO"/>
+        </w:rPr>
+      </w:pPr>
       <w:r>
         <w:rPr>
           <w:lang w:val="es-CO"/>
         </w:rPr>
-        <w:t>an Spaces—, en un bucket privado, servidos por URL firmada con vencimiento corto. En la base de datos queda la llave del objeto, no una ruta de disco.</w:t>
-      </w:r>
-    </w:p>
-    <w:p>
-      <w:pPr>
-        <w:spacing w:after="120"/>
-        <w:rPr>
-          <w:lang w:val="es-CO"/>
-        </w:rPr>
-      </w:pPr>
-      <w:r>
-        <w:rPr>
-          <w:lang w:val="es-CO"/>
-        </w:rPr>
-        <w:t xml:space="preserve">El motivo es operativo: el disco local no sobrevive a un redespliegue en contenedores, y obliga a que la </w:t>
-      </w:r>
-      <w:r>
-        <w:rPr>
-          <w:lang w:val="es-CO"/>
-        </w:rPr>
-        <w:t>rutina de copia de seguridad respalde un directorio aparte de la base, que es justo lo que se olvida. El almacenamiento de objetos se respalda solo y se restaura solo. La prueba de restauración que exige RNF-17 debe incluir un logo; si no, nadie descubre q</w:t>
-      </w:r>
-      <w:r>
-        <w:rPr>
-          <w:lang w:val="es-CO"/>
-        </w:rPr>
-        <w:t>ue falta hasta que un cliente reimprime una oferta y sale en blanco.</w:t>
+        <w:t xml:space="preserve">El motivo es operativo: el disco local no sobrevive a un redespliegue en contenedores, y obliga a que la rutina de copia de seguridad respalde un directorio aparte de la base, que es justo lo que se olvida. El almacenamiento de objetos se respalda solo y se restaura solo. La prueba de restauración que exige RNF-17 debe incluir un logo; si no, nadie descubre que falta hasta que un cliente reimprime una oferta y sale en blanco.</w:t>
       </w:r>
     </w:p>
     <w:tbl>
@@ -24846,14 +24079,7 @@
                 <w:sz w:val="19"/>
                 <w:lang w:val="es-CO"/>
               </w:rPr>
-              <w:t xml:space="preserve">logo_ruta y nit viven en plataforma.tenant, que sí tiene seguridad a nivel de fila (política p_tenant_propio, que acota por el id del inquilino). El backend igual debe </w:t>
-            </w:r>
-            <w:r>
-              <w:rPr>
-                <w:sz w:val="19"/>
-                <w:lang w:val="es-CO"/>
-              </w:rPr>
-              <w:t>pasar por esa política fijando app.tenant_id; la protección existe, pero es por id de inquilino, no por columna.</w:t>
+              <w:t xml:space="preserve">logo_ruta y nit viven en plataforma.tenant, que sí tiene seguridad a nivel de fila (política p_tenant_propio, que acota por el id del inquilino). El backend igual debe pasar por esa política fijando app.tenant_id; la protección existe, pero es por id de inquilino, no por columna.</w:t>
             </w:r>
           </w:p>
         </w:tc>
@@ -24885,13 +24111,21 @@
         <w:rPr>
           <w:lang w:val="es-CO"/>
         </w:rPr>
-        <w:t>Renombrar una unidad —corregir «m3» por «m³», o «Jornal» por «Jr»— siempr</w:t>
+        <w:t>Renombrar una unidad —corregir «m3» por «m³», o «Jornal» por «Jr»— siempre se permite. No toca ningún número: las versiones de APU guardan el símbolo como copia congelada, así que las versiones anteriores conservan la etiqueta con la que se emitieron, que es lo correcto.</w:t>
       </w:r>
+    </w:p>
+    <w:p>
+      <w:pPr>
+        <w:spacing w:after="120"/>
+        <w:rPr>
+          <w:lang w:val="es-CO"/>
+        </w:rPr>
+      </w:pPr>
       <w:r>
         <w:rPr>
           <w:lang w:val="es-CO"/>
         </w:rPr>
-        <w:t>e se permite. No toca ningún número: las versiones de APU guardan el símbolo como copia congelada, así que las versiones anteriores conservan la etiqueta con la que se emitieron, que es lo correcto.</w:t>
+        <w:t>Cambiar la unidad de un recurso o de un APU que ya está en uso queda bloqueado en el MVP. El mensaje dice en cuántos APU o presupuestos está en uso y sugiere crear un recurso nuevo con la unidad correcta.</w:t>
       </w:r>
     </w:p>
     <w:p>
@@ -24905,59 +24139,21 @@
         <w:rPr>
           <w:lang w:val="es-CO"/>
         </w:rPr>
-        <w:t>Cambiar la unidad de un recurso o de un APU que ya está e</w:t>
+        <w:t xml:space="preserve">Se bloquea porque ajustar el rendimiento al cambiar la unidad exige un factor de conversión que el sistema no tiene ni puede deducir: las unidades son símbolos de texto definidos libremente por cada empresa, así que el sistema no sabe que un metro cúbico son mil litros, y menos aún qué relación hay entre «Glb» y «Und». Además las versiones de APU son inmutables: «actualizar donde se usa» significaría generar una versión nueva de cada APU afectado con todos los rendimientos recalculados.</w:t>
       </w:r>
+    </w:p>
+    <w:p>
+      <w:pPr>
+        <w:spacing w:after="120"/>
+        <w:rPr>
+          <w:lang w:val="es-CO"/>
+        </w:rPr>
+      </w:pPr>
       <w:r>
         <w:rPr>
           <w:lang w:val="es-CO"/>
         </w:rPr>
-        <w:t>n uso queda bloqueado en el MVP. El mensaje dice en cuántos APU o presupuestos está en uso y sugiere crear un recurso nuevo con la unidad correcta.</w:t>
-      </w:r>
-    </w:p>
-    <w:p>
-      <w:pPr>
-        <w:spacing w:after="120"/>
-        <w:rPr>
-          <w:lang w:val="es-CO"/>
-        </w:rPr>
-      </w:pPr>
-      <w:r>
-        <w:rPr>
-          <w:lang w:val="es-CO"/>
-        </w:rPr>
-        <w:t>Se bloquea porque ajustar el rendimiento al cambiar la unidad exige un factor de conversión que el sistema n</w:t>
-      </w:r>
-      <w:r>
-        <w:rPr>
-          <w:lang w:val="es-CO"/>
-        </w:rPr>
-        <w:t>o tiene ni puede deducir: las unidades son símbolos de texto definidos libremente por cada empresa, así que el sistema no sabe que un metro cúbico son mil litros, y menos aún qué relación hay entre «Glb» y «Und». Además las versiones de APU son inmutables:</w:t>
-      </w:r>
-      <w:r>
-        <w:rPr>
-          <w:lang w:val="es-CO"/>
-        </w:rPr>
-        <w:t xml:space="preserve"> «actualizar donde se usa» significaría generar una versión nueva de cada APU afectado con todos los rendimientos recalculados.</w:t>
-      </w:r>
-    </w:p>
-    <w:p>
-      <w:pPr>
-        <w:spacing w:after="120"/>
-        <w:rPr>
-          <w:lang w:val="es-CO"/>
-        </w:rPr>
-      </w:pPr>
-      <w:r>
-        <w:rPr>
-          <w:lang w:val="es-CO"/>
-        </w:rPr>
-        <w:t xml:space="preserve">La unicidad del símbolo es insensible a mayúsculas: «Kg» y «kg» no pueden convivir en la misma empresa, que es exactamente la </w:t>
-      </w:r>
-      <w:r>
-        <w:rPr>
-          <w:lang w:val="es-CO"/>
-        </w:rPr>
-        <w:t>entrada de datos basura que la lista maestra de unidades existe para impedir.</w:t>
+        <w:t xml:space="preserve">La unicidad del símbolo es insensible a mayúsculas: «Kg» y «kg» no pueden convivir en la misma empresa, que es exactamente la entrada de datos basura que la lista maestra de unidades existe para impedir.</w:t>
       </w:r>
     </w:p>
     <w:p>
@@ -24986,13 +24182,21 @@
         <w:rPr>
           <w:lang w:val="es-CO"/>
         </w:rPr>
-        <w:t>La suscripción se factura con factura electrónica desde el primer cliente empresarial. Un cliente con contador va a pedir</w:t>
+        <w:t>La suscripción se factura con factura electrónica desde el primer cliente empresarial. Un cliente con contador va a pedirla para deducir el gasto, y si no se la dan, pide descuento o no compra.</w:t>
       </w:r>
+    </w:p>
+    <w:p>
+      <w:pPr>
+        <w:spacing w:after="120"/>
+        <w:rPr>
+          <w:lang w:val="es-CO"/>
+        </w:rPr>
+      </w:pPr>
       <w:r>
         <w:rPr>
           <w:lang w:val="es-CO"/>
         </w:rPr>
-        <w:t>la para deducir el gasto, y si no se la dan, pide descuento o no compra.</w:t>
+        <w:t>En consecuencia, el comprobante de RF-CFG-08 no es un PDF que genera CONSTRUSOFT: es la factura que emitió el proveedor tecnológico de facturación. plataforma.pago guarda el número de factura, el CUFE y el enlace al documento. El sistema referencia el comprobante, no lo produce ni lo almacena.</w:t>
       </w:r>
     </w:p>
     <w:p>
@@ -25006,32 +24210,7 @@
         <w:rPr>
           <w:lang w:val="es-CO"/>
         </w:rPr>
-        <w:t>En consecuencia, el comprobante de RF-CFG-08 no es un PDF que genera CONSTRUSOFT: es la factura que emitió el proveedor tecnológico de facturación. plataforma.pago guarda el número d</w:t>
-      </w:r>
-      <w:r>
-        <w:rPr>
-          <w:lang w:val="es-CO"/>
-        </w:rPr>
-        <w:t>e factura, el CUFE y el enlace al documento. El sistema referencia el comprobante, no lo produce ni lo almacena.</w:t>
-      </w:r>
-    </w:p>
-    <w:p>
-      <w:pPr>
-        <w:spacing w:after="120"/>
-        <w:rPr>
-          <w:lang w:val="es-CO"/>
-        </w:rPr>
-      </w:pPr>
-      <w:r>
-        <w:rPr>
-          <w:lang w:val="es-CO"/>
-        </w:rPr>
         <w:t>Proveedores con API para enganchar la emisión al registro del pago: Alegra, Siigo y Factus. La integración es de la fase 6 del MVP, junto con el resto de la superadministración y el cobro.</w:t>
-      </w:r>
-      <w:r>
-        <w:rPr>
-          <w:lang w:val="es-CO"/>
-        </w:rPr>
       </w:r>
     </w:p>
     <w:tbl>
@@ -25092,45 +24271,25 @@
                 <w:sz w:val="19"/>
                 <w:lang w:val="es-CO"/>
               </w:rPr>
-              <w:t xml:space="preserve">Queda pendiente confirmar con un contador si el servicio califica como computación en la nube excluida de IVA —la DIAN lo ha sostenido en el Concepto 1444 de 2017, </w:t>
-            </w:r>
+              <w:t xml:space="preserve">Queda pendiente confirmar con un contador si el servicio califica como computación en la nube excluida de IVA —la DIAN lo ha sostenido en el Concepto 1444 de 2017, precisado por el Concepto 190 de marzo de 2024, para servicios de autoservicio bajo demanda, acceso amplio a la red, recursos comunes, elasticidad rápida y servicio medible, cobrados por el proveedor directo y no por un intermediario— y si se factura como persona natural o a través de una sociedad.</w:t>
+            </w:r>
+          </w:p>
+          <w:p>
+            <w:pPr>
+              <w:spacing w:before="40" w:after="40"/>
+            </w:pPr>
             <w:r>
               <w:rPr>
                 <w:sz w:val="19"/>
                 <w:lang w:val="es-CO"/>
               </w:rPr>
-              <w:t xml:space="preserve">precisado por el Concepto 190 de marzo de 2024, para servicios de autoservicio bajo demanda, acceso amplio a la red, recursos comunes, elasticidad rápida y servicio medible, cobrados por el proveedor directo y no por un intermediario— y si se factura como </w:t>
+              <w:t xml:space="preserve">CONSTRUSOFT encaja en esa descripción, pero no es automático: exige un autodiagnóstico documentado. Conviene resolverlo antes de fijar la tarifa de los planes, no después. </w:t>
             </w:r>
             <w:r>
               <w:rPr>
                 <w:sz w:val="19"/>
-                <w:lang w:val="es-CO"/>
-              </w:rPr>
-              <w:t>persona natural o a través de una sociedad.</w:t>
-            </w:r>
-          </w:p>
-          <w:p>
-            <w:pPr>
-              <w:spacing w:before="40" w:after="40"/>
-            </w:pPr>
-            <w:r>
-              <w:rPr>
-                <w:sz w:val="19"/>
-                <w:lang w:val="es-CO"/>
-              </w:rPr>
-              <w:t xml:space="preserve">CONSTRUSOFT encaja en esa descripción, pero no es automático: exige un autodiagnóstico documentado. Conviene resolverlo antes de fijar la tarifa de los planes, no después. </w:t>
-            </w:r>
-            <w:r>
-              <w:rPr>
-                <w:sz w:val="19"/>
-              </w:rPr>
-              <w:t xml:space="preserve">Este documento no da asesoría jurídica </w:t>
-            </w:r>
-            <w:r>
-              <w:rPr>
-                <w:sz w:val="19"/>
-              </w:rPr>
-              <w:t>ni tributaria.</w:t>
+              </w:rPr>
+              <w:t xml:space="preserve">Este documento no da asesoría jurídica ni tributaria.</w:t>
             </w:r>
           </w:p>
         </w:tc>
@@ -25162,13 +24321,21 @@
         <w:rPr>
           <w:lang w:val="es-CO"/>
         </w:rPr>
-        <w:t xml:space="preserve">El valor total de una oferta de obra incluye el IVA, y su base es la utilidad del AIU: IVA = Utilidad × %IVA. No el costo directo —los materiales ya traen su propio IVA dentro del APU </w:t>
+        <w:t xml:space="preserve">El valor total de una oferta de obra incluye el IVA, y su base es la utilidad del AIU: IVA = Utilidad × %IVA. No el costo directo —los materiales ya traen su propio IVA dentro del APU (D-2), de modo que gravarlo otra vez lo cobraría dos veces— ni el AIU completo, que es la base de otros contratos de servicios y no la de un contrato de construcción.</w:t>
       </w:r>
+    </w:p>
+    <w:p>
+      <w:pPr>
+        <w:spacing w:after="120"/>
+        <w:rPr>
+          <w:lang w:val="es-CO"/>
+        </w:rPr>
+      </w:pPr>
       <w:r>
         <w:rPr>
           <w:lang w:val="es-CO"/>
         </w:rPr>
-        <w:t>(D-2), de modo que gravarlo otra vez lo cobraría dos veces— ni el AIU completo, que es la base de otros contratos de servicios y no la de un contrato de construcción.</w:t>
+        <w:t xml:space="preserve">El porcentaje vive en cada presupuesto, como los tres del AIU. A diferencia de ellos, su valor por defecto no es cero sino 19 %: la tarifa la pone la ley, no el ingeniero. Viaja congelado con la línea base, así que un cambio de tarifa no mueve una oferta ya emitida.</w:t>
       </w:r>
     </w:p>
     <w:p>
@@ -25182,39 +24349,7 @@
         <w:rPr>
           <w:lang w:val="es-CO"/>
         </w:rPr>
-        <w:t xml:space="preserve">El porcentaje vive en cada presupuesto, como los tres del AIU. A diferencia de ellos, su </w:t>
-      </w:r>
-      <w:r>
-        <w:rPr>
-          <w:lang w:val="es-CO"/>
-        </w:rPr>
-        <w:t>valor por defecto no es cero sino 19 %: la tarifa la pone la ley, no el ingeniero. Viaja congelado con la línea base, así que un cambio de tarifa no mueve una oferta ya emitida.</w:t>
-      </w:r>
-    </w:p>
-    <w:p>
-      <w:pPr>
-        <w:spacing w:after="120"/>
-        <w:rPr>
-          <w:lang w:val="es-CO"/>
-        </w:rPr>
-      </w:pPr>
-      <w:r>
-        <w:rPr>
-          <w:lang w:val="es-CO"/>
-        </w:rPr>
-        <w:t>Sobre el presupuesto de referencia —costo directo $105.490.000 y AIU de 10/5/5</w:t>
-      </w:r>
-      <w:r>
-        <w:rPr>
-          <w:lang w:val="es-CO"/>
-        </w:rPr>
-        <w:t>— la utilidad es $5.274.500, el IVA $1.002.155 y el valor total $180.590.155. El IVA no entra en la base del AIU ni en el denominador de la incidencia, y el avance general sí lo incluye: lo ejecutado se valora como se ofertó, de modo que una obra terminada</w:t>
-      </w:r>
-      <w:r>
-        <w:rPr>
-          <w:lang w:val="es-CO"/>
-        </w:rPr>
-        <w:t xml:space="preserve"> da 100,00 % exacto.</w:t>
+        <w:t xml:space="preserve">Sobre el presupuesto de referencia —costo directo $105.490.000 y AIU de 10/5/5— la utilidad es $5.274.500, el IVA $1.002.155 y el valor total $180.590.155. El IVA no entra en la base del AIU ni en el denominador de la incidencia, y el avance general sí lo incluye: lo ejecutado se valora como se ofertó, de modo que una obra terminada da 100,00 % exacto.</w:t>
       </w:r>
     </w:p>
     <w:p>
@@ -25244,33 +24379,21 @@
         <w:rPr>
           <w:lang w:val="es-CO"/>
         </w:rPr>
-        <w:t>Toda empresa tiene NIT; en el plan Personal es el del RUT de la persona natural. Sin él no hay encabezado de PDF (RF-PRE-30) ni forma de facturar la suscripción, y su unicidad es la únic</w:t>
+        <w:t>Toda empresa tiene NIT; en el plan Personal es el del RUT de la persona natural. Sin él no hay encabezado de PDF (RF-PRE-30) ni forma de facturar la suscripción, y su unicidad es la única barrera contra registrar la misma empresa varias veces para encadenar períodos de prueba gratuitos (RF-AUT-16).</w:t>
       </w:r>
+    </w:p>
+    <w:p>
+      <w:pPr>
+        <w:spacing w:after="120"/>
+        <w:rPr>
+          <w:lang w:val="es-CO"/>
+        </w:rPr>
+      </w:pPr>
       <w:r>
         <w:rPr>
           <w:lang w:val="es-CO"/>
         </w:rPr>
-        <w:t>a barrera contra registrar la misma empresa varias veces para encadenar períodos de prueba gratuitos (RF-AUT-16).</w:t>
-      </w:r>
-    </w:p>
-    <w:p>
-      <w:pPr>
-        <w:spacing w:after="120"/>
-        <w:rPr>
-          <w:lang w:val="es-CO"/>
-        </w:rPr>
-      </w:pPr>
-      <w:r>
-        <w:rPr>
-          <w:lang w:val="es-CO"/>
-        </w:rPr>
-        <w:t>Además se edita desde Configuración. Antes el esquema no lo permitía —la columna no estaba entre las que el rol de la aplicación puede escribi</w:t>
-      </w:r>
-      <w:r>
-        <w:rPr>
-          <w:lang w:val="es-CO"/>
-        </w:rPr>
-        <w:t>r—, así que un NIT mal digitado en el registro quedaba mal para siempre y una persona natural que se registrara sin él no podía agregarlo nunca.</w:t>
+        <w:t>Además se edita desde Configuración. Antes el esquema no lo permitía —la columna no estaba entre las que el rol de la aplicación puede escribir—, así que un NIT mal digitado en el registro quedaba mal para siempre y una persona natural que se registrara sin él no podía agregarlo nunca.</w:t>
       </w:r>
     </w:p>
     <w:p>
@@ -25299,33 +24422,21 @@
         <w:rPr>
           <w:lang w:val="es-CO"/>
         </w:rPr>
-        <w:t>PENDIENTE significa «invitado, aún sin consumir su enlace de activ</w:t>
+        <w:t>PENDIENTE significa «invitado, aún sin consumir su enlace de activación» (D-7), y es exclusivamente para los usuarios que la empresa crea después. Quien registra la empresa ya eligió su contraseña en el formulario de registro.</w:t>
       </w:r>
+    </w:p>
+    <w:p>
+      <w:pPr>
+        <w:spacing w:after="120"/>
+        <w:rPr>
+          <w:lang w:val="es-CO"/>
+        </w:rPr>
+      </w:pPr>
       <w:r>
         <w:rPr>
           <w:lang w:val="es-CO"/>
         </w:rPr>
-        <w:t>ación» (D-7), y es exclusivamente para los usuarios que la empresa crea después. Quien registra la empresa ya eligió su contraseña en el formulario de registro.</w:t>
-      </w:r>
-    </w:p>
-    <w:p>
-      <w:pPr>
-        <w:spacing w:after="120"/>
-        <w:rPr>
-          <w:lang w:val="es-CO"/>
-        </w:rPr>
-      </w:pPr>
-      <w:r>
-        <w:rPr>
-          <w:lang w:val="es-CO"/>
-        </w:rPr>
-        <w:t>No es un matiz de estado: mientras el registro dejaba a esa persona en PENDIENTE, la empresa na</w:t>
-      </w:r>
-      <w:r>
-        <w:rPr>
-          <w:lang w:val="es-CO"/>
-        </w:rPr>
-        <w:t>cía sin ningún administrador activo. No podía activar un presupuesto —cambiar el estado exige un administrador ACTIVO— y su primer inicio de sesión chocaba contra la restricción que impide que un usuario pendiente tenga fecha de último acceso.</w:t>
+        <w:t>No es un matiz de estado: mientras el registro dejaba a esa persona en PENDIENTE, la empresa nacía sin ningún administrador activo. No podía activar un presupuesto —cambiar el estado exige un administrador ACTIVO— y su primer inicio de sesión chocaba contra la restricción que impide que un usuario pendiente tenga fecha de último acceso.</w:t>
       </w:r>
     </w:p>
     <w:p>
@@ -25340,13 +24451,21 @@
         <w:rPr>
           <w:lang w:val="es-CO"/>
         </w:rPr>
-        <w:t>D-36 · El pa</w:t>
+        <w:t>D-36 · El pago se registra con su soporte y su fecha</w:t>
       </w:r>
+    </w:p>
+    <w:p>
+      <w:pPr>
+        <w:spacing w:after="120"/>
+        <w:rPr>
+          <w:lang w:val="es-CO"/>
+        </w:rPr>
+      </w:pPr>
       <w:r>
         <w:rPr>
           <w:lang w:val="es-CO"/>
         </w:rPr>
-        <w:t>go se registra con su soporte y su fecha</w:t>
+        <w:t>El cobro es manual (D-13): el cliente paga por transferencia o PSE y el superadministrador registra el pago. Al registrarlo adjunta el soporte —la foto o el PDF del comprobante, guardado en el almacenamiento de objetos igual que el logo (D-30)— y escribe hasta qué fecha queda cubierta la suscripción.</w:t>
       </w:r>
     </w:p>
     <w:p>
@@ -25360,33 +24479,7 @@
         <w:rPr>
           <w:lang w:val="es-CO"/>
         </w:rPr>
-        <w:t>El cobro es manual (D-13): el cliente paga por transferencia o PSE y el superadministrador registra el pago. Al registrarlo adjunta el soporte —la foto o el PDF del comprobante, guardado en el almacenamiento de obje</w:t>
-      </w:r>
-      <w:r>
-        <w:rPr>
-          <w:lang w:val="es-CO"/>
-        </w:rPr>
-        <w:t>tos igual que el logo (D-30)— y escribe hasta qué fecha queda cubierta la suscripción.</w:t>
-      </w:r>
-    </w:p>
-    <w:p>
-      <w:pPr>
-        <w:spacing w:after="120"/>
-        <w:rPr>
-          <w:lang w:val="es-CO"/>
-        </w:rPr>
-      </w:pPr>
-      <w:r>
-        <w:rPr>
-          <w:lang w:val="es-CO"/>
-        </w:rPr>
-        <w:t>La fecha la decide él porque el acuerdo comercial no siempre es un número redondo de meses. Si no la escribe, el sistema propone la fórmula de D-25: max(vencimiento ante</w:t>
-      </w:r>
-      <w:r>
-        <w:rPr>
-          <w:lang w:val="es-CO"/>
-        </w:rPr>
-        <w:t>rior, hoy) + período. Lo que no acepta es una fecha ya vencida, que dejaría al cliente bloqueado justo después de pagar.</w:t>
+        <w:t>La fecha la decide él porque el acuerdo comercial no siempre es un número redondo de meses. Si no la escribe, el sistema propone la fórmula de D-25: max(vencimiento anterior, hoy) + período. Lo que no acepta es una fecha ya vencida, que dejaría al cliente bloqueado justo después de pagar.</w:t>
       </w:r>
     </w:p>
     <w:p>
@@ -25415,13 +24508,21 @@
         <w:rPr>
           <w:lang w:val="es-CO"/>
         </w:rPr>
-        <w:t>El esquema usa variables de transacción para decirles a sus propios guardiane</w:t>
+        <w:t>El esquema usa variables de transacción para decirles a sus propios guardianes que una operación es deliberada: la purga de una empresa, el recálculo de los totales, el registro de una medición. Cualquier conexión puede fijarlas.</w:t>
       </w:r>
+    </w:p>
+    <w:p>
+      <w:pPr>
+        <w:spacing w:after="120"/>
+        <w:rPr>
+          <w:lang w:val="es-CO"/>
+        </w:rPr>
+      </w:pPr>
       <w:r>
         <w:rPr>
           <w:lang w:val="es-CO"/>
         </w:rPr>
-        <w:t>s que una operación es deliberada: la purga de una empresa, el recálculo de los totales, el registro de una medición. Cualquier conexión puede fijarlas.</w:t>
+        <w:t>Mientras los guardianes miraran solo el valor de la bandera, el rol de la aplicación podía ponerla y atravesar el congelamiento de la línea base, borrar un presupuesto ya activado (D-18) o dejar a una empresa sin administrador (D-29). Se comprobó contra una base real, con el mismo rol con el que se conecta la aplicación.</w:t>
       </w:r>
     </w:p>
     <w:p>
@@ -25435,33 +24536,7 @@
         <w:rPr>
           <w:lang w:val="es-CO"/>
         </w:rPr>
-        <w:t>Mientras los guardianes miraran solo el valor de la bandera, el rol de la aplicación podía ponerla y at</w:t>
-      </w:r>
-      <w:r>
-        <w:rPr>
-          <w:lang w:val="es-CO"/>
-        </w:rPr>
-        <w:t>ravesar el congelamiento de la línea base, borrar un presupuesto ya activado (D-18) o dejar a una empresa sin administrador (D-29). Se comprobó contra una base real, con el mismo rol con el que se conecta la aplicación.</w:t>
-      </w:r>
-    </w:p>
-    <w:p>
-      <w:pPr>
-        <w:spacing w:after="120"/>
-        <w:rPr>
-          <w:lang w:val="es-CO"/>
-        </w:rPr>
-      </w:pPr>
-      <w:r>
-        <w:rPr>
-          <w:lang w:val="es-CO"/>
-        </w:rPr>
-        <w:t>Ahora los guardianes comprueban tamb</w:t>
-      </w:r>
-      <w:r>
-        <w:rPr>
-          <w:lang w:val="es-CO"/>
-        </w:rPr>
-        <w:t>ién quién está ejecutando, y la bandera solo vale dentro de las funciones internas del esquema. La regla general es la del modelo de privilegios: lo que defiende una garantía es el privilegio, nunca una marca que el propio interesado puede escribir.</w:t>
+        <w:t>Ahora los guardianes comprueban también quién está ejecutando, y la bandera solo vale dentro de las funciones internas del esquema. La regla general es la del modelo de privilegios: lo que defiende una garantía es el privilegio, nunca una marca que el propio interesado puede escribir.</w:t>
       </w:r>
     </w:p>
     <w:p>
@@ -25476,13 +24551,21 @@
         <w:rPr>
           <w:lang w:val="es-CO"/>
         </w:rPr>
-        <w:t>D-38 ·</w:t>
+        <w:t xml:space="preserve">D-38 · Las acciones del superadministrador quedan registradas</w:t>
       </w:r>
+    </w:p>
+    <w:p>
+      <w:pPr>
+        <w:spacing w:after="120"/>
+        <w:rPr>
+          <w:lang w:val="es-CO"/>
+        </w:rPr>
+      </w:pPr>
       <w:r>
         <w:rPr>
           <w:lang w:val="es-CO"/>
         </w:rPr>
-        <w:t xml:space="preserve"> Las acciones del superadministrador quedan registradas</w:t>
+        <w:t>Suspender una cuenta, cambiarle el plan, cancelarla, registrar un pago, designar un administrador o eliminar los datos de una empresa no dejaban ningún rastro. La justificación escrita que exigen RF-SAD-13, RF-SAD-14 y RF-SAD-15 se perdía en el acto mismo de usarla: la de la eliminación desaparecía junto con la empresa que documentaba.</w:t>
       </w:r>
     </w:p>
     <w:p>
@@ -25496,33 +24579,7 @@
         <w:rPr>
           <w:lang w:val="es-CO"/>
         </w:rPr>
-        <w:t>Suspender una cuenta, cambiarle el plan, cancelarla, registrar un pago, designar un administrador o eliminar los datos de una empresa no dejaban ningún rastro. La justificación escrita que exigen RF-S</w:t>
-      </w:r>
-      <w:r>
-        <w:rPr>
-          <w:lang w:val="es-CO"/>
-        </w:rPr>
-        <w:t>AD-13, RF-SAD-14 y RF-SAD-15 se perdía en el acto mismo de usarla: la de la eliminación desaparecía junto con la empresa que documentaba.</w:t>
-      </w:r>
-    </w:p>
-    <w:p>
-      <w:pPr>
-        <w:spacing w:after="120"/>
-        <w:rPr>
-          <w:lang w:val="es-CO"/>
-        </w:rPr>
-      </w:pPr>
-      <w:r>
-        <w:rPr>
-          <w:lang w:val="es-CO"/>
-        </w:rPr>
-        <w:t>Ahora viven en un historial propio de la plataforma, separado del de cada empresa y fuera de su alcance, que sobrevive</w:t>
-      </w:r>
-      <w:r>
-        <w:rPr>
-          <w:lang w:val="es-CO"/>
-        </w:rPr>
-        <w:t xml:space="preserve"> al borrado: cuando la empresa desaparece, el registro conserva su razón social y su NIT para que el renglón siga siendo legible.</w:t>
+        <w:t xml:space="preserve">Ahora viven en un historial propio de la plataforma, separado del de cada empresa y fuera de su alcance, que sobrevive al borrado: cuando la empresa desaparece, el registro conserva su razón social y su NIT para que el renglón siga siendo legible.</w:t>
       </w:r>
     </w:p>
     <w:p>
@@ -25551,34 +24608,22 @@
         <w:rPr>
           <w:lang w:val="es-CO"/>
         </w:rPr>
-        <w:t xml:space="preserve">Renumerar la EDT, duplicar un presupuesto y versionar o propagar </w:t>
+        <w:t xml:space="preserve">Renumerar la EDT, duplicar un presupuesto y versionar o propagar un APU no son un INSERT: tocan varias tablas a la vez, tienen que ser atómicos y un error en cualquiera de ellos se traduce en una oferta equivocada. Estaban en el backend, que es el único lugar donde la base no puede defenderlos.</w:t>
       </w:r>
+    </w:p>
+    <w:p>
+      <w:pPr>
+        <w:spacing w:after="120"/>
+        <w:rPr>
+          <w:lang w:val="es-CO"/>
+        </w:rPr>
+      </w:pPr>
       <w:r>
         <w:rPr>
           <w:lang w:val="es-CO"/>
         </w:rPr>
-        <w:t>un APU no son un INSERT: tocan varias tablas a la vez, tienen que ser atómicos y un error en cualquiera de ellos se traduce en una oferta equivocada. Estaban en el backend, que es el único lugar donde la base no puede defenderlos.</w:t>
-      </w:r>
-    </w:p>
-    <w:p>
-      <w:pPr>
-        <w:spacing w:after="120"/>
-        <w:rPr>
-          <w:lang w:val="es-CO"/>
-        </w:rPr>
-      </w:pPr>
-      <w:r>
-        <w:rPr>
-          <w:lang w:val="es-CO"/>
-        </w:rPr>
         <w:lastRenderedPageBreak/>
-        <w:t>Son funciones del esquema</w:t>
-      </w:r>
-      <w:r>
-        <w:rPr>
-          <w:lang w:val="es-CO"/>
-        </w:rPr>
-        <w:t>, como ya lo eran el recálculo del presupuesto y el guardado de versiones. No se gana rendimiento: se gana que la regla esté escrita una sola vez, que valga aunque la petición se construya a mano y que no dependa de que cada pantalla la recuerde.</w:t>
+        <w:t>Son funciones del esquema, como ya lo eran el recálculo del presupuesto y el guardado de versiones. No se gana rendimiento: se gana que la regla esté escrita una sola vez, que valga aunque la petición se construya a mano y que no dependa de que cada pantalla la recuerde.</w:t>
       </w:r>
     </w:p>
     <w:p>
@@ -25593,13 +24638,21 @@
         <w:rPr>
           <w:lang w:val="es-CO"/>
         </w:rPr>
-        <w:t>D-40 · La</w:t>
+        <w:t xml:space="preserve">D-40 · La base ya admite una pasarela; el cobro sigue siendo manual</w:t>
       </w:r>
+    </w:p>
+    <w:p>
+      <w:pPr>
+        <w:spacing w:after="120"/>
+        <w:rPr>
+          <w:lang w:val="es-CO"/>
+        </w:rPr>
+      </w:pPr>
       <w:r>
         <w:rPr>
           <w:lang w:val="es-CO"/>
         </w:rPr>
-        <w:t xml:space="preserve"> base ya admite una pasarela; el cobro sigue siendo manual</w:t>
+        <w:t>El MVP cobra a mano y no tiene pasarela (D-13). Lo que cambia es que la base ya sabe recibir un pago que no registró una persona: el plan guarda su precio, su moneda y su período; la suscripción, si se renueva sola y con qué identificador la conoce la pasarela; y el pago, de dónde viene, la referencia de la transacción, el estado que devolvió la pasarela y el cuerpo completo del webhook.</w:t>
       </w:r>
     </w:p>
     <w:p>
@@ -25613,39 +24666,7 @@
         <w:rPr>
           <w:lang w:val="es-CO"/>
         </w:rPr>
-        <w:t>El MVP cobra a mano y no tiene pasarela (D-13). Lo que cambia es que la base ya sabe recibir un pago que no registró una persona: el plan guarda su precio, su moneda y su período; la suscripción, s</w:t>
-      </w:r>
-      <w:r>
-        <w:rPr>
-          <w:lang w:val="es-CO"/>
-        </w:rPr>
-        <w:t>i se renueva sola y con qué identificador la conoce la pasarela; y el pago, de dónde viene, la referencia de la transacción, el estado que devolvió la pasarela y el cuerpo completo del webhook.</w:t>
-      </w:r>
-    </w:p>
-    <w:p>
-      <w:pPr>
-        <w:spacing w:after="120"/>
-        <w:rPr>
-          <w:lang w:val="es-CO"/>
-        </w:rPr>
-      </w:pPr>
-      <w:r>
-        <w:rPr>
-          <w:lang w:val="es-CO"/>
-        </w:rPr>
-        <w:t>Dos cosas que solo se ven cuando ya hay clientes pagando: un w</w:t>
-      </w:r>
-      <w:r>
-        <w:rPr>
-          <w:lang w:val="es-CO"/>
-        </w:rPr>
-        <w:t>ebhook se reintenta, así que el registro es idempotente por pasarela y referencia —el tercer reintento del mismo pago devuelve la misma fecha y no regala tres meses—, y el pago de pasarela no tiene autor, de modo que la exigencia de «quién lo registró» pas</w:t>
-      </w:r>
-      <w:r>
-        <w:rPr>
-          <w:lang w:val="es-CO"/>
-        </w:rPr>
-        <w:t>ó a depender del origen en vez de ser obligatoria siempre.</w:t>
+        <w:t>Dos cosas que solo se ven cuando ya hay clientes pagando: un webhook se reintenta, así que el registro es idempotente por pasarela y referencia —el tercer reintento del mismo pago devuelve la misma fecha y no regala tres meses—, y el pago de pasarela no tiene autor, de modo que la exigencia de «quién lo registró» pasó a depender del origen en vez de ser obligatoria siempre.</w:t>
       </w:r>
     </w:p>
     <w:p>
@@ -25674,33 +24695,21 @@
         <w:rPr>
           <w:lang w:val="es-CO"/>
         </w:rPr>
-        <w:t>D-41 · El AIU es</w:t>
+        <w:t xml:space="preserve">D-41 · El AIU es del proyecto, no de la empresa</w:t>
       </w:r>
+    </w:p>
+    <w:p>
+      <w:pPr>
+        <w:spacing w:after="120"/>
+        <w:rPr>
+          <w:lang w:val="es-CO"/>
+        </w:rPr>
+      </w:pPr>
       <w:r>
         <w:rPr>
           <w:lang w:val="es-CO"/>
         </w:rPr>
-        <w:t xml:space="preserve"> del proyecto, no de la empresa</w:t>
-      </w:r>
-    </w:p>
-    <w:p>
-      <w:pPr>
-        <w:spacing w:after="120"/>
-        <w:rPr>
-          <w:lang w:val="es-CO"/>
-        </w:rPr>
-      </w:pPr>
-      <w:r>
-        <w:rPr>
-          <w:lang w:val="es-CO"/>
-        </w:rPr>
-        <w:t xml:space="preserve">No hay AIU estándar. Los tres porcentajes se negocian obra por obra —dependen del cliente, del plazo, del riesgo y de la competencia— y precargarlos desde una configuración general es la forma más barata de que una obra </w:t>
-      </w:r>
-      <w:r>
-        <w:rPr>
-          <w:lang w:val="es-CO"/>
-        </w:rPr>
-        <w:t>salga con el AIU de otra sin que nadie lo note.</w:t>
+        <w:t xml:space="preserve">No hay AIU estándar. Los tres porcentajes se negocian obra por obra —dependen del cliente, del plazo, del riesgo y de la competencia— y precargarlos desde una configuración general es la forma más barata de que una obra salga con el AIU de otra sin que nadie lo note.</w:t>
       </w:r>
     </w:p>
     <w:p>
@@ -25729,13 +24738,21 @@
         <w:rPr>
           <w:lang w:val="es-CO"/>
         </w:rPr>
-        <w:t>D-42 · Dos formas de estructurar e</w:t>
+        <w:t>D-42 · Dos formas de estructurar el presupuesto, un solo árbol</w:t>
       </w:r>
+    </w:p>
+    <w:p>
+      <w:pPr>
+        <w:spacing w:after="120"/>
+        <w:rPr>
+          <w:lang w:val="es-CO"/>
+        </w:rPr>
+      </w:pPr>
       <w:r>
         <w:rPr>
           <w:lang w:val="es-CO"/>
         </w:rPr>
-        <w:t>l presupuesto, un solo árbol</w:t>
+        <w:t xml:space="preserve">Al crear el proyecto se elige entre estructura por ítems —capítulo y actividad, dos niveles— y estructura EDT —capítulo, subcapítulo y actividad, con la profundidad que haga falta y con actividades que pueden colgar también del capítulo—. La primera es para la obra pequeña que no necesita más; la segunda es la que el producto tiene que hacer bien.</w:t>
       </w:r>
     </w:p>
     <w:p>
@@ -25749,13 +24766,21 @@
         <w:rPr>
           <w:lang w:val="es-CO"/>
         </w:rPr>
-        <w:t>Al crear el proyecto se elige entre estructura por ítems —capítulo y actividad, dos niveles— y estructura EDT —capítulo, subcapítulo y actividad, con la profundidad que haga falta y con actividades que pueden colgar también del</w:t>
+        <w:t xml:space="preserve">No son dos modelos de datos: es el mismo árbol, y el modo por ítems solo prohíbe los subcapítulos. Cambiar de modo no migra un dato, y pasar de EDT a ítems se rechaza mientras existan subcapítulos, nombrando cuántos hay.</w:t>
       </w:r>
+    </w:p>
+    <w:p>
+      <w:pPr>
+        <w:spacing w:after="120"/>
+        <w:rPr>
+          <w:lang w:val="es-CO"/>
+        </w:rPr>
+      </w:pPr>
       <w:r>
         <w:rPr>
           <w:lang w:val="es-CO"/>
         </w:rPr>
-        <w:t xml:space="preserve"> capítulo—. La primera es para la obra pequeña que no necesita más; la segunda es la que el producto tiene que hacer bien.</w:t>
+        <w:t>La numeración la deriva la base del árbol. El capítulo es 1.0 y sus hijos 1.1, 1.2, 1.3; los hijos de un subcapítulo, 1.1.1 y siguientes. El cero del capítulo no es decoración: deja libre el 1.1 para el primer hijo, y como capítulos y actividades comparten el contador de su padre, una actividad colgada del capítulo nunca choca con un subcapítulo:</w:t>
       </w:r>
     </w:p>
     <w:p>
@@ -25769,53 +24794,7 @@
         <w:rPr>
           <w:lang w:val="es-CO"/>
         </w:rPr>
-        <w:t xml:space="preserve">No son dos modelos de datos: es el mismo árbol, y el modo por ítems solo prohíbe los subcapítulos. Cambiar de modo no migra un dato, </w:t>
-      </w:r>
-      <w:r>
-        <w:rPr>
-          <w:lang w:val="es-CO"/>
-        </w:rPr>
-        <w:t>y pasar de EDT a ítems se rechaza mientras existan subcapítulos, nombrando cuántos hay.</w:t>
-      </w:r>
-    </w:p>
-    <w:p>
-      <w:pPr>
-        <w:spacing w:after="120"/>
-        <w:rPr>
-          <w:lang w:val="es-CO"/>
-        </w:rPr>
-      </w:pPr>
-      <w:r>
-        <w:rPr>
-          <w:lang w:val="es-CO"/>
-        </w:rPr>
-        <w:t>La numeración la deriva la base del árbol. El capítulo es 1.0 y sus hijos 1.1, 1.2, 1.3; los hijos de un subcapítulo, 1.1.1 y siguientes. El cero del capítulo no es dec</w:t>
-      </w:r>
-      <w:r>
-        <w:rPr>
-          <w:lang w:val="es-CO"/>
-        </w:rPr>
-        <w:t>oración: deja libre el 1.1 para el primer hijo, y como capítulos y actividades comparten el contador de su padre, una actividad colgada del capítulo nunca choca con un subcapítulo:</w:t>
-      </w:r>
-    </w:p>
-    <w:p>
-      <w:pPr>
-        <w:spacing w:after="120"/>
-        <w:rPr>
-          <w:lang w:val="es-CO"/>
-        </w:rPr>
-      </w:pPr>
-      <w:r>
-        <w:rPr>
-          <w:lang w:val="es-CO"/>
-        </w:rPr>
-        <w:t>1.0 CIMENTACIÓN · 1.1 Excavación manual · 1.2 Concretos · 1.2.1 Concreto de</w:t>
-      </w:r>
-      <w:r>
-        <w:rPr>
-          <w:lang w:val="es-CO"/>
-        </w:rPr>
-        <w:t xml:space="preserve"> zapatas</w:t>
+        <w:t xml:space="preserve">1.0 CIMENTACIÓN · 1.1 Excavación manual · 1.2 Concretos · 1.2.1 Concreto de zapatas</w:t>
       </w:r>
     </w:p>
     <w:p>
@@ -25846,11 +24825,6 @@
         </w:rPr>
         <w:t>D-43 · El control de avance físico sale del MVP</w:t>
       </w:r>
-      <w:r>
-        <w:rPr>
-          <w:lang w:val="es-CO"/>
-        </w:rPr>
-      </w:r>
     </w:p>
     <w:p>
       <w:pPr>
@@ -25865,11 +24839,6 @@
         </w:rPr>
         <w:t>El MVP iba a llevar un seguimiento sencillo: por cada actividad, cuánta cantidad se ha ejecutado, y de ahí un porcentaje de avance. Se retira. Una cifra así se digita a mano, no la respalda ningún hecho de la obra —ninguna salida de almacén, ningún corte firmado, ninguna acta— y sirve para pintar una barra, no para decidir. El riesgo mayor no es que falte: es que esté y se le crea.</w:t>
       </w:r>
-      <w:r>
-        <w:rPr>
-          <w:lang w:val="es-CO"/>
-        </w:rPr>
-      </w:r>
     </w:p>
     <w:p>
       <w:pPr>
@@ -25884,29 +24853,19 @@
         </w:rPr>
         <w:t>El avance vuelve en la fase 2 como parte del módulo de control de proyectos, tal como lo describe el documento Flujo de Control de Proyectos: medido por consumo ponderado de recursos, alimentado por los vales de salida de almacén y las compras, y cortado contra contratos y actas. Ahí la cifra sale de hechos registrados y aguanta una discusión con el cliente.</w:t>
       </w:r>
+    </w:p>
+    <w:p>
+      <w:pPr>
+        <w:spacing w:after="120"/>
+        <w:rPr>
+          <w:lang w:val="es-CO"/>
+        </w:rPr>
+      </w:pPr>
       <w:r>
         <w:rPr>
           <w:lang w:val="es-CO"/>
         </w:rPr>
-      </w:r>
-    </w:p>
-    <w:p>
-      <w:pPr>
-        <w:spacing w:after="120"/>
-        <w:rPr>
-          <w:lang w:val="es-CO"/>
-        </w:rPr>
-      </w:pPr>
-      <w:r>
-        <w:rPr>
-          <w:lang w:val="es-CO"/>
-        </w:rPr>
         <w:t>El MVP queda entonces con una frontera limpia: presupuestar —catálogo, APU, presupuesto, versiones, exportación— y nada más. Las decisiones D-12 y D-23 y las reglas RN-12, RN-13 y RN-19, que describían el avance, quedan reservadas con su número. En el esquema no queda tabla ni columna preparada para recibirlo: reservar hoy la forma de un módulo que todavía no está diseñado es adivinar, y la fase 2 llega con migraciones numeradas, no con huecos.</w:t>
-      </w:r>
-      <w:r>
-        <w:rPr>
-          <w:lang w:val="es-CO"/>
-        </w:rPr>
       </w:r>
     </w:p>
     <w:p>
@@ -25943,16 +24902,6 @@
         </w:rPr>
         <w:t>El 24 de septiembre de 2026 una auditoría independiente corrió el esquema sobre PostgreSQL 16 e intentó romperlo con el rol de la aplicación, no como superusuario. Encontró ocho cosas. Ninguna obligó a cambiar una tabla; las seis decisiones que siguen cierran la distancia que había entre lo que estos documentos prometían y lo que la base hacía cumplir por su cuenta. Vale la pena leerlas juntas, porque todas son la misma lección: una garantía que depende de que el backend se acuerde no es una garantía, es una costumbre.</w:t>
       </w:r>
-      <w:r>
-        <w:rPr>
-          <w:lang w:val="es-CO"/>
-        </w:rPr>
-      </w:r>
-      <w:r>
-        <w:rPr>
-          <w:lang w:val="es-CO"/>
-        </w:rPr>
-      </w:r>
     </w:p>
     <w:p>
       <w:pPr>
@@ -25988,16 +24937,6 @@
         </w:rPr>
         <w:t>La base decidía quién puede activar, cerrar y reabrir un proyecto mirando el tipo del rol del usuario. Pero la aplicación podía crear un rol personalizado y ascenderlo con un UPDATE de una línea, o crear directamente un segundo rol de tipo ADMIN, o marcarse como rol de sistema. Cualquiera de los tres caminos terminaba en lo mismo: un administrador paralelo reabriendo una línea base firmada. Lo que el documento prometía como una garantía de la base la sostenía el backend.</w:t>
       </w:r>
-      <w:r>
-        <w:rPr>
-          <w:lang w:val="es-CO"/>
-        </w:rPr>
-      </w:r>
-      <w:r>
-        <w:rPr>
-          <w:lang w:val="es-CO"/>
-        </w:rPr>
-      </w:r>
     </w:p>
     <w:p>
       <w:pPr>
@@ -26013,16 +24952,6 @@
         </w:rPr>
         <w:t>Ahora el tipo y la marca de sistema son inmutables después de creado el rol, y los tipos ADMIN y ASISTENTE solo los crea la base al dar de alta la empresa. La aplicación crea roles PERSONALIZADO, que es exactamente lo que ofrece el plan Empresarial. Un índice único deja uno de cada tipo por empresa, para que «el rol Administrador» siga siendo una frase con referente.</w:t>
       </w:r>
-      <w:r>
-        <w:rPr>
-          <w:lang w:val="es-CO"/>
-        </w:rPr>
-      </w:r>
-      <w:r>
-        <w:rPr>
-          <w:lang w:val="es-CO"/>
-        </w:rPr>
-      </w:r>
     </w:p>
     <w:p>
       <w:pPr>
@@ -26037,16 +24966,6 @@
           <w:lang w:val="es-CO"/>
         </w:rPr>
         <w:t>Como consecuencia, el rol Asistente ahora nace con la empresa y no lo inserta el backend: si tuviera que insertarlo, habría que volver a abrirle la puerta que esta decisión cierra. Nace sin ningún permiso, y el Administrador se los otorga uno por uno, que es lo que ya decía la sección 9.</w:t>
-      </w:r>
-      <w:r>
-        <w:rPr>
-          <w:lang w:val="es-CO"/>
-        </w:rPr>
-      </w:r>
-      <w:r>
-        <w:rPr>
-          <w:lang w:val="es-CO"/>
-        </w:rPr>
       </w:r>
     </w:p>
     <w:p>
@@ -26083,16 +25002,6 @@
         </w:rPr>
         <w:t>RF-HIS-03 promete que quedan registrados el ítem agregado o eliminado, la cantidad, el precio, el capítulo y el AIU. Medido contra la base real: crear un capítulo, agregar una actividad, cambiar su cantidad y mover el AIU dejaban cero filas en el historial. Los escribía el backend, o no los escribía nadie. Y como la aplicación tenía permiso de inserción sobre la tabla, además podía escribir un evento a nombre de cualquier usuario.</w:t>
       </w:r>
-      <w:r>
-        <w:rPr>
-          <w:lang w:val="es-CO"/>
-        </w:rPr>
-      </w:r>
-      <w:r>
-        <w:rPr>
-          <w:lang w:val="es-CO"/>
-        </w:rPr>
-      </w:r>
     </w:p>
     <w:p>
       <w:pPr>
@@ -26108,16 +25017,6 @@
         </w:rPr>
         <w:t>Un historial inalterable pero forjable no sirve el único día que importa, que es el día en que alguien discute quién cambió una cantidad. Ahora los diez tipos de evento del MVP los escriben triggers de la base, con el autor leído del contexto de la transacción y no recibido como parámetro, y la aplicación pierde el permiso de inserción sobre la tabla. No queda ninguna puerta: la función interna que escribe se niega si no la llama un trigger.</w:t>
       </w:r>
-      <w:r>
-        <w:rPr>
-          <w:lang w:val="es-CO"/>
-        </w:rPr>
-      </w:r>
-      <w:r>
-        <w:rPr>
-          <w:lang w:val="es-CO"/>
-        </w:rPr>
-      </w:r>
     </w:p>
     <w:p>
       <w:pPr>
@@ -26132,16 +25031,6 @@
           <w:lang w:val="es-CO"/>
         </w:rPr>
         <w:t>Dos silencios deliberados: la purga de una empresa, que borra todo y no es historia, y la duplicación de un presupuesto, donde escribir dos mil eventos de «actividad agregada» por una copia convierte el panel en ruido. La copia deja su evento de duplicación, que es el hecho que ocurrió.</w:t>
-      </w:r>
-      <w:r>
-        <w:rPr>
-          <w:lang w:val="es-CO"/>
-        </w:rPr>
-      </w:r>
-      <w:r>
-        <w:rPr>
-          <w:lang w:val="es-CO"/>
-        </w:rPr>
       </w:r>
     </w:p>
     <w:p>
@@ -26178,16 +25067,6 @@
         </w:rPr>
         <w:t>Resolver un correo a un usuario ocurre antes de que exista contexto de empresa, así que la función que lo hace tiene que poder ver la tabla de usuarios entera. Mientras cualquiera pudo ejecutarla, desde el contexto de la empresa B se obtenía el nombre, la empresa y el hash de contraseña de un usuario de A con solo conocer su correo. Era la única vía por la que una empresa alcanzaba un dato de otra dentro del esquema.</w:t>
       </w:r>
-      <w:r>
-        <w:rPr>
-          <w:lang w:val="es-CO"/>
-        </w:rPr>
-      </w:r>
-      <w:r>
-        <w:rPr>
-          <w:lang w:val="es-CO"/>
-        </w:rPr>
-      </w:r>
     </w:p>
     <w:p>
       <w:pPr>
@@ -26203,16 +25082,6 @@
         </w:rPr>
         <w:t>El hash tiene que salir de la base —el backend lo compara con Argon2id, que PostgreSQL no sabe calcular—, así que lo que se cierra no es la salida del hash sino quién puede pedirlo. El paso de autenticación pasa a tener su propia conexión, con dos funciones y nada más: ni una tabla, ni una fila. La conexión de la aplicación ya no las alcanza y recibe «permiso denegado» si lo intenta.</w:t>
       </w:r>
-      <w:r>
-        <w:rPr>
-          <w:lang w:val="es-CO"/>
-        </w:rPr>
-      </w:r>
-      <w:r>
-        <w:rPr>
-          <w:lang w:val="es-CO"/>
-        </w:rPr>
-      </w:r>
     </w:p>
     <w:p>
       <w:pPr>
@@ -26227,16 +25096,6 @@
           <w:lang w:val="es-CO"/>
         </w:rPr>
         <w:t>El despliegue crea entonces tres conexiones y no dos: una para la aplicación, una para el panel de superadministración y una para autenticar. No son tres sombreros de la misma conexión: si el backend inicia sesión con la de la aplicación, la base lo rechaza, que es exactamente lo que tiene que pasar.</w:t>
-      </w:r>
-      <w:r>
-        <w:rPr>
-          <w:lang w:val="es-CO"/>
-        </w:rPr>
-      </w:r>
-      <w:r>
-        <w:rPr>
-          <w:lang w:val="es-CO"/>
-        </w:rPr>
       </w:r>
     </w:p>
     <w:p>
@@ -26273,16 +25132,6 @@
         </w:rPr>
         <w:t>El esquema trae seis índices para servir la búsqueda en tiempo real que piden RF-REC-03, RF-APU-02 y RF-PRE-02. La auditoría midió que ninguno se usaba, y no por un error de escritura: PostgreSQL no admite una condición que no sea «a prueba de fugas» como condición de índice sobre una tabla con políticas de seguridad, y ni LIKE, ni ILIKE, ni lower() lo son. El índice acotaba la empresa y después leía el catálogo entero.</w:t>
       </w:r>
-      <w:r>
-        <w:rPr>
-          <w:lang w:val="es-CO"/>
-        </w:rPr>
-      </w:r>
-      <w:r>
-        <w:rPr>
-          <w:lang w:val="es-CO"/>
-        </w:rPr>
-      </w:r>
     </w:p>
     <w:p>
       <w:pPr>
@@ -26298,16 +25147,6 @@
         </w:rPr>
         <w:t>Con treinta mil recursos, la consulta directa descartaba 30.007 filas y leía 745 bloques de disco por cada tecla. Por la función nueva —que filtra la empresa ella misma y no tiene políticas encima— el plan vuelve a usar el índice trigrama con las dos condiciones a la vez y lee cinco bloques. Hoy no dolía; en la pantalla más usada del sistema, con un catálogo real, sí.</w:t>
       </w:r>
-      <w:r>
-        <w:rPr>
-          <w:lang w:val="es-CO"/>
-        </w:rPr>
-      </w:r>
-      <w:r>
-        <w:rPr>
-          <w:lang w:val="es-CO"/>
-        </w:rPr>
-      </w:r>
     </w:p>
     <w:p>
       <w:pPr>
@@ -26322,16 +25161,6 @@
           <w:lang w:val="es-CO"/>
         </w:rPr>
         <w:t>Las funciones devuelven identificadores y no filas, a propósito: la aplicación los une contra la tabla, que sigue bajo aislamiento, y ese cruce va por la llave primaria. Así la función no se convierte en una segunda definición de la tabla que haya que mantener al día. Sin contexto de empresa no devuelven nada.</w:t>
-      </w:r>
-      <w:r>
-        <w:rPr>
-          <w:lang w:val="es-CO"/>
-        </w:rPr>
-      </w:r>
-      <w:r>
-        <w:rPr>
-          <w:lang w:val="es-CO"/>
-        </w:rPr>
       </w:r>
     </w:p>
     <w:p>
@@ -26368,16 +25197,6 @@
         </w:rPr>
         <w:t>Las llaves siguen siendo uuid: cambiarlas a un entero con datos dentro sería reescribir todas las llaves foráneas del esquema. Lo que cambia es de dónde sale el valor. Un identificador aleatorio llena las páginas del índice al azar, y cada inserción toca una página fría distinta; medido sobre dos millones de filas, lo que más pesa no es el tamaño del índice sino el registro de transacciones, que es lo que paga la replicación, el respaldo y cada punto de control: 80 MB por cada cien mil inserciones contra 24 MB.</w:t>
       </w:r>
-      <w:r>
-        <w:rPr>
-          <w:lang w:val="es-CO"/>
-        </w:rPr>
-      </w:r>
-      <w:r>
-        <w:rPr>
-          <w:lang w:val="es-CO"/>
-        </w:rPr>
-      </w:r>
     </w:p>
     <w:p>
       <w:pPr>
@@ -26393,16 +25212,6 @@
         </w:rPr>
         <w:t>El detalle que importa: un identificador ordenado mal hecho es peor que uno aleatorio. No basta con poner la fecha delante, porque los valores generados dentro del mismo milisegundo tienen que salir en orden o el índice vuelve a llenarse al azar dentro de cada milisegundo. El del esquema lleva un contador en los doce bits que el estándar deja libres, y se comprobó estrictamente creciente en dos mil generaciones seguidas.</w:t>
       </w:r>
-      <w:r>
-        <w:rPr>
-          <w:lang w:val="es-CO"/>
-        </w:rPr>
-      </w:r>
-      <w:r>
-        <w:rPr>
-          <w:lang w:val="es-CO"/>
-        </w:rPr>
-      </w:r>
     </w:p>
     <w:p>
       <w:pPr>
@@ -26417,16 +25226,6 @@
           <w:lang w:val="es-CO"/>
         </w:rPr>
         <w:t>Es un cambio de hoy y esa es toda su urgencia: cambiar el valor por defecto de una columna no toca un solo dato, pero las filas insertadas antes del cambio quedan desordenadas para siempre. PostgreSQL 18 traerá la función nativa; cuando el despliegue esté sobre esa versión se sustituye y no cambia nada más.</w:t>
-      </w:r>
-      <w:r>
-        <w:rPr>
-          <w:lang w:val="es-CO"/>
-        </w:rPr>
-      </w:r>
-      <w:r>
-        <w:rPr>
-          <w:lang w:val="es-CO"/>
-        </w:rPr>
       </w:r>
     </w:p>
     <w:p>
@@ -26463,16 +25262,6 @@
         </w:rPr>
         <w:t>Es lo único que la auditoría recomendó y no se hizo, así que conviene dejar los dos lados escritos. El historial es la tabla que más crece —desde D-45 la escribe la base en cada edición— y en el escenario grande, quinientas empresas con doscientos proyectos de dos mil actividades cada uno, son unos 305 GB en una sola tabla.</w:t>
       </w:r>
-      <w:r>
-        <w:rPr>
-          <w:lang w:val="es-CO"/>
-        </w:rPr>
-      </w:r>
-      <w:r>
-        <w:rPr>
-          <w:lang w:val="es-CO"/>
-        </w:rPr>
-      </w:r>
     </w:p>
     <w:p>
       <w:pPr>
@@ -26488,16 +25277,6 @@
         </w:rPr>
         <w:t>Se decide esperar por tres razones. La primera es que es la única de la lista que no es irreversible: ninguna tabla la referencia por llave foránea, así que partirla después es crear la tabla partida, copiar y renombrar, una ventana de mantenimiento programable y no un rediseño. La segunda es que la granularidad correcta depende de un volumen que hoy nadie conoce, y elegirla ahora es adivinar. La tercera es que tenerla partida desde el primer día cuesta veinticinco particiones en el inventario y una partición que alguien tiene que crear cada mes para siempre.</w:t>
       </w:r>
-      <w:r>
-        <w:rPr>
-          <w:lang w:val="es-CO"/>
-        </w:rPr>
-      </w:r>
-      <w:r>
-        <w:rPr>
-          <w:lang w:val="es-CO"/>
-        </w:rPr>
-      </w:r>
     </w:p>
     <w:p>
       <w:pPr>
@@ -26512,16 +25291,6 @@
           <w:lang w:val="es-CO"/>
         </w:rPr>
         <w:t>Para que no dependa de que alguien se acuerde, queda escrito el punto de disparo: cuando el historial pase de cincuenta millones de filas o de 25 GB con sus índices, se parte por fecha. El esquema trae la consulta para mirarlo; conviene hacerlo una vez al trimestre. Es una consulta, no un proyecto.</w:t>
-      </w:r>
-      <w:r>
-        <w:rPr>
-          <w:lang w:val="es-CO"/>
-        </w:rPr>
-      </w:r>
-      <w:r>
-        <w:rPr>
-          <w:lang w:val="es-CO"/>
-        </w:rPr>
       </w:r>
     </w:p>
     <w:p>
@@ -29162,13 +27931,7 @@
         <w:rPr>
           <w:lang w:val="es-CO"/>
         </w:rPr>
-        <w:t xml:space="preserve">Todo lo que este paquete no dice, no está decidido. Esta sección enumera lo que falta, para que nadie lo </w:t>
-      </w:r>
-      <w:r>
-        <w:rPr>
-          <w:lang w:val="es-CO"/>
-        </w:rPr>
-        <w:t>resuelva por su cuenta a mitad del desarrollo. Ninguno de estos puntos bloquea el arranque: todos pueden resolverse mientras se construyen las primeras fases, pero deben resolverse antes de las fases que se indican.</w:t>
+        <w:t xml:space="preserve">Todo lo que este paquete no dice, no está decidido. Esta sección enumera lo que falta, para que nadie lo resuelva por su cuenta a mitad del desarrollo. Ninguno de estos puntos bloquea el arranque: todos pueden resolverse mientras se construyen las primeras fases, pero deben resolverse antes de las fases que se indican.</w:t>
       </w:r>
     </w:p>
     <w:p>
@@ -29183,13 +27946,7 @@
         <w:rPr>
           <w:lang w:val="es-CO"/>
         </w:rPr>
-        <w:t>17.1 Decisiones de producto que dependen</w:t>
-      </w:r>
-      <w:r>
-        <w:rPr>
-          <w:lang w:val="es-CO"/>
-        </w:rPr>
-        <w:t xml:space="preserve"> del propietario</w:t>
+        <w:t xml:space="preserve">17.1 Decisiones de producto que dependen del propietario</w:t>
       </w:r>
     </w:p>
     <w:tbl>
@@ -29406,20 +28163,85 @@
                 <w:sz w:val="19"/>
                 <w:lang w:val="es-CO"/>
               </w:rPr>
-              <w:t xml:space="preserve">Régimen tributario y entidad que factura (D-32): si el servicio queda excluido de IVA y si se factura como </w:t>
+              <w:t xml:space="preserve">Régimen tributario y entidad que factura (D-32): si el servicio queda excluido de IVA y si se factura como persona natural o a través de una sociedad. </w:t>
             </w:r>
             <w:r>
               <w:rPr>
                 <w:sz w:val="19"/>
-                <w:lang w:val="es-CO"/>
-              </w:rPr>
-              <w:t xml:space="preserve">persona natural o a través de una sociedad. </w:t>
-            </w:r>
+              </w:rPr>
+              <w:t>Requiere contador.</w:t>
+            </w:r>
+          </w:p>
+        </w:tc>
+        <w:tc>
+          <w:tcPr>
+            <w:tcW w:w="1920" w:type="dxa"/>
+            <w:tcMar>
+              <w:top w:w="70" w:type="dxa"/>
+              <w:left w:w="110" w:type="dxa"/>
+              <w:bottom w:w="70" w:type="dxa"/>
+              <w:right w:w="110" w:type="dxa"/>
+            </w:tcMar>
+          </w:tcPr>
+          <w:p>
+            <w:pPr>
+              <w:spacing w:before="40" w:after="80"/>
+            </w:pPr>
             <w:r>
               <w:rPr>
                 <w:sz w:val="19"/>
               </w:rPr>
-              <w:t>Requiere contador.</w:t>
+              <w:t>Antes de la fase 7 (el cobro)</w:t>
+            </w:r>
+          </w:p>
+        </w:tc>
+      </w:tr>
+      <w:tr>
+        <w:tc>
+          <w:tcPr>
+            <w:tcW w:w="500" w:type="dxa"/>
+            <w:tcMar>
+              <w:top w:w="70" w:type="dxa"/>
+              <w:left w:w="110" w:type="dxa"/>
+              <w:bottom w:w="70" w:type="dxa"/>
+              <w:right w:w="110" w:type="dxa"/>
+            </w:tcMar>
+          </w:tcPr>
+          <w:p>
+            <w:pPr>
+              <w:spacing w:before="40" w:after="80"/>
+            </w:pPr>
+            <w:r>
+              <w:rPr>
+                <w:sz w:val="19"/>
+              </w:rPr>
+              <w:t>3</w:t>
+            </w:r>
+          </w:p>
+        </w:tc>
+        <w:tc>
+          <w:tcPr>
+            <w:tcW w:w="6600" w:type="dxa"/>
+            <w:tcMar>
+              <w:top w:w="70" w:type="dxa"/>
+              <w:left w:w="110" w:type="dxa"/>
+              <w:bottom w:w="70" w:type="dxa"/>
+              <w:right w:w="110" w:type="dxa"/>
+            </w:tcMar>
+          </w:tcPr>
+          <w:p>
+            <w:pPr>
+              <w:spacing w:before="40" w:after="80"/>
+              <w:rPr>
+                <w:lang w:val="es-CO"/>
+              </w:rPr>
+            </w:pPr>
+            <w:r>
+              <w:rPr>
+                <w:sz w:val="19"/>
+                <w:lang w:val="es-CO"/>
+              </w:rPr>
+              <w:t>Identidad visual: paleta, tipografía y logotipo. La guía de interfaz define comportamiento, no apariencia.</w:t>
             </w:r>
           </w:p>
         </w:tc>
@@ -29441,7 +28263,7 @@
               <w:rPr>
                 <w:sz w:val="19"/>
               </w:rPr>
-              <w:t>Antes de la fase 7 (el cobro)</w:t>
+              <w:t>Antes de la rebanada 6.2: los patrones visuales se definen antes de la segunda pantalla, o salen quince pantallas en quince estilos</w:t>
             </w:r>
           </w:p>
         </w:tc>
@@ -29465,7 +28287,7 @@
               <w:rPr>
                 <w:sz w:val="19"/>
               </w:rPr>
-              <w:t>3</w:t>
+              <w:t>4</w:t>
             </w:r>
           </w:p>
         </w:tc>
@@ -29482,92 +28304,13 @@
           <w:p>
             <w:pPr>
               <w:spacing w:before="40" w:after="80"/>
-              <w:rPr>
-                <w:lang w:val="es-CO"/>
-              </w:rPr>
             </w:pPr>
             <w:r>
               <w:rPr>
                 <w:sz w:val="19"/>
                 <w:lang w:val="es-CO"/>
               </w:rPr>
-              <w:t>Identidad visual: paleta, tipografía y logotipo. La guía de interfaz define comportamiento, no apariencia.</w:t>
-            </w:r>
-          </w:p>
-        </w:tc>
-        <w:tc>
-          <w:tcPr>
-            <w:tcW w:w="1920" w:type="dxa"/>
-            <w:tcMar>
-              <w:top w:w="70" w:type="dxa"/>
-              <w:left w:w="110" w:type="dxa"/>
-              <w:bottom w:w="70" w:type="dxa"/>
-              <w:right w:w="110" w:type="dxa"/>
-            </w:tcMar>
-          </w:tcPr>
-          <w:p>
-            <w:pPr>
-              <w:spacing w:before="40" w:after="80"/>
-            </w:pPr>
-            <w:r>
-              <w:rPr>
-                <w:sz w:val="19"/>
-              </w:rPr>
-              <w:t>Antes de la rebanada 6.2: los patrones visuales se definen antes de la segunda pantalla, o salen quince pantallas en quince estilos</w:t>
-            </w:r>
-          </w:p>
-        </w:tc>
-      </w:tr>
-      <w:tr>
-        <w:tc>
-          <w:tcPr>
-            <w:tcW w:w="500" w:type="dxa"/>
-            <w:tcMar>
-              <w:top w:w="70" w:type="dxa"/>
-              <w:left w:w="110" w:type="dxa"/>
-              <w:bottom w:w="70" w:type="dxa"/>
-              <w:right w:w="110" w:type="dxa"/>
-            </w:tcMar>
-          </w:tcPr>
-          <w:p>
-            <w:pPr>
-              <w:spacing w:before="40" w:after="80"/>
-            </w:pPr>
-            <w:r>
-              <w:rPr>
-                <w:sz w:val="19"/>
-              </w:rPr>
-              <w:t>4</w:t>
-            </w:r>
-          </w:p>
-        </w:tc>
-        <w:tc>
-          <w:tcPr>
-            <w:tcW w:w="6600" w:type="dxa"/>
-            <w:tcMar>
-              <w:top w:w="70" w:type="dxa"/>
-              <w:left w:w="110" w:type="dxa"/>
-              <w:bottom w:w="70" w:type="dxa"/>
-              <w:right w:w="110" w:type="dxa"/>
-            </w:tcMar>
-          </w:tcPr>
-          <w:p>
-            <w:pPr>
-              <w:spacing w:before="40" w:after="80"/>
-            </w:pPr>
-            <w:r>
-              <w:rPr>
-                <w:sz w:val="19"/>
-                <w:lang w:val="es-CO"/>
-              </w:rPr>
-              <w:t xml:space="preserve">Textos legales de la Ley 1581 de 2012: política de tratamiento de </w:t>
-            </w:r>
-            <w:r>
-              <w:rPr>
-                <w:sz w:val="19"/>
-                <w:lang w:val="es-CO"/>
-              </w:rPr>
-              <w:t xml:space="preserve">datos, aviso de privacidad y autorización del titular, más las casillas de aceptación en el registro. </w:t>
+              <w:t xml:space="preserve">Textos legales de la Ley 1581 de 2012: política de tratamiento de datos, aviso de privacidad y autorización del titular, más las casillas de aceptación en el registro. </w:t>
             </w:r>
             <w:r>
               <w:rPr>
@@ -29627,13 +28370,7 @@
         <w:rPr>
           <w:lang w:val="es-CO"/>
         </w:rPr>
-        <w:t>Los dos ganchos que de verdad costaban ya están puestos en el esquema, y no hay que de</w:t>
-      </w:r>
-      <w:r>
-        <w:rPr>
-          <w:lang w:val="es-CO"/>
-        </w:rPr>
-        <w:t>cidir nada sobre ellos:</w:t>
+        <w:t>Los dos ganchos que de verdad costaban ya están puestos en el esquema, y no hay que decidir nada sobre ellos:</w:t>
       </w:r>
     </w:p>
     <w:p>
@@ -29648,13 +28385,7 @@
         <w:rPr>
           <w:lang w:val="es-CO"/>
         </w:rPr>
-        <w:t>•  apu_version.ambito admite hoy un solo valor, MAESTRO, y apu_version.presupuesto_id es siempre nula. El módulo de control necesita un APU propio del proyecto, editable sin tocar el catálogo maestro: es ampliar esa restricción, sin</w:t>
-      </w:r>
-      <w:r>
-        <w:rPr>
-          <w:lang w:val="es-CO"/>
-        </w:rPr>
-        <w:t xml:space="preserve"> migrar un dato, porque la columna que dice de qué proyecto es la versión ya está puesta y la base ya impide que una versión de proyecto se vuelva la vigente del catálogo.</w:t>
+        <w:t xml:space="preserve">•  apu_version.ambito admite hoy un solo valor, MAESTRO, y apu_version.presupuesto_id es siempre nula. El módulo de control necesita un APU propio del proyecto, editable sin tocar el catálogo maestro: es ampliar esa restricción, sin migrar un dato, porque la columna que dice de qué proyecto es la versión ya está puesta y la base ya impide que una versión de proyecto se vuelva la vigente del catálogo.</w:t>
       </w:r>
     </w:p>
     <w:p>
@@ -29673,35 +28404,19 @@
         <w:br/>
         <w:t>•  La fotografía de cada versión guarda el identificador de cada capítulo y de cada actividad, no solo su número (D-48 del esquema, schema 2). Es lo que permitirá a la fase 2 cruzar la línea base contra la ejecución: los números se renumeran en cada reapertura, los identificadores no. Entró antes de que existiera la primera versión guardada porque las versiones son inmutables y las que se guarden ya no se corrigen.</w:t>
       </w:r>
+    </w:p>
+    <w:p>
+      <w:pPr>
+        <w:spacing w:after="120"/>
+        <w:rPr>
+          <w:lang w:val="es-CO"/>
+        </w:rPr>
+      </w:pPr>
       <w:r>
         <w:rPr>
           <w:lang w:val="es-CO"/>
         </w:rPr>
-      </w:r>
-      <w:r>
-        <w:rPr>
-          <w:lang w:val="es-CO"/>
-        </w:rPr>
-      </w:r>
-    </w:p>
-    <w:p>
-      <w:pPr>
-        <w:spacing w:after="120"/>
-        <w:rPr>
-          <w:lang w:val="es-CO"/>
-        </w:rPr>
-      </w:pPr>
-      <w:r>
-        <w:rPr>
-          <w:lang w:val="es-CO"/>
-        </w:rPr>
-        <w:t xml:space="preserve">Descartado: fechas programadas de inicio y fin por actividad. El módulo de control no las pide, y el de reportes dice expresamente que opera «exclusivamente bajo la dimensión de costos y cantidades» — sus indicadores son EV, AC, CV y </w:t>
-      </w:r>
-      <w:r>
-        <w:rPr>
-          <w:lang w:val="es-CO"/>
-        </w:rPr>
-        <w:t>CPI, ninguno de cronograma. Reservar columnas para una función que el diseño excluye solo genera dudas después.</w:t>
+        <w:t xml:space="preserve">Descartado: fechas programadas de inicio y fin por actividad. El módulo de control no las pide, y el de reportes dice expresamente que opera «exclusivamente bajo la dimensión de costos y cantidades» — sus indicadores son EV, AC, CV y CPI, ninguno de cronograma. Reservar columnas para una función que el diseño excluye solo genera dudas después.</w:t>
       </w:r>
     </w:p>
     <w:p>
@@ -29717,16 +28432,6 @@
         </w:rPr>
         <w:t>Decidido: el alcance por proyecto de los permisos llega en la fase 2. En el MVP un rol vale para toda la empresa. El control por proyecto entra con el módulo de control de obra, donde el proyecto ya tiene APU propios y equipo asignado. Para que ese cambio no obligue a rehacer el backend, la aplicación fija app.usuario_id en cada transacción desde la fase 0, junto a app.tenant_id. Desde D-45 ya no es una variable de adorno: es el autor de cada evento del historial, así que la transacción que no la fije deja eventos sin firmar. La auditoría confirmó además que el alcance por proyecto entra sin rehacer nada: una tabla que asocie usuario y proyecto más políticas de aislamiento restrictivas encima de las actuales, que se suman a las que ya hay en vez de reemplazarlas.</w:t>
       </w:r>
-      <w:r>
-        <w:rPr>
-          <w:lang w:val="es-CO"/>
-        </w:rPr>
-      </w:r>
-      <w:r>
-        <w:rPr>
-          <w:lang w:val="es-CO"/>
-        </w:rPr>
-      </w:r>
     </w:p>
     <w:p>
       <w:pPr>
@@ -29754,13 +28459,7 @@
         <w:rPr>
           <w:lang w:val="es-CO"/>
         </w:rPr>
-        <w:t>No son decisiones de diseño, pero sin ellos el sistema no arranca y su contratación tiene plazos propios: proveedor de correo transaccional —Resend o Amazon SES—, planificador de tareas para los avisos de</w:t>
-      </w:r>
-      <w:r>
-        <w:rPr>
-          <w:lang w:val="es-CO"/>
-        </w:rPr>
-        <w:t xml:space="preserve"> vencimiento, almacenamiento de objetos (D-30), hosting, dominio y rutina de respaldo con prueba de restauración (RNF-17).</w:t>
+        <w:t xml:space="preserve">No son decisiones de diseño, pero sin ellos el sistema no arranca y su contratación tiene plazos propios: proveedor de correo transaccional —Resend o Amazon SES—, planificador de tareas para los avisos de vencimiento, almacenamiento de objetos (D-30), hosting, dominio y rutina de respaldo con prueba de restauración (RNF-17).</w:t>
       </w:r>
     </w:p>
     <w:p>

</xml_diff>

<commit_message>
docs: los documentos 01, 02, 04, 06 y 07 alineados con lo construido
Revisión de las 79 decisiones contra los documentos (docs/Revision de la
documentacion - 2026-10-16.pdf). Estados de la suscripción (D-74, D-76),
numeración de la estructura (D-75), migraciones (D-77), imágenes en la
base (D-71), CS006, purga diaria, plazos con vigencia (D-78). El 01 gana
D-50 a D-77 en su §14 y siete requisitos que ya estaban construidos sin
número; las decisiones cambiadas conservan su motivo con una nota. El 07
marca el módulo 0 como cerrado.

Co-Authored-By: Claude Opus 5.5 <noreply@anthropic.com>
Claude-Session: https://claude.ai/code/session_01QkUecTxXWHcSEBT7CByXQu
</commit_message>
<xml_diff>
--- a/docs/01 - Alcance del MVP.docx
+++ b/docs/01 - Alcance del MVP.docx
@@ -187,7 +187,7 @@
                 <w:szCs w:val="18"/>
                 <w:lang w:val="es-CO"/>
               </w:rPr>
-              <w:t>16 de septiembre de 2026 · revisiones del 22 de septiembre y del 1 de octubre de 2026</w:t>
+              <w:t xml:space="preserve">16 de septiembre de 2026 · revisiones del 22 de septiembre, del 1 de octubre y del 16 de octubre de 2026; esta última lleva el texto a lo construido (D-50 a D-77)</w:t>
             </w:r>
           </w:p>
         </w:tc>
@@ -3212,7 +3212,7 @@
                 <w:szCs w:val="19"/>
                 <w:lang w:val="es-CO"/>
               </w:rPr>
-              <w:t>Una empresa que agota los 15 días de prueba sin pagar nunca llegó a ser cliente. Sus datos se conservan 10 días por si se decide, y a partir de ahí el superadministrador puede eliminarlos desde el panel. La eliminación es una acción manual y deliberada, nunca un proceso automático: borrar el trabajo de alguien no debe poder ocurrir por un error de programación.</w:t>
+              <w:t xml:space="preserve">Una empresa que agota los 15 días de prueba sin pagar nunca llegó a ser cliente. Tiene 10 días de solo lectura para decidir: consulta, exporta y paga desde la suscripción. Si no paga, la prueba queda cancelada y la purga diaria elimina sus datos ese mismo día. Hasta el 13 de octubre de 2026 la eliminación era manual; la cambió el dueño ese día (D-76).</w:t>
             </w:r>
           </w:p>
         </w:tc>
@@ -5600,7 +5600,7 @@
                 <w:sz w:val="18"/>
                 <w:szCs w:val="18"/>
               </w:rPr>
-              <w:t>Cronograma / Gantt</w:t>
+              <w:t xml:space="preserve">Cronograma / Gantt</w:t>
             </w:r>
           </w:p>
         </w:tc>
@@ -5628,7 +5628,7 @@
                 <w:szCs w:val="18"/>
                 <w:lang w:val="es-CO"/>
               </w:rPr>
-              <w:t>Fuera del alcance total del producto.</w:t>
+              <w:t xml:space="preserve">Fuera del MVP. Entra después como módulo 1, la programación de obra (decisión del dueño, 13 de octubre de 2026; documento 07).</w:t>
             </w:r>
           </w:p>
         </w:tc>
@@ -5652,7 +5652,7 @@
                 <w:sz w:val="18"/>
                 <w:szCs w:val="18"/>
               </w:rPr>
-              <w:t>No aplica</w:t>
+              <w:t xml:space="preserve">Después del MVP</w:t>
             </w:r>
           </w:p>
         </w:tc>
@@ -8295,7 +8295,7 @@
                 <w:szCs w:val="18"/>
                 <w:lang w:val="es-CO"/>
               </w:rPr>
-              <w:t>Al iniciar sesión el sistema verifica la vigencia de la suscripción de la empresa. Si la prueba gratuita terminó sin pago, la empresa queda en SOLO LECTURA: el usuario abre Recursos, APU y Presupuestos, los consulta y los exporta, y cualquier acción que escriba se rechaza. Una suscripción pagada y vencida tiene dos días hábiles con todo funcionando; después queda suspendida y el usuario solo ve la pantalla de su suscripción, para pagar. Lo mismo ocurre con una cancelada pasada la fecha pagada (D-74).</w:t>
+              <w:t xml:space="preserve">Al iniciar sesión el sistema verifica la vigencia de la suscripción de la empresa. Si la prueba gratuita terminó sin pago, la empresa queda en SOLO LECTURA: el usuario abre Recursos, APU y Presupuestos, los consulta y los exporta, y cualquier acción que escriba se rechaza. Una suscripción pagada y vencida tiene dos días hábiles con todo funcionando; después queda suspendida y el usuario solo ve la pantalla de su suscripción, para pagar. Lo mismo ocurre con una cancelada pasada la fecha pagada (D-74). En los dos casos puede además exportar sus proyectos a PDF y Excel hasta que se eliminen (D-76).</w:t>
             </w:r>
           </w:p>
         </w:tc>
@@ -9026,7 +9026,7 @@
                 <w:sz w:val="18"/>
                 <w:szCs w:val="18"/>
               </w:rPr>
-              <w:t>RF-SAD-07</w:t>
+              <w:t xml:space="preserve">RF-SAD-07</w:t>
             </w:r>
           </w:p>
         </w:tc>
@@ -9054,7 +9054,7 @@
                 <w:szCs w:val="18"/>
                 <w:lang w:val="es-CO"/>
               </w:rPr>
-              <w:t>Gestión de suscripciones con estados En prueba, Activa y Cancelada. «Vencida» no es un estado almacenado sino una etiqueta que la interfaz deriva de la fecha de vencimiento (D-25): el corte de acceso es automático y por calendario, y la cancelación es una decisión comercial manual del superadministrador.</w:t>
+              <w:t xml:space="preserve">Gestión de suscripciones. La base guarda tres estados —En prueba, Activa y Cancelada— y de ellos y de las fechas deriva los seis que ven la empresa y el panel: En prueba, Vencida (la prueba terminada, en solo lectura), Activa, Por pagar (dentro de la gracia), Suspendida y Cancelada. Ningún proceso cambia estados: los calcula plataforma.fn_ciclo_suscripcion. Cancelan el Administrador de la empresa o el superadministrador; la prueba que no se paga se cancela sola (D-74, D-76).</w:t>
             </w:r>
           </w:p>
         </w:tc>
@@ -9506,8 +9506,7 @@
                 <w:sz w:val="18"/>
                 <w:szCs w:val="18"/>
               </w:rPr>
-              <w:lastRenderedPageBreak/>
-              <w:t>RF-SAD-15</w:t>
+              <w:t xml:space="preserve">RF-SAD-15</w:t>
             </w:r>
           </w:p>
         </w:tc>
@@ -9535,7 +9534,67 @@
                 <w:szCs w:val="18"/>
                 <w:lang w:val="es-CO"/>
               </w:rPr>
-              <w:t>Eliminar los datos de una empresa. Acción manual, deliberada y con justificación escrita. Es el único camino por el que se borran datos de un cliente: ningún proceso automático lo hace.</w:t>
+              <w:t xml:space="preserve">Eliminar los datos de una empresa. Acción manual, deliberada y con justificación escrita, disponible desde la fecha en que la empresa se puede eliminar. Es el único camino manual; el automático es la purga diaria de RF-SAD-13, que elimina solo los tres casos de D-74 y D-76: suspendida al vencer su plazo, cancelada sin reactivar y prueba sin pagar.</w:t>
+            </w:r>
+          </w:p>
+        </w:tc>
+      </w:tr>
+      <w:tr>
+        <w:trPr>
+          <w:cantSplit/>
+        </w:trPr>
+        <w:tc>
+          <w:tcPr>
+            <w:tcW w:w="1250" w:type="dxa"/>
+            <w:shd w:val="clear" w:color="auto" w:fill="auto"/>
+            <w:tcMar>
+              <w:top w:w="70" w:type="dxa"/>
+              <w:left w:w="110" w:type="dxa"/>
+              <w:bottom w:w="70" w:type="dxa"/>
+              <w:right w:w="110" w:type="dxa"/>
+            </w:tcMar>
+          </w:tcPr>
+          <w:p>
+            <w:pPr>
+              <w:spacing w:before="40" w:after="40"/>
+            </w:pPr>
+            <w:r>
+              <w:rPr>
+                <w:rFonts w:ascii="Consolas" w:eastAsia="Consolas" w:hAnsi="Consolas" w:cs="Consolas"/>
+                <w:b/>
+                <w:bCs/>
+                <w:sz w:val="18"/>
+                <w:szCs w:val="18"/>
+              </w:rPr>
+              <w:t xml:space="preserve">RF-SAD-19</w:t>
+            </w:r>
+          </w:p>
+        </w:tc>
+        <w:tc>
+          <w:tcPr>
+            <w:tcW w:w="6870" w:type="dxa"/>
+            <w:shd w:val="clear" w:color="auto" w:fill="auto"/>
+            <w:tcMar>
+              <w:top w:w="70" w:type="dxa"/>
+              <w:left w:w="110" w:type="dxa"/>
+              <w:bottom w:w="70" w:type="dxa"/>
+              <w:right w:w="110" w:type="dxa"/>
+            </w:tcMar>
+          </w:tcPr>
+          <w:p>
+            <w:pPr>
+              <w:spacing w:before="40" w:after="40"/>
+              <w:rPr>
+                <w:lang w:val="es-CO"/>
+              </w:rPr>
+            </w:pPr>
+            <w:r>
+              <w:rPr>
+                <w:sz w:val="18"/>
+                <w:szCs w:val="18"/>
+                <w:lang w:val="es-CO"/>
+              </w:rPr>
+              <w:t xml:space="preserve">Verificar los pagos que reportan las empresas: ver el comprobante, confirmarlo —marcando que el dinero está en la cuenta— o rechazarlo con un motivo que la empresa lee. Solo la confirmación mueve la suscripción (D-73). RF-SAD-16 a RF-SAD-18, los plazos, están en el documento 07.</w:t>
             </w:r>
           </w:p>
         </w:tc>
@@ -10538,6 +10597,126 @@
           </w:p>
         </w:tc>
       </w:tr>
+      <w:tr>
+        <w:trPr>
+          <w:cantSplit/>
+        </w:trPr>
+        <w:tc>
+          <w:tcPr>
+            <w:tcW w:w="1250" w:type="dxa"/>
+            <w:shd w:val="clear" w:color="auto" w:fill="auto"/>
+            <w:tcMar>
+              <w:top w:w="70" w:type="dxa"/>
+              <w:left w:w="110" w:type="dxa"/>
+              <w:bottom w:w="70" w:type="dxa"/>
+              <w:right w:w="110" w:type="dxa"/>
+            </w:tcMar>
+          </w:tcPr>
+          <w:p>
+            <w:pPr>
+              <w:spacing w:before="40" w:after="40"/>
+            </w:pPr>
+            <w:r>
+              <w:rPr>
+                <w:rFonts w:ascii="Consolas" w:eastAsia="Consolas" w:hAnsi="Consolas" w:cs="Consolas"/>
+                <w:b/>
+                <w:bCs/>
+                <w:sz w:val="18"/>
+                <w:szCs w:val="18"/>
+              </w:rPr>
+              <w:t xml:space="preserve">RF-REC-16</w:t>
+            </w:r>
+          </w:p>
+        </w:tc>
+        <w:tc>
+          <w:tcPr>
+            <w:tcW w:w="6870" w:type="dxa"/>
+            <w:shd w:val="clear" w:color="auto" w:fill="auto"/>
+            <w:tcMar>
+              <w:top w:w="70" w:type="dxa"/>
+              <w:left w:w="110" w:type="dxa"/>
+              <w:bottom w:w="70" w:type="dxa"/>
+              <w:right w:w="110" w:type="dxa"/>
+            </w:tcMar>
+          </w:tcPr>
+          <w:p>
+            <w:pPr>
+              <w:spacing w:before="40" w:after="40"/>
+              <w:rPr>
+                <w:lang w:val="es-CO"/>
+              </w:rPr>
+            </w:pPr>
+            <w:r>
+              <w:rPr>
+                <w:sz w:val="18"/>
+                <w:szCs w:val="18"/>
+                <w:lang w:val="es-CO"/>
+              </w:rPr>
+              <w:t xml:space="preserve">Importación de recursos desde Excel: plantilla descargable con los tipos y las unidades de la empresa, todo o nada, y un informe de errores por hoja, fila y columna. Solo crea; nunca edita un recurso existente (decisión del dueño, 6 de octubre de 2026; 02 §5.5).</w:t>
+            </w:r>
+          </w:p>
+        </w:tc>
+      </w:tr>
+      <w:tr>
+        <w:trPr>
+          <w:cantSplit/>
+        </w:trPr>
+        <w:tc>
+          <w:tcPr>
+            <w:tcW w:w="1250" w:type="dxa"/>
+            <w:shd w:val="clear" w:color="auto" w:fill="auto"/>
+            <w:tcMar>
+              <w:top w:w="70" w:type="dxa"/>
+              <w:left w:w="110" w:type="dxa"/>
+              <w:bottom w:w="70" w:type="dxa"/>
+              <w:right w:w="110" w:type="dxa"/>
+            </w:tcMar>
+          </w:tcPr>
+          <w:p>
+            <w:pPr>
+              <w:spacing w:before="40" w:after="40"/>
+            </w:pPr>
+            <w:r>
+              <w:rPr>
+                <w:rFonts w:ascii="Consolas" w:eastAsia="Consolas" w:hAnsi="Consolas" w:cs="Consolas"/>
+                <w:b/>
+                <w:bCs/>
+                <w:sz w:val="18"/>
+                <w:szCs w:val="18"/>
+              </w:rPr>
+              <w:t xml:space="preserve">RF-REC-17</w:t>
+            </w:r>
+          </w:p>
+        </w:tc>
+        <w:tc>
+          <w:tcPr>
+            <w:tcW w:w="6870" w:type="dxa"/>
+            <w:shd w:val="clear" w:color="auto" w:fill="auto"/>
+            <w:tcMar>
+              <w:top w:w="70" w:type="dxa"/>
+              <w:left w:w="110" w:type="dxa"/>
+              <w:bottom w:w="70" w:type="dxa"/>
+              <w:right w:w="110" w:type="dxa"/>
+            </w:tcMar>
+          </w:tcPr>
+          <w:p>
+            <w:pPr>
+              <w:spacing w:before="40" w:after="40"/>
+              <w:rPr>
+                <w:lang w:val="es-CO"/>
+              </w:rPr>
+            </w:pPr>
+            <w:r>
+              <w:rPr>
+                <w:sz w:val="18"/>
+                <w:szCs w:val="18"/>
+                <w:lang w:val="es-CO"/>
+              </w:rPr>
+              <w:t xml:space="preserve">El nombre de un recurso no se repite en la empresa, sin distinguir mayúsculas ni espacios de los bordes, al crear, editar e importar. La base lo garantiza con un índice único (decisión del dueño, 7 de octubre de 2026; D-71).</w:t>
+            </w:r>
+          </w:p>
+        </w:tc>
+      </w:tr>
     </w:tbl>
     <w:p>
       <w:pPr>
@@ -11969,6 +12148,126 @@
           </w:p>
         </w:tc>
       </w:tr>
+      <w:tr>
+        <w:trPr>
+          <w:cantSplit/>
+        </w:trPr>
+        <w:tc>
+          <w:tcPr>
+            <w:tcW w:w="1250" w:type="dxa"/>
+            <w:shd w:val="clear" w:color="auto" w:fill="auto"/>
+            <w:tcMar>
+              <w:top w:w="70" w:type="dxa"/>
+              <w:left w:w="110" w:type="dxa"/>
+              <w:bottom w:w="70" w:type="dxa"/>
+              <w:right w:w="110" w:type="dxa"/>
+            </w:tcMar>
+          </w:tcPr>
+          <w:p>
+            <w:pPr>
+              <w:spacing w:before="40" w:after="40"/>
+            </w:pPr>
+            <w:r>
+              <w:rPr>
+                <w:rFonts w:ascii="Consolas" w:eastAsia="Consolas" w:hAnsi="Consolas" w:cs="Consolas"/>
+                <w:b/>
+                <w:bCs/>
+                <w:sz w:val="18"/>
+                <w:szCs w:val="18"/>
+              </w:rPr>
+              <w:t xml:space="preserve">RF-APU-23</w:t>
+            </w:r>
+          </w:p>
+        </w:tc>
+        <w:tc>
+          <w:tcPr>
+            <w:tcW w:w="6870" w:type="dxa"/>
+            <w:shd w:val="clear" w:color="auto" w:fill="auto"/>
+            <w:tcMar>
+              <w:top w:w="70" w:type="dxa"/>
+              <w:left w:w="110" w:type="dxa"/>
+              <w:bottom w:w="70" w:type="dxa"/>
+              <w:right w:w="110" w:type="dxa"/>
+            </w:tcMar>
+          </w:tcPr>
+          <w:p>
+            <w:pPr>
+              <w:spacing w:before="40" w:after="40"/>
+              <w:rPr>
+                <w:lang w:val="es-CO"/>
+              </w:rPr>
+            </w:pPr>
+            <w:r>
+              <w:rPr>
+                <w:sz w:val="18"/>
+                <w:szCs w:val="18"/>
+                <w:lang w:val="es-CO"/>
+              </w:rPr>
+              <w:t xml:space="preserve">Importación de APU desde Excel con la misma regla que RF-REC-16: una hoja de APU, una de composición con el código de cada recurso y una de consulta con el catálogo vigente. Los recursos tienen que existir antes (02 §6.6).</w:t>
+            </w:r>
+          </w:p>
+        </w:tc>
+      </w:tr>
+      <w:tr>
+        <w:trPr>
+          <w:cantSplit/>
+        </w:trPr>
+        <w:tc>
+          <w:tcPr>
+            <w:tcW w:w="1250" w:type="dxa"/>
+            <w:shd w:val="clear" w:color="auto" w:fill="auto"/>
+            <w:tcMar>
+              <w:top w:w="70" w:type="dxa"/>
+              <w:left w:w="110" w:type="dxa"/>
+              <w:bottom w:w="70" w:type="dxa"/>
+              <w:right w:w="110" w:type="dxa"/>
+            </w:tcMar>
+          </w:tcPr>
+          <w:p>
+            <w:pPr>
+              <w:spacing w:before="40" w:after="40"/>
+            </w:pPr>
+            <w:r>
+              <w:rPr>
+                <w:rFonts w:ascii="Consolas" w:eastAsia="Consolas" w:hAnsi="Consolas" w:cs="Consolas"/>
+                <w:b/>
+                <w:bCs/>
+                <w:sz w:val="18"/>
+                <w:szCs w:val="18"/>
+              </w:rPr>
+              <w:t xml:space="preserve">RF-APU-24</w:t>
+            </w:r>
+          </w:p>
+        </w:tc>
+        <w:tc>
+          <w:tcPr>
+            <w:tcW w:w="6870" w:type="dxa"/>
+            <w:shd w:val="clear" w:color="auto" w:fill="auto"/>
+            <w:tcMar>
+              <w:top w:w="70" w:type="dxa"/>
+              <w:left w:w="110" w:type="dxa"/>
+              <w:bottom w:w="70" w:type="dxa"/>
+              <w:right w:w="110" w:type="dxa"/>
+            </w:tcMar>
+          </w:tcPr>
+          <w:p>
+            <w:pPr>
+              <w:spacing w:before="40" w:after="40"/>
+              <w:rPr>
+                <w:lang w:val="es-CO"/>
+              </w:rPr>
+            </w:pPr>
+            <w:r>
+              <w:rPr>
+                <w:sz w:val="18"/>
+                <w:szCs w:val="18"/>
+                <w:lang w:val="es-CO"/>
+              </w:rPr>
+              <w:t xml:space="preserve">El nombre de un APU no se repite en la empresa, con la misma regla que RF-REC-17 (decisión del dueño, 8 de octubre de 2026; D-71).</w:t>
+            </w:r>
+          </w:p>
+        </w:tc>
+      </w:tr>
     </w:tbl>
     <w:p>
       <w:pPr>
@@ -12759,7 +13058,7 @@
                 <w:sz w:val="18"/>
                 <w:szCs w:val="18"/>
               </w:rPr>
-              <w:t>RF-PRE-12</w:t>
+              <w:t xml:space="preserve">RF-PRE-12</w:t>
             </w:r>
           </w:p>
         </w:tc>
@@ -12787,7 +13086,7 @@
                 <w:szCs w:val="18"/>
                 <w:lang w:val="es-CO"/>
               </w:rPr>
-              <w:t>Numeración automática que deriva la base del propio árbol: el capítulo es 1.0, sus hijos 1.1, 1.2, 1.3 y los hijos de un subcapítulo 1.1.1, 1.1.2. Capítulos y actividades comparten el contador de su padre, que es lo que permite que una actividad cuelgue del capítulo sin chocar con los subcapítulos. El usuario nunca la escribe.</w:t>
+              <w:t xml:space="preserve">Numeración automática que deriva la base del propio árbol. Bajo un mismo padre van primero los subcapítulos y después las actividades, con un contador compartido. El capítulo se numera 1, 2, 3 y el subcapítulo 1.1, 1.1.1; los ceros a la izquierda solo igualan el ancho de un nivel cuando tiene diez o más (01 … 12). El usuario nunca la escribe (D-75, 13 de octubre de 2026).</w:t>
             </w:r>
           </w:p>
         </w:tc>
@@ -13119,7 +13418,7 @@
                 <w:sz w:val="18"/>
                 <w:szCs w:val="18"/>
               </w:rPr>
-              <w:t>RF-PRE-18</w:t>
+              <w:t xml:space="preserve">RF-PRE-18</w:t>
             </w:r>
           </w:p>
         </w:tc>
@@ -13147,7 +13446,7 @@
                 <w:szCs w:val="18"/>
                 <w:lang w:val="es-CO"/>
               </w:rPr>
-              <w:t>Columnas por actividad: número de ítem (1.1, 1.2.3), código del APU, descripción, unidad, cantidad editable, precio unitario (del APU, no editable) y costo total automático. El número de ítem ordena la oferta; el código del APU dice de qué análisis salió el precio y se repite si la misma actividad aparece en dos capítulos.</w:t>
+              <w:t xml:space="preserve">Columnas por actividad: código del APU, descripción, unidad, cantidad editable, precio unitario (del APU, no editable) y costo total automático. La actividad no lleva número jerárquico: la identifica el código de su APU, que se repite si la misma actividad aparece en dos capítulos, y el bloque en que está dice a qué capítulo pertenece (D-75).</w:t>
             </w:r>
           </w:p>
         </w:tc>
@@ -14621,7 +14920,7 @@
                 <w:sz w:val="18"/>
                 <w:szCs w:val="18"/>
               </w:rPr>
-              <w:t>RF-PRE-45</w:t>
+              <w:t xml:space="preserve">RF-PRE-45</w:t>
             </w:r>
           </w:p>
         </w:tc>
@@ -14649,7 +14948,7 @@
                 <w:szCs w:val="18"/>
                 <w:lang w:val="es-CO"/>
               </w:rPr>
-              <w:t>Cada actividad lleva su número de ítem dentro del presupuesto —1.1 si cuelga del capítulo 1.0, 1.2.3 si cuelga del subcapítulo 1.2—, visible en la mesa de trabajo y en las dos exportaciones. Lo deriva la base al agregar, mover, reordenar o eliminar cualquier nivel; no lo escribe el usuario ni la aplicación.</w:t>
+              <w:t xml:space="preserve">Cada actividad tiene un número interno dentro del presupuesto —el de su padre más su lugar—, que la base deriva al agregar, mover, reordenar o eliminar cualquier nivel y que fija el orden de la oferta. No se muestra: en la mesa de trabajo y en las exportaciones la actividad se lee con el código de su APU (D-75).</w:t>
             </w:r>
           </w:p>
         </w:tc>
@@ -16115,7 +16414,7 @@
                 <w:sz w:val="18"/>
                 <w:szCs w:val="18"/>
               </w:rPr>
-              <w:t>RF-CFG-06</w:t>
+              <w:t xml:space="preserve">RF-CFG-06</w:t>
             </w:r>
           </w:p>
         </w:tc>
@@ -16143,7 +16442,7 @@
                 <w:szCs w:val="18"/>
                 <w:lang w:val="es-CO"/>
               </w:rPr>
-              <w:t>Pestaña Suscripción: plan activo, estado (En prueba, Activa, Vencida o Cancelada; «Vencida» se deriva de la fecha, no es un estado guardado), fecha de vencimiento y días restantes. Si está en prueba, indica cuántos días quedan y cómo pagar.</w:t>
+              <w:t xml:space="preserve">Pestaña Suscripción: plan activo, estado (En prueba, Vencida, Activa, Por pagar, Suspendida o Cancelada, derivado de las fechas; D-74, D-76), fecha de vencimiento, días restantes y los plazos vigentes (RF-CFG-26, documento 07). Si está en prueba, indica cuántos días quedan y cómo pagar.</w:t>
             </w:r>
           </w:p>
         </w:tc>
@@ -17229,6 +17528,126 @@
                 <w:lang w:val="es-CO"/>
               </w:rPr>
               <w:t>Dentro de un módulo que tenga permiso de consulta propio —Recursos, APU, Presupuestos y Avance— ninguna otra acción puede otorgarse sin él: para marcar Crear, Editar, Eliminar, Exportar, Duplicar o Registrar hay que marcar antes Ver. Quitar Ver deja de ser posible mientras el rol conserve otra acción del mismo módulo. Lo comprueba la base de datos al confirmar la transacción, de modo que el orden en que se marquen no importa.</w:t>
+            </w:r>
+          </w:p>
+        </w:tc>
+      </w:tr>
+      <w:tr>
+        <w:trPr>
+          <w:cantSplit/>
+        </w:trPr>
+        <w:tc>
+          <w:tcPr>
+            <w:tcW w:w="1250" w:type="dxa"/>
+            <w:shd w:val="clear" w:color="auto" w:fill="auto"/>
+            <w:tcMar>
+              <w:top w:w="70" w:type="dxa"/>
+              <w:left w:w="110" w:type="dxa"/>
+              <w:bottom w:w="70" w:type="dxa"/>
+              <w:right w:w="110" w:type="dxa"/>
+            </w:tcMar>
+          </w:tcPr>
+          <w:p>
+            <w:pPr>
+              <w:spacing w:before="40" w:after="40"/>
+            </w:pPr>
+            <w:r>
+              <w:rPr>
+                <w:rFonts w:ascii="Consolas" w:eastAsia="Consolas" w:hAnsi="Consolas" w:cs="Consolas"/>
+                <w:b/>
+                <w:bCs/>
+                <w:sz w:val="18"/>
+                <w:szCs w:val="18"/>
+              </w:rPr>
+              <w:t xml:space="preserve">RF-CFG-30</w:t>
+            </w:r>
+          </w:p>
+        </w:tc>
+        <w:tc>
+          <w:tcPr>
+            <w:tcW w:w="6870" w:type="dxa"/>
+            <w:shd w:val="clear" w:color="auto" w:fill="auto"/>
+            <w:tcMar>
+              <w:top w:w="70" w:type="dxa"/>
+              <w:left w:w="110" w:type="dxa"/>
+              <w:bottom w:w="70" w:type="dxa"/>
+              <w:right w:w="110" w:type="dxa"/>
+            </w:tcMar>
+          </w:tcPr>
+          <w:p>
+            <w:pPr>
+              <w:spacing w:before="40" w:after="40"/>
+              <w:rPr>
+                <w:lang w:val="es-CO"/>
+              </w:rPr>
+            </w:pPr>
+            <w:r>
+              <w:rPr>
+                <w:sz w:val="18"/>
+                <w:szCs w:val="18"/>
+                <w:lang w:val="es-CO"/>
+              </w:rPr>
+              <w:t xml:space="preserve">Reportar un pago desde la pestaña Suscripción: monto, fecha, medio, referencia, meses y comprobante obligatorio. Lo ven el Administrador y quien tenga el permiso de suscripción, también con la cuenta vencida o suspendida. Reportar no da acceso: el pago queda en verificación hasta que el superadministrador lo confirma (D-73).</w:t>
+            </w:r>
+          </w:p>
+        </w:tc>
+      </w:tr>
+      <w:tr>
+        <w:trPr>
+          <w:cantSplit/>
+        </w:trPr>
+        <w:tc>
+          <w:tcPr>
+            <w:tcW w:w="1250" w:type="dxa"/>
+            <w:shd w:val="clear" w:color="auto" w:fill="auto"/>
+            <w:tcMar>
+              <w:top w:w="70" w:type="dxa"/>
+              <w:left w:w="110" w:type="dxa"/>
+              <w:bottom w:w="70" w:type="dxa"/>
+              <w:right w:w="110" w:type="dxa"/>
+            </w:tcMar>
+          </w:tcPr>
+          <w:p>
+            <w:pPr>
+              <w:spacing w:before="40" w:after="40"/>
+            </w:pPr>
+            <w:r>
+              <w:rPr>
+                <w:rFonts w:ascii="Consolas" w:eastAsia="Consolas" w:hAnsi="Consolas" w:cs="Consolas"/>
+                <w:b/>
+                <w:bCs/>
+                <w:sz w:val="18"/>
+                <w:szCs w:val="18"/>
+              </w:rPr>
+              <w:t xml:space="preserve">RF-CFG-31</w:t>
+            </w:r>
+          </w:p>
+        </w:tc>
+        <w:tc>
+          <w:tcPr>
+            <w:tcW w:w="6870" w:type="dxa"/>
+            <w:shd w:val="clear" w:color="auto" w:fill="auto"/>
+            <w:tcMar>
+              <w:top w:w="70" w:type="dxa"/>
+              <w:left w:w="110" w:type="dxa"/>
+              <w:bottom w:w="70" w:type="dxa"/>
+              <w:right w:w="110" w:type="dxa"/>
+            </w:tcMar>
+          </w:tcPr>
+          <w:p>
+            <w:pPr>
+              <w:spacing w:before="40" w:after="40"/>
+              <w:rPr>
+                <w:lang w:val="es-CO"/>
+              </w:rPr>
+            </w:pPr>
+            <w:r>
+              <w:rPr>
+                <w:sz w:val="18"/>
+                <w:szCs w:val="18"/>
+                <w:lang w:val="es-CO"/>
+              </w:rPr>
+              <w:t xml:space="preserve">Cancelar la suscripción, solo el Administrador, con motivo. La cuenta funciona hasta la fecha pagada y se puede reanudar sin pagar antes de esa fecha; después hay 10 días para reactivarla reportando un pago, y luego los datos se eliminan (D-74).</w:t>
             </w:r>
           </w:p>
         </w:tc>
@@ -19196,7 +19615,7 @@
         <w:rPr>
           <w:lang w:val="es-CO"/>
         </w:rPr>
-        <w:t xml:space="preserve">Cuarenta y nueve decisiones de diseño gobiernan el MVP; las seis últimas salieron de una auditoría externa del esquema y se leen juntas al final de esta sección. Tres de ellas —D-12, D-23 y la propia D-43— quedan reservadas: describen el control de avance físico, que sale del MVP y vuelve en la fase 2. Se conservan con su número, y las reglas RN-12, RN-13 y RN-19 dejan su hueco por la misma razón: renumerar rompería las referencias cruzadas de los demás documentos. Están cerradas: no se reabren durante el desarrollo, y ninguna parte del sistema puede contradecirlas. Cada una se enuncia con su motivo, porque en dos años nadie va a recordar por qué la fórmula es la que es, y un desarrollador que no entiende el motivo de una regla termina "arreglándola".</w:t>
+        <w:t xml:space="preserve">Setenta y seis decisiones de diseño gobiernan el MVP. Las de D-44 a D-49 salieron de una auditoría externa del esquema; las de D-50 a D-77 son posteriores a ella y van al final de esta sección. Tres —D-12, D-23 y la propia D-43— quedan reservadas: describen el control de avance físico, que sale del MVP y vuelve en la fase 2. Se conservan con su número, y las reglas RN-12, RN-13 y RN-19 dejan su hueco por la misma razón: renumerar rompería las referencias cruzadas de los demás documentos. Están cerradas: solo las cambia otra decisión del dueño, con número propio, que dice cuál cambia; la decisión cambiada conserva su motivo y una nota con lo que rige. Cada una se enuncia con su motivo, porque en dos años nadie va a recordar por qué la fórmula es la que es, y un desarrollador que no entiende el motivo de una regla termina "arreglándola".</w:t>
       </w:r>
     </w:p>
     <w:p>
@@ -19210,7 +19629,7 @@
         <w:rPr>
           <w:lang w:val="es-CO"/>
         </w:rPr>
-        <w:t>La numeración va de D-1 a D-49 sin el D-10, que no existe. Se mantiene la numeración original para que las referencias cruzadas del esquema y de la guía de interfaz sigan apuntando a la misma decisión.</w:t>
+        <w:t xml:space="preserve">La numeración va de D-1 a D-77 sin el D-10, que no existe. Se mantiene la numeración original para que las referencias cruzadas del esquema y de la guía de interfaz sigan apuntando a la misma decisión. Desde la D-78, cada decisión vive en su migración y en el documento 07.</w:t>
       </w:r>
     </w:p>
     <w:p>
@@ -21200,6 +21619,29 @@
         <w:t>Dos días antes del vencimiento el sistema avisa por correo, para que el cliente decida a tiempo. Al vencer sin pago, el acceso se corta: el usuario puede iniciar sesión pero no abrir Recursos, APU ni Presupuestos.</w:t>
       </w:r>
     </w:p>
+    <w:p>
+      <w:pPr>
+        <w:spacing w:after="120" w:line="276" w:lineRule="auto"/>
+        <w:jc w:val="both"/>
+        <w:rPr>
+          <w:lang w:val="es-CO"/>
+        </w:rPr>
+      </w:pPr>
+      <w:r>
+        <w:rPr>
+          <w:b/>
+          <w:bCs/>
+          <w:lang w:val="es-CO"/>
+        </w:rPr>
+        <w:t xml:space="preserve">Nota del 16 de octubre de 2026.</w:t>
+      </w:r>
+      <w:r>
+        <w:rPr>
+          <w:lang w:val="es-CO"/>
+        </w:rPr>
+        <w:t xml:space="preserve"> Cambiada por D-65 (la prueba vencida queda en solo lectura, no bloqueada), por D-74 (la cuenta pagada que deja de pagar ya no conserva sus datos para siempre) y por D-76 (la prueba sin pagar se cancela y se elimina sola a los 10 días).</w:t>
+      </w:r>
+    </w:p>
     <w:tbl>
       <w:tblPr>
         <w:tblW w:w="9020" w:type="dxa"/>
@@ -21273,7 +21715,7 @@
                 <w:sz w:val="19"/>
                 <w:lang w:val="es-CO"/>
               </w:rPr>
-              <w:t xml:space="preserve">Una empresa que agota la prueba sin pagar nunca llegó a ser cliente. Sus datos se conservan 10 días por si se decide, y a partir de ahí el superadministrador puede eliminarlos desde el panel. Esa eliminación es siempre manual y deliberada, nunca un proceso automático: borrar el trabajo de alguien no debe poder ocurrir por un error de programación.</w:t>
+              <w:t xml:space="preserve">Una empresa que agota los 15 días de prueba sin pagar nunca llegó a ser cliente. Tiene 10 días de solo lectura para decidir: consulta, exporta y paga desde la suscripción. Si no paga, la prueba queda cancelada y la purga diaria elimina sus datos ese mismo día. Hasta el 13 de octubre de 2026 la eliminación era manual; la cambió el dueño ese día (D-76).</w:t>
             </w:r>
           </w:p>
         </w:tc>
@@ -23585,6 +24027,29 @@
     </w:p>
     <w:p>
       <w:pPr>
+        <w:spacing w:after="120" w:line="276" w:lineRule="auto"/>
+        <w:jc w:val="both"/>
+        <w:rPr>
+          <w:lang w:val="es-CO"/>
+        </w:rPr>
+      </w:pPr>
+      <w:r>
+        <w:rPr>
+          <w:b/>
+          <w:bCs/>
+          <w:lang w:val="es-CO"/>
+        </w:rPr>
+        <w:t xml:space="preserve">Nota del 16 de octubre de 2026.</w:t>
+      </w:r>
+      <w:r>
+        <w:rPr>
+          <w:lang w:val="es-CO"/>
+        </w:rPr>
+        <w:t xml:space="preserve"> Cambiada por D-74 y D-76. El estado y el acceso los calcula plataforma.fn_ciclo_suscripcion a partir de las fechas: hay seis estados visibles, entre ellos «Vencida» para la prueba en solo lectura. La cancelación la hacen la empresa o el superadministrador, y la prueba que no se paga se cancela sola. Con la cuenta suspendida, la empresa solo ve la suscripción y puede exportar.</w:t>
+      </w:r>
+    </w:p>
+    <w:p>
+      <w:pPr>
         <w:pStyle w:val="Ttulo2"/>
         <w:spacing w:after="120"/>
         <w:rPr>
@@ -24087,6 +24552,29 @@
     </w:tbl>
     <w:p>
       <w:pPr>
+        <w:spacing w:after="120" w:line="276" w:lineRule="auto"/>
+        <w:jc w:val="both"/>
+        <w:rPr>
+          <w:lang w:val="es-CO"/>
+        </w:rPr>
+      </w:pPr>
+      <w:r>
+        <w:rPr>
+          <w:b/>
+          <w:bCs/>
+          <w:lang w:val="es-CO"/>
+        </w:rPr>
+        <w:t xml:space="preserve">Nota del 16 de octubre de 2026.</w:t>
+      </w:r>
+      <w:r>
+        <w:rPr>
+          <w:lang w:val="es-CO"/>
+        </w:rPr>
+        <w:t xml:space="preserve"> Mientras no haya almacenamiento contratado, el logo y los comprobantes viven en la base (D-71, 9 de octubre de 2026); cuando exista, se migran una sola vez.</w:t>
+      </w:r>
+    </w:p>
+    <w:p>
+      <w:pPr>
         <w:pStyle w:val="Ttulo2"/>
         <w:spacing w:after="120"/>
         <w:rPr>
@@ -24813,6 +25301,29 @@
     </w:p>
     <w:p>
       <w:pPr>
+        <w:spacing w:after="120" w:line="276" w:lineRule="auto"/>
+        <w:jc w:val="both"/>
+        <w:rPr>
+          <w:lang w:val="es-CO"/>
+        </w:rPr>
+      </w:pPr>
+      <w:r>
+        <w:rPr>
+          <w:b/>
+          <w:bCs/>
+          <w:lang w:val="es-CO"/>
+        </w:rPr>
+        <w:t xml:space="preserve">Nota del 16 de octubre de 2026.</w:t>
+      </w:r>
+      <w:r>
+        <w:rPr>
+          <w:lang w:val="es-CO"/>
+        </w:rPr>
+        <w:t xml:space="preserve"> La numeración cambió con D-75: el capítulo pierde el «.0», los subcapítulos van antes que las actividades y la actividad se identifica con el código de su APU.</w:t>
+      </w:r>
+    </w:p>
+    <w:p>
+      <w:pPr>
         <w:pStyle w:val="Ttulo2"/>
         <w:spacing w:after="120"/>
         <w:rPr>
@@ -25291,6 +25802,986 @@
           <w:lang w:val="es-CO"/>
         </w:rPr>
         <w:t>Para que no dependa de que alguien se acuerde, queda escrito el punto de disparo: cuando el historial pase de cincuenta millones de filas o de 25 GB con sus índices, se parte por fecha. El esquema trae la consulta para mirarlo; conviene hacerlo una vez al trimestre. Es una consulta, no un proyecto.</w:t>
+      </w:r>
+    </w:p>
+    <w:p>
+      <w:pPr>
+        <w:pStyle w:val="Ttulo2"/>
+        <w:spacing w:before="300" w:after="120"/>
+        <w:rPr>
+          <w:lang w:val="es-CO"/>
+        </w:rPr>
+      </w:pPr>
+      <w:r>
+        <w:rPr>
+          <w:b/>
+          <w:bCs/>
+          <w:color w:val="1F2933"/>
+          <w:sz w:val="23"/>
+          <w:szCs w:val="23"/>
+          <w:lang w:val="es-CO"/>
+        </w:rPr>
+        <w:t xml:space="preserve">D-50 · Nadie puede vestirse del rol dueño de la autenticación</w:t>
+      </w:r>
+    </w:p>
+    <w:p>
+      <w:pPr>
+        <w:spacing w:after="120" w:line="276" w:lineRule="auto"/>
+        <w:jc w:val="both"/>
+        <w:rPr>
+          <w:lang w:val="es-CO"/>
+        </w:rPr>
+      </w:pPr>
+      <w:r>
+        <w:rPr>
+          <w:lang w:val="es-CO"/>
+        </w:rPr>
+        <w:t xml:space="preserve">La conexión de ingreso es miembro de un rol que solo ejecuta las dos funciones de autenticación, y el rol dueño de esas funciones no se le concede a nadie: ser miembro de él permitía SET ROLE y leer los hashes de contraseña de toda la plataforma. No lo encontró la auditoría; apareció al revisar el modelo de conexiones y la escalada se reprodujo entera antes de cerrarla. El 27 de septiembre de 2026 el detector app.fn_verificar_roles_login() se amplió para ver también un rol de conexión creado con BYPASSRLS, que no era miembro de nada y leía todas las empresas.</w:t>
+      </w:r>
+    </w:p>
+    <w:p>
+      <w:pPr>
+        <w:pStyle w:val="Ttulo2"/>
+        <w:spacing w:before="300" w:after="120"/>
+        <w:rPr>
+          <w:lang w:val="es-CO"/>
+        </w:rPr>
+      </w:pPr>
+      <w:r>
+        <w:rPr>
+          <w:b/>
+          <w:bCs/>
+          <w:color w:val="1F2933"/>
+          <w:sz w:val="23"/>
+          <w:szCs w:val="23"/>
+          <w:lang w:val="es-CO"/>
+        </w:rPr>
+        <w:t xml:space="preserve">D-51 · El alta de una empresa devuelve lo que crea</w:t>
+      </w:r>
+    </w:p>
+    <w:p>
+      <w:pPr>
+        <w:spacing w:after="120" w:line="276" w:lineRule="auto"/>
+        <w:jc w:val="both"/>
+        <w:rPr>
+          <w:lang w:val="es-CO"/>
+        </w:rPr>
+      </w:pPr>
+      <w:r>
+        <w:rPr>
+          <w:lang w:val="es-CO"/>
+        </w:rPr>
+        <w:t xml:space="preserve">fn_alta_tenant devuelve el inquilino, el administrador y su rol. Antes devolvía solo el inquilino, y la única forma de recuperar al administrador era pedir la autenticación por correo, justo la puerta que D-46 acababa de estrechar. No amplía lo que nadie puede leer: devuelve los identificadores de las filas que ella misma acaba de crear.</w:t>
+      </w:r>
+    </w:p>
+    <w:p>
+      <w:pPr>
+        <w:pStyle w:val="Ttulo2"/>
+        <w:spacing w:before="300" w:after="120"/>
+        <w:rPr>
+          <w:lang w:val="es-CO"/>
+        </w:rPr>
+      </w:pPr>
+      <w:r>
+        <w:rPr>
+          <w:b/>
+          <w:bCs/>
+          <w:color w:val="1F2933"/>
+          <w:sz w:val="23"/>
+          <w:szCs w:val="23"/>
+          <w:lang w:val="es-CO"/>
+        </w:rPr>
+        <w:t xml:space="preserve">D-52 · El permiso de cada acción lo comprueba la base en cada petición</w:t>
+      </w:r>
+    </w:p>
+    <w:p>
+      <w:pPr>
+        <w:spacing w:after="120" w:line="276" w:lineRule="auto"/>
+        <w:jc w:val="both"/>
+        <w:rPr>
+          <w:lang w:val="es-CO"/>
+        </w:rPr>
+      </w:pPr>
+      <w:r>
+        <w:rPr>
+          <w:lang w:val="es-CO"/>
+        </w:rPr>
+        <w:t xml:space="preserve">app.fn_exigir_permiso comprueba, en cada petición, que el rol del usuario tenga la acción que pide. No vuelve a exigir el Ver del módulo porque la coherencia del rol ya la garantiza la base al guardarlo: dos copias de una regla son dos verdades que algún día discrepan.</w:t>
+      </w:r>
+    </w:p>
+    <w:p>
+      <w:pPr>
+        <w:pStyle w:val="Ttulo2"/>
+        <w:spacing w:before="300" w:after="120"/>
+        <w:rPr>
+          <w:lang w:val="es-CO"/>
+        </w:rPr>
+      </w:pPr>
+      <w:r>
+        <w:rPr>
+          <w:b/>
+          <w:bCs/>
+          <w:color w:val="1F2933"/>
+          <w:sz w:val="23"/>
+          <w:szCs w:val="23"/>
+          <w:lang w:val="es-CO"/>
+        </w:rPr>
+        <w:t xml:space="preserve">D-53 · Reapuntar un presupuesto a la versión vigente de un APU es una sola función</w:t>
+      </w:r>
+    </w:p>
+    <w:p>
+      <w:pPr>
+        <w:spacing w:after="120" w:line="276" w:lineRule="auto"/>
+        <w:jc w:val="both"/>
+        <w:rPr>
+          <w:lang w:val="es-CO"/>
+        </w:rPr>
+      </w:pPr>
+      <w:r>
+        <w:rPr>
+          <w:lang w:val="es-CO"/>
+        </w:rPr>
+        <w:t xml:space="preserve">app.fn_reapuntar_apu la usan la propagación de un recurso y la edición manual de un APU. La alternativa era reescribir el redondeo a seis decimales en el backend, y dos copias de una fórmula monetaria se separan el día que alguien toca una. Siempre apunta a la vigente: aceptar una versión permitiría reapuntar a una histórica. En la misma tanda, la búsqueda de recursos y APU encuentra también por código.</w:t>
+      </w:r>
+    </w:p>
+    <w:p>
+      <w:pPr>
+        <w:pStyle w:val="Ttulo2"/>
+        <w:spacing w:before="300" w:after="120"/>
+        <w:rPr>
+          <w:lang w:val="es-CO"/>
+        </w:rPr>
+      </w:pPr>
+      <w:r>
+        <w:rPr>
+          <w:b/>
+          <w:bCs/>
+          <w:color w:val="1F2933"/>
+          <w:sz w:val="23"/>
+          <w:szCs w:val="23"/>
+          <w:lang w:val="es-CO"/>
+        </w:rPr>
+        <w:t xml:space="preserve">D-54 · El esquema se niega a cargar si una función privilegiada quedó mal asegurada</w:t>
+      </w:r>
+    </w:p>
+    <w:p>
+      <w:pPr>
+        <w:spacing w:after="120" w:line="276" w:lineRule="auto"/>
+        <w:jc w:val="both"/>
+        <w:rPr>
+          <w:lang w:val="es-CO"/>
+        </w:rPr>
+      </w:pPr>
+      <w:r>
+        <w:rPr>
+          <w:lang w:val="es-CO"/>
+        </w:rPr>
+        <w:t xml:space="preserve">Ninguna función SECURITY DEFINER corre como superusuario ni la puede ejecutar cualquiera, y app.fn_verificar_funciones() lo comprueba en cada instalación. Nació de un error real: una función de D-53 quedó a nombre del superusuario y ejecutable por todos, el esquema cargaba y las pruebas daban verde. Lo encontró una persona leyendo el catálogo a mano.</w:t>
+      </w:r>
+    </w:p>
+    <w:p>
+      <w:pPr>
+        <w:pStyle w:val="Ttulo2"/>
+        <w:spacing w:before="300" w:after="120"/>
+        <w:rPr>
+          <w:lang w:val="es-CO"/>
+        </w:rPr>
+      </w:pPr>
+      <w:r>
+        <w:rPr>
+          <w:b/>
+          <w:bCs/>
+          <w:color w:val="1F2933"/>
+          <w:sz w:val="23"/>
+          <w:szCs w:val="23"/>
+          <w:lang w:val="es-CO"/>
+        </w:rPr>
+        <w:t xml:space="preserve">D-55 · La base deriva el nivel y el orden de la estructura</w:t>
+      </w:r>
+    </w:p>
+    <w:p>
+      <w:pPr>
+        <w:spacing w:after="120" w:line="276" w:lineRule="auto"/>
+        <w:jc w:val="both"/>
+        <w:rPr>
+          <w:lang w:val="es-CO"/>
+        </w:rPr>
+      </w:pPr>
+      <w:r>
+        <w:rPr>
+          <w:lang w:val="es-CO"/>
+        </w:rPr>
+        <w:t xml:space="preserve">Calcular «agregar al final» en la aplicación es una carrera entre dos usuarios, y su caso feo es el empate silencioso de dos capítulos. El orden se calcula después de bloquear el presupuesto. El código del capítulo deja de ser obligatorio al insertar, porque obligaba a inventar un código provisional: un dato falso durante toda la transacción.</w:t>
+      </w:r>
+    </w:p>
+    <w:p>
+      <w:pPr>
+        <w:pStyle w:val="Ttulo2"/>
+        <w:spacing w:before="300" w:after="120"/>
+        <w:rPr>
+          <w:lang w:val="es-CO"/>
+        </w:rPr>
+      </w:pPr>
+      <w:r>
+        <w:rPr>
+          <w:b/>
+          <w:bCs/>
+          <w:color w:val="1F2933"/>
+          <w:sz w:val="23"/>
+          <w:szCs w:val="23"/>
+          <w:lang w:val="es-CO"/>
+        </w:rPr>
+        <w:t xml:space="preserve">D-56 · Reordenar pasa por una sola función, con la posición absoluta</w:t>
+      </w:r>
+    </w:p>
+    <w:p>
+      <w:pPr>
+        <w:spacing w:after="120" w:line="276" w:lineRule="auto"/>
+        <w:jc w:val="both"/>
+        <w:rPr>
+          <w:lang w:val="es-CO"/>
+        </w:rPr>
+      </w:pPr>
+      <w:r>
+        <w:rPr>
+          <w:lang w:val="es-CO"/>
+        </w:rPr>
+        <w:t xml:space="preserve">app.fn_mover_en_edt recibe la posición final y no «subir» o «bajar», así que un doble clic no mueve dos veces. Es lo único que cumple la promesa del 02 §8.2 —un solo paso, sin estado intermedio— cuando el hermano de al lado vive en otra tabla.</w:t>
+      </w:r>
+    </w:p>
+    <w:p>
+      <w:pPr>
+        <w:pStyle w:val="Ttulo2"/>
+        <w:spacing w:before="300" w:after="120"/>
+        <w:rPr>
+          <w:lang w:val="es-CO"/>
+        </w:rPr>
+      </w:pPr>
+      <w:r>
+        <w:rPr>
+          <w:b/>
+          <w:bCs/>
+          <w:color w:val="1F2933"/>
+          <w:sz w:val="23"/>
+          <w:szCs w:val="23"/>
+          <w:lang w:val="es-CO"/>
+        </w:rPr>
+        <w:t xml:space="preserve">D-57 · La incidencia y la lectura de la estructura viven en la base</w:t>
+      </w:r>
+    </w:p>
+    <w:p>
+      <w:pPr>
+        <w:spacing w:after="120" w:line="276" w:lineRule="auto"/>
+        <w:jc w:val="both"/>
+        <w:rPr>
+          <w:lang w:val="es-CO"/>
+        </w:rPr>
+      </w:pPr>
+      <w:r>
+        <w:rPr>
+          <w:lang w:val="es-CO"/>
+        </w:rPr>
+        <w:t xml:space="preserve">app.fn_incidencia y app.fn_leer_edt calculan lo mismo para la pantalla y para el PDF; escrita dos veces, la incidencia diría cosas distintas del mismo presupuesto. No redondean: el redondeo es de la presentación. El presupuesto guarda A, I y U por separado.</w:t>
+      </w:r>
+    </w:p>
+    <w:p>
+      <w:pPr>
+        <w:pStyle w:val="Ttulo2"/>
+        <w:spacing w:before="300" w:after="120"/>
+        <w:rPr>
+          <w:lang w:val="es-CO"/>
+        </w:rPr>
+      </w:pPr>
+      <w:r>
+        <w:rPr>
+          <w:b/>
+          <w:bCs/>
+          <w:color w:val="1F2933"/>
+          <w:sz w:val="23"/>
+          <w:szCs w:val="23"/>
+          <w:lang w:val="es-CO"/>
+        </w:rPr>
+        <w:t xml:space="preserve">D-58 · La fecha de modificación la mueve la base, y solo el contenido</w:t>
+      </w:r>
+    </w:p>
+    <w:p>
+      <w:pPr>
+        <w:spacing w:after="120" w:line="276" w:lineRule="auto"/>
+        <w:jc w:val="both"/>
+        <w:rPr>
+          <w:lang w:val="es-CO"/>
+        </w:rPr>
+      </w:pPr>
+      <w:r>
+        <w:rPr>
+          <w:lang w:val="es-CO"/>
+        </w:rPr>
+        <w:t xml:space="preserve">Antes solo la movía el recálculo, así que editar la cabecera o agregar un capítulo dejaban la marca intacta, y la aplicación podía escribir una fecha anterior. Archivar no la mueve, a propósito: desarchivar una licitación de hace un año no la debe poner arriba de la lista.</w:t>
+      </w:r>
+    </w:p>
+    <w:p>
+      <w:pPr>
+        <w:pStyle w:val="Ttulo2"/>
+        <w:spacing w:before="300" w:after="120"/>
+        <w:rPr>
+          <w:lang w:val="es-CO"/>
+        </w:rPr>
+      </w:pPr>
+      <w:r>
+        <w:rPr>
+          <w:b/>
+          <w:bCs/>
+          <w:color w:val="1F2933"/>
+          <w:sz w:val="23"/>
+          <w:szCs w:val="23"/>
+          <w:lang w:val="es-CO"/>
+        </w:rPr>
+        <w:t xml:space="preserve">D-59 · Editar presupuestos exige Ver APU</w:t>
+      </w:r>
+    </w:p>
+    <w:p>
+      <w:pPr>
+        <w:spacing w:after="120" w:line="276" w:lineRule="auto"/>
+        <w:jc w:val="both"/>
+        <w:rPr>
+          <w:lang w:val="es-CO"/>
+        </w:rPr>
+      </w:pPr>
+      <w:r>
+        <w:rPr>
+          <w:lang w:val="es-CO"/>
+        </w:rPr>
+        <w:t xml:space="preserve">Una actividad de la mesa de trabajo es un APU con una cantidad: sin el catálogo, la pantalla se abre y el buscador no ofrece nada. Decisión del dueño, 30 de septiembre de 2026. Es uno de dos prerrequisitos entre módulos; el otro es D-70.</w:t>
+      </w:r>
+    </w:p>
+    <w:p>
+      <w:pPr>
+        <w:pStyle w:val="Ttulo2"/>
+        <w:spacing w:before="300" w:after="120"/>
+        <w:rPr>
+          <w:lang w:val="es-CO"/>
+        </w:rPr>
+      </w:pPr>
+      <w:r>
+        <w:rPr>
+          <w:b/>
+          <w:bCs/>
+          <w:color w:val="1F2933"/>
+          <w:sz w:val="23"/>
+          <w:szCs w:val="23"/>
+          <w:lang w:val="es-CO"/>
+        </w:rPr>
+        <w:t xml:space="preserve">D-60 · El pie financiero es una sola función pura</w:t>
+      </w:r>
+    </w:p>
+    <w:p>
+      <w:pPr>
+        <w:spacing w:after="120" w:line="276" w:lineRule="auto"/>
+        <w:jc w:val="both"/>
+        <w:rPr>
+          <w:lang w:val="es-CO"/>
+        </w:rPr>
+      </w:pPr>
+      <w:r>
+        <w:rPr>
+          <w:lang w:val="es-CO"/>
+        </w:rPr>
+        <w:t xml:space="preserve">app.fn_pie_financiero recibe seis números y devuelve seis. La usan el recálculo y el diálogo de duplicar, que anticipa el valor antes y después de actualizar los APU; escrita dos veces, la pantalla que pregunta y el total que queda guardado dirían cosas distintas.</w:t>
+      </w:r>
+    </w:p>
+    <w:p>
+      <w:pPr>
+        <w:pStyle w:val="Ttulo2"/>
+        <w:spacing w:before="300" w:after="120"/>
+        <w:rPr>
+          <w:lang w:val="es-CO"/>
+        </w:rPr>
+      </w:pPr>
+      <w:r>
+        <w:rPr>
+          <w:b/>
+          <w:bCs/>
+          <w:color w:val="1F2933"/>
+          <w:sz w:val="23"/>
+          <w:szCs w:val="23"/>
+          <w:lang w:val="es-CO"/>
+        </w:rPr>
+        <w:t xml:space="preserve">D-61 · Eliminar un presupuesto exige Administrador y justificación</w:t>
+      </w:r>
+    </w:p>
+    <w:p>
+      <w:pPr>
+        <w:spacing w:after="120" w:line="276" w:lineRule="auto"/>
+        <w:jc w:val="both"/>
+        <w:rPr>
+          <w:lang w:val="es-CO"/>
+        </w:rPr>
+      </w:pPr>
+      <w:r>
+        <w:rPr>
+          <w:lang w:val="es-CO"/>
+        </w:rPr>
+        <w:t xml:space="preserve">Pasa por app.fn_eliminar_presupuesto y el borrado directo sale de los permisos de la aplicación. Antes fallaba siempre —el evento exigía una justificación que nadie escribía— y no exigía ser Administrador. En la misma tanda, la aplicación pierde el permiso de cambiar de qué presupuesto salió una copia.</w:t>
+      </w:r>
+    </w:p>
+    <w:p>
+      <w:pPr>
+        <w:pStyle w:val="Ttulo2"/>
+        <w:spacing w:before="300" w:after="120"/>
+        <w:rPr>
+          <w:lang w:val="es-CO"/>
+        </w:rPr>
+      </w:pPr>
+      <w:r>
+        <w:rPr>
+          <w:b/>
+          <w:bCs/>
+          <w:color w:val="1F2933"/>
+          <w:sz w:val="23"/>
+          <w:szCs w:val="23"/>
+          <w:lang w:val="es-CO"/>
+        </w:rPr>
+        <w:t xml:space="preserve">D-62 · El costo de una actividad es una función</w:t>
+      </w:r>
+    </w:p>
+    <w:p>
+      <w:pPr>
+        <w:spacing w:after="120" w:line="276" w:lineRule="auto"/>
+        <w:jc w:val="both"/>
+        <w:rPr>
+          <w:lang w:val="es-CO"/>
+        </w:rPr>
+      </w:pPr>
+      <w:r>
+        <w:rPr>
+          <w:lang w:val="es-CO"/>
+        </w:rPr>
+        <w:t xml:space="preserve">app.fn_costo_actividad, respaldada por una columna generada. La comparte el pie anticipado de D-63, así que la cuenta no se escribe dos veces.</w:t>
+      </w:r>
+    </w:p>
+    <w:p>
+      <w:pPr>
+        <w:pStyle w:val="Ttulo2"/>
+        <w:spacing w:before="300" w:after="120"/>
+        <w:rPr>
+          <w:lang w:val="es-CO"/>
+        </w:rPr>
+      </w:pPr>
+      <w:r>
+        <w:rPr>
+          <w:b/>
+          <w:bCs/>
+          <w:color w:val="1F2933"/>
+          <w:sz w:val="23"/>
+          <w:szCs w:val="23"/>
+          <w:lang w:val="es-CO"/>
+        </w:rPr>
+        <w:t xml:space="preserve">D-63 · El «después» de duplicar lo calcula la base</w:t>
+      </w:r>
+    </w:p>
+    <w:p>
+      <w:pPr>
+        <w:spacing w:after="120" w:line="276" w:lineRule="auto"/>
+        <w:jc w:val="both"/>
+        <w:rPr>
+          <w:lang w:val="es-CO"/>
+        </w:rPr>
+      </w:pPr>
+      <w:r>
+        <w:rPr>
+          <w:lang w:val="es-CO"/>
+        </w:rPr>
+        <w:t xml:space="preserve">app.fn_pie_con_apu_vigentes calcula el pie que tendría el presupuesto con cada actividad en la versión vigente de su APU. En el backend habría obligado a reescribir tres reglas que ya viven en la base. Comprobado sobre el presupuesto de referencia: el anticipado y el real de la copia coinciden. La fotografía de versión guarda además la clasificación ya heredada.</w:t>
+      </w:r>
+    </w:p>
+    <w:p>
+      <w:pPr>
+        <w:pStyle w:val="Ttulo2"/>
+        <w:spacing w:before="300" w:after="120"/>
+        <w:rPr>
+          <w:lang w:val="es-CO"/>
+        </w:rPr>
+      </w:pPr>
+      <w:r>
+        <w:rPr>
+          <w:b/>
+          <w:bCs/>
+          <w:color w:val="1F2933"/>
+          <w:sz w:val="23"/>
+          <w:szCs w:val="23"/>
+          <w:lang w:val="es-CO"/>
+        </w:rPr>
+        <w:t xml:space="preserve">D-64 · El logo se congela con la versión</w:t>
+      </w:r>
+    </w:p>
+    <w:p>
+      <w:pPr>
+        <w:spacing w:after="120" w:line="276" w:lineRule="auto"/>
+        <w:jc w:val="both"/>
+        <w:rPr>
+          <w:lang w:val="es-CO"/>
+        </w:rPr>
+      </w:pPr>
+      <w:r>
+        <w:rPr>
+          <w:lang w:val="es-CO"/>
+        </w:rPr>
+        <w:t xml:space="preserve">Una oferta de 2026 reimpresa en 2028 con la marca nueva no es la misma oferta. Decisión del dueño, 30 de septiembre de 2026. Consecuencia: un logo que nombra cualquier versión no se borra nunca del almacenamiento.</w:t>
+      </w:r>
+    </w:p>
+    <w:p>
+      <w:pPr>
+        <w:pStyle w:val="Ttulo2"/>
+        <w:spacing w:before="300" w:after="120"/>
+        <w:rPr>
+          <w:lang w:val="es-CO"/>
+        </w:rPr>
+      </w:pPr>
+      <w:r>
+        <w:rPr>
+          <w:b/>
+          <w:bCs/>
+          <w:color w:val="1F2933"/>
+          <w:sz w:val="23"/>
+          <w:szCs w:val="23"/>
+          <w:lang w:val="es-CO"/>
+        </w:rPr>
+        <w:t xml:space="preserve">D-65 · La suscripción vencida es solo lectura, no bloqueo</w:t>
+      </w:r>
+    </w:p>
+    <w:p>
+      <w:pPr>
+        <w:spacing w:after="120" w:line="276" w:lineRule="auto"/>
+        <w:jc w:val="both"/>
+        <w:rPr>
+          <w:lang w:val="es-CO"/>
+        </w:rPr>
+      </w:pPr>
+      <w:r>
+        <w:rPr>
+          <w:lang w:val="es-CO"/>
+        </w:rPr>
+        <w:t xml:space="preserve">Consultar y exportar responden; todo lo que escribe se rechaza. Los datos son del cliente, y un producto que se los retiene para cobrar los secuestra. Es una condición sobre la acción del permiso y no una lista de excepciones, para que los permisos nuevos caigan del lado correcto. Decisión del dueño, 30 de septiembre de 2026. Hoy aplica a la prueba vencida; la suscripción pagada sigue D-74.</w:t>
+      </w:r>
+    </w:p>
+    <w:p>
+      <w:pPr>
+        <w:pStyle w:val="Ttulo2"/>
+        <w:spacing w:before="300" w:after="120"/>
+        <w:rPr>
+          <w:lang w:val="es-CO"/>
+        </w:rPr>
+      </w:pPr>
+      <w:r>
+        <w:rPr>
+          <w:b/>
+          <w:bCs/>
+          <w:color w:val="1F2933"/>
+          <w:sz w:val="23"/>
+          <w:szCs w:val="23"/>
+          <w:lang w:val="es-CO"/>
+        </w:rPr>
+        <w:t xml:space="preserve">D-66 · Cada rechazo de permiso tiene su propio código</w:t>
+      </w:r>
+    </w:p>
+    <w:p>
+      <w:pPr>
+        <w:spacing w:after="120" w:line="276" w:lineRule="auto"/>
+        <w:jc w:val="both"/>
+        <w:rPr>
+          <w:lang w:val="es-CO"/>
+        </w:rPr>
+      </w:pPr>
+      <w:r>
+        <w:rPr>
+          <w:lang w:val="es-CO"/>
+        </w:rPr>
+        <w:t xml:space="preserve">Antes todos salían con el mismo código y el texto en español, y la API solo podía distinguirlos leyendo el mensaje: corregir una tilde rompía una pantalla. Los códigos (CS000 a CS006) van por significado, no por estado HTTP; la traducción vive en un solo lugar de la API (04 §8.4).</w:t>
+      </w:r>
+    </w:p>
+    <w:p>
+      <w:pPr>
+        <w:pStyle w:val="Ttulo2"/>
+        <w:spacing w:before="300" w:after="120"/>
+        <w:rPr>
+          <w:lang w:val="es-CO"/>
+        </w:rPr>
+      </w:pPr>
+      <w:r>
+        <w:rPr>
+          <w:b/>
+          <w:bCs/>
+          <w:color w:val="1F2933"/>
+          <w:sz w:val="23"/>
+          <w:szCs w:val="23"/>
+          <w:lang w:val="es-CO"/>
+        </w:rPr>
+        <w:t xml:space="preserve">D-67 · El sello de credenciales</w:t>
+      </w:r>
+    </w:p>
+    <w:p>
+      <w:pPr>
+        <w:spacing w:after="120" w:line="276" w:lineRule="auto"/>
+        <w:jc w:val="both"/>
+        <w:rPr>
+          <w:lang w:val="es-CO"/>
+        </w:rPr>
+      </w:pPr>
+      <w:r>
+        <w:rPr>
+          <w:lang w:val="es-CO"/>
+        </w:rPr>
+        <w:t xml:space="preserve">La sesión viaja en una cookie firmada y no hay tabla de sesiones, así que no había fila que borrar para cortarle el acceso a alguien. app.usuario.credenciales_en la reemplaza: la cookie lleva el valor del ingreso y el servidor lo compara en cada petición. La mueve un disparador —cambiar la contraseña cierra las otras sesiones aunque nadie se acuerde— y el mismo disparador rechaza que se escriba a mano.</w:t>
+      </w:r>
+    </w:p>
+    <w:p>
+      <w:pPr>
+        <w:pStyle w:val="Ttulo2"/>
+        <w:spacing w:before="300" w:after="120"/>
+        <w:rPr>
+          <w:lang w:val="es-CO"/>
+        </w:rPr>
+      </w:pPr>
+      <w:r>
+        <w:rPr>
+          <w:b/>
+          <w:bCs/>
+          <w:color w:val="1F2933"/>
+          <w:sz w:val="23"/>
+          <w:szCs w:val="23"/>
+          <w:lang w:val="es-CO"/>
+        </w:rPr>
+        <w:t xml:space="preserve">D-68 · Un propósito de enlace nuevo sin vigencia no se puede insertar</w:t>
+      </w:r>
+    </w:p>
+    <w:p>
+      <w:pPr>
+        <w:spacing w:after="120" w:line="276" w:lineRule="auto"/>
+        <w:jc w:val="both"/>
+        <w:rPr>
+          <w:lang w:val="es-CO"/>
+        </w:rPr>
+      </w:pPr>
+      <w:r>
+        <w:rPr>
+          <w:lang w:val="es-CO"/>
+        </w:rPr>
+        <w:t xml:space="preserve">La rama por defecto de la vigencia de los enlaces era de 72 horas, y un propósito nuevo las heredaba en silencio. Ahora es cero, lo que hace la fila imposible de insertar: el olvido pasa de silencioso a ruidoso.</w:t>
+      </w:r>
+    </w:p>
+    <w:p>
+      <w:pPr>
+        <w:pStyle w:val="Ttulo2"/>
+        <w:spacing w:before="300" w:after="120"/>
+        <w:rPr>
+          <w:lang w:val="es-CO"/>
+        </w:rPr>
+      </w:pPr>
+      <w:r>
+        <w:rPr>
+          <w:b/>
+          <w:bCs/>
+          <w:color w:val="1F2933"/>
+          <w:sz w:val="23"/>
+          <w:szCs w:val="23"/>
+          <w:lang w:val="es-CO"/>
+        </w:rPr>
+        <w:t xml:space="preserve">D-69 · La renumeración se calcula una sola vez para las dos tablas</w:t>
+      </w:r>
+    </w:p>
+    <w:p>
+      <w:pPr>
+        <w:spacing w:after="120" w:line="276" w:lineRule="auto"/>
+        <w:jc w:val="both"/>
+        <w:rPr>
+          <w:lang w:val="es-CO"/>
+        </w:rPr>
+      </w:pPr>
+      <w:r>
+        <w:rPr>
+          <w:lang w:val="es-CO"/>
+        </w:rPr>
+        <w:t xml:space="preserve">Se calculaba dos veces, la segunda sobre un estado a medio escribir, y podía dejar dos elementos con el mismo código y, en la siguiente renumeración, reordenar la oferta sin que nadie se enterara. Lo encontró una prueba de invariante el 4 de octubre de 2026 (docs/prueba-edt.sql).</w:t>
+      </w:r>
+    </w:p>
+    <w:p>
+      <w:pPr>
+        <w:pStyle w:val="Ttulo2"/>
+        <w:spacing w:before="300" w:after="120"/>
+        <w:rPr>
+          <w:lang w:val="es-CO"/>
+        </w:rPr>
+      </w:pPr>
+      <w:r>
+        <w:rPr>
+          <w:b/>
+          <w:bCs/>
+          <w:color w:val="1F2933"/>
+          <w:sz w:val="23"/>
+          <w:szCs w:val="23"/>
+          <w:lang w:val="es-CO"/>
+        </w:rPr>
+        <w:t xml:space="preserve">D-70 · Crear o editar un APU exige Ver recursos</w:t>
+      </w:r>
+    </w:p>
+    <w:p>
+      <w:pPr>
+        <w:spacing w:after="120" w:line="276" w:lineRule="auto"/>
+        <w:jc w:val="both"/>
+        <w:rPr>
+          <w:lang w:val="es-CO"/>
+        </w:rPr>
+      </w:pPr>
+      <w:r>
+        <w:rPr>
+          <w:lang w:val="es-CO"/>
+        </w:rPr>
+        <w:t xml:space="preserve">Sin el catálogo de recursos, el formulario de APU se abre y el buscador no devuelve nada. Es el gemelo de D-59, y con él los prerrequisitos entre módulos quedan cerrados en dos: los eslabones recurso → APU → presupuesto. Lo encontró la API el 5 de octubre de 2026.</w:t>
+      </w:r>
+    </w:p>
+    <w:p>
+      <w:pPr>
+        <w:pStyle w:val="Ttulo2"/>
+        <w:spacing w:before="300" w:after="120"/>
+        <w:rPr>
+          <w:lang w:val="es-CO"/>
+        </w:rPr>
+      </w:pPr>
+      <w:r>
+        <w:rPr>
+          <w:b/>
+          <w:bCs/>
+          <w:color w:val="1F2933"/>
+          <w:sz w:val="23"/>
+          <w:szCs w:val="23"/>
+          <w:lang w:val="es-CO"/>
+        </w:rPr>
+        <w:t xml:space="preserve">D-71 · Las imágenes viven en la base mientras no haya almacenamiento</w:t>
+      </w:r>
+    </w:p>
+    <w:p>
+      <w:pPr>
+        <w:spacing w:after="120" w:line="276" w:lineRule="auto"/>
+        <w:jc w:val="both"/>
+        <w:rPr>
+          <w:lang w:val="es-CO"/>
+        </w:rPr>
+      </w:pPr>
+      <w:r>
+        <w:rPr>
+          <w:lang w:val="es-CO"/>
+        </w:rPr>
+        <w:t xml:space="preserve">Decisión del dueño, 9 de octubre de 2026: los servicios pagos esperan a que el sistema esté listo. app.logo guarda una fila por imagen, por su hash, y no admite borrar (D-64); solo PNG y JPEG hasta 1 MB, porque un SVG en línea ejecuta script. plataforma.soporte_pago guarda los comprobantes. Cuando exista almacenamiento de objetos (D-30) se migran una sola vez. Entran con ella los nombres únicos de recurso y de APU (decisión del dueño, 7 y 8 de octubre), sin distinguir mayúsculas ni espacios de los bordes.</w:t>
+      </w:r>
+    </w:p>
+    <w:p>
+      <w:pPr>
+        <w:pStyle w:val="Ttulo2"/>
+        <w:spacing w:before="300" w:after="120"/>
+        <w:rPr>
+          <w:lang w:val="es-CO"/>
+        </w:rPr>
+      </w:pPr>
+      <w:r>
+        <w:rPr>
+          <w:b/>
+          <w:bCs/>
+          <w:color w:val="1F2933"/>
+          <w:sz w:val="23"/>
+          <w:szCs w:val="23"/>
+          <w:lang w:val="es-CO"/>
+        </w:rPr>
+        <w:t xml:space="preserve">D-72 · Toda acción del panel va firmada</w:t>
+      </w:r>
+    </w:p>
+    <w:p>
+      <w:pPr>
+        <w:spacing w:after="120" w:line="276" w:lineRule="auto"/>
+        <w:jc w:val="both"/>
+        <w:rPr>
+          <w:lang w:val="es-CO"/>
+        </w:rPr>
+      </w:pPr>
+      <w:r>
+        <w:rPr>
+          <w:lang w:val="es-CO"/>
+        </w:rPr>
+        <w:t xml:space="preserve">Suspender, reactivar, cambiar plan o vencimiento y cancelar exigen quién y por qué, y la base se niega si faltan o si el autor no es un superadministrador activo. Entran además el alta de superadministradores sin superusuario, la regla de la fecha propuesta con nombre propio y la búsqueda sin tildes del panel. Corrige de paso un defecto: el correo distinguía mayúsculas dentro de cuatro funciones.</w:t>
+      </w:r>
+    </w:p>
+    <w:p>
+      <w:pPr>
+        <w:pStyle w:val="Ttulo2"/>
+        <w:spacing w:before="300" w:after="120"/>
+        <w:rPr>
+          <w:lang w:val="es-CO"/>
+        </w:rPr>
+      </w:pPr>
+      <w:r>
+        <w:rPr>
+          <w:b/>
+          <w:bCs/>
+          <w:color w:val="1F2933"/>
+          <w:sz w:val="23"/>
+          <w:szCs w:val="23"/>
+          <w:lang w:val="es-CO"/>
+        </w:rPr>
+        <w:t xml:space="preserve">D-73 · La empresa reporta su pago y el superadministrador lo verifica</w:t>
+      </w:r>
+    </w:p>
+    <w:p>
+      <w:pPr>
+        <w:spacing w:after="120" w:line="276" w:lineRule="auto"/>
+        <w:jc w:val="both"/>
+        <w:rPr>
+          <w:lang w:val="es-CO"/>
+        </w:rPr>
+      </w:pPr>
+      <w:r>
+        <w:rPr>
+          <w:lang w:val="es-CO"/>
+        </w:rPr>
+        <w:t xml:space="preserve">Decisión del dueño, 11 de octubre de 2026: un comprobante puede ser falso, así que reportar no da acceso; solo lo da la confirmación. El pago reportado entra pendiente, con comprobante obligatorio, y no mueve la suscripción. Confirmar hace lo mismo que registrar; rechazar pide un motivo que la empresa lee. Reportar no pasa por la regla de D-65, porque vencida es justo cuando hay que poder reportar.</w:t>
+      </w:r>
+    </w:p>
+    <w:p>
+      <w:pPr>
+        <w:pStyle w:val="Ttulo2"/>
+        <w:spacing w:before="300" w:after="120"/>
+        <w:rPr>
+          <w:lang w:val="es-CO"/>
+        </w:rPr>
+      </w:pPr>
+      <w:r>
+        <w:rPr>
+          <w:b/>
+          <w:bCs/>
+          <w:color w:val="1F2933"/>
+          <w:sz w:val="23"/>
+          <w:szCs w:val="23"/>
+          <w:lang w:val="es-CO"/>
+        </w:rPr>
+        <w:t xml:space="preserve">D-74 · El ciclo de vida de la suscripción</w:t>
+      </w:r>
+    </w:p>
+    <w:p>
+      <w:pPr>
+        <w:spacing w:after="120" w:line="276" w:lineRule="auto"/>
+        <w:jc w:val="both"/>
+        <w:rPr>
+          <w:lang w:val="es-CO"/>
+        </w:rPr>
+      </w:pPr>
+      <w:r>
+        <w:rPr>
+          <w:lang w:val="es-CO"/>
+        </w:rPr>
+        <w:t xml:space="preserve">Decisión del dueño, 11 de octubre de 2026. Al vencer, una cuenta paga tiene dos días hábiles con todo funcionando; sin pago queda suspendida —solo entra a la suscripción— y a los 60 días sus datos se eliminan. Un rechazo da dos días hábiles más. Cancelan la empresa o el superadministrador: funciona hasta la fecha pagada y después hay 10 días para reactivarla. Todo se deriva de fechas en una sola función, plataforma.fn_ciclo_suscripcion, que leen la pantalla, el rechazo y el panel. Cambia D-14 y D-25. Desde D-78 los plazos son parámetros.</w:t>
+      </w:r>
+    </w:p>
+    <w:p>
+      <w:pPr>
+        <w:pStyle w:val="Ttulo2"/>
+        <w:spacing w:before="300" w:after="120"/>
+        <w:rPr>
+          <w:lang w:val="es-CO"/>
+        </w:rPr>
+      </w:pPr>
+      <w:r>
+        <w:rPr>
+          <w:b/>
+          <w:bCs/>
+          <w:color w:val="1F2933"/>
+          <w:sz w:val="23"/>
+          <w:szCs w:val="23"/>
+          <w:lang w:val="es-CO"/>
+        </w:rPr>
+        <w:t xml:space="preserve">D-75 · La numeración de la estructura</w:t>
+      </w:r>
+    </w:p>
+    <w:p>
+      <w:pPr>
+        <w:spacing w:after="120" w:line="276" w:lineRule="auto"/>
+        <w:jc w:val="both"/>
+        <w:rPr>
+          <w:lang w:val="es-CO"/>
+        </w:rPr>
+      </w:pPr>
+      <w:r>
+        <w:rPr>
+          <w:lang w:val="es-CO"/>
+        </w:rPr>
+        <w:t xml:space="preserve">Decisión del dueño, 13 de octubre de 2026. Bajo un mismo padre van primero los subcapítulos y después las actividades. El capítulo pierde el «.0»; los ceros a la izquierda solo igualan el ancho del nivel cuando hay diez o más. La actividad no muestra número jerárquico: la identifica el código de su APU, y su número interno sigue siendo la llave que ordena. Cambia D-42.</w:t>
+      </w:r>
+    </w:p>
+    <w:p>
+      <w:pPr>
+        <w:pStyle w:val="Ttulo2"/>
+        <w:spacing w:before="300" w:after="120"/>
+        <w:rPr>
+          <w:lang w:val="es-CO"/>
+        </w:rPr>
+      </w:pPr>
+      <w:r>
+        <w:rPr>
+          <w:b/>
+          <w:bCs/>
+          <w:color w:val="1F2933"/>
+          <w:sz w:val="23"/>
+          <w:szCs w:val="23"/>
+          <w:lang w:val="es-CO"/>
+        </w:rPr>
+        <w:t xml:space="preserve">D-76 · La prueba gratuita</w:t>
+      </w:r>
+    </w:p>
+    <w:p>
+      <w:pPr>
+        <w:spacing w:after="120" w:line="276" w:lineRule="auto"/>
+        <w:jc w:val="both"/>
+        <w:rPr>
+          <w:lang w:val="es-CO"/>
+        </w:rPr>
+      </w:pPr>
+      <w:r>
+        <w:rPr>
+          <w:lang w:val="es-CO"/>
+        </w:rPr>
+        <w:t xml:space="preserve">Decisión del dueño, 13 de octubre de 2026. Quince días con todo y diez de solo lectura; sin pago, al día siguiente la prueba queda cancelada y la purga diaria borra sus datos. Un pago reportado a tiempo la protege mientras se verifica. Exportar se deja siempre —suspendida, cancelada o prueba vencida— hasta que los datos se eliminen. Cambia RF-SAD-13: la eliminación de la prueba ya no es a mano.</w:t>
+      </w:r>
+    </w:p>
+    <w:p>
+      <w:pPr>
+        <w:pStyle w:val="Ttulo2"/>
+        <w:spacing w:before="300" w:after="120"/>
+        <w:rPr>
+          <w:lang w:val="es-CO"/>
+        </w:rPr>
+      </w:pPr>
+      <w:r>
+        <w:rPr>
+          <w:b/>
+          <w:bCs/>
+          <w:color w:val="1F2933"/>
+          <w:sz w:val="23"/>
+          <w:szCs w:val="23"/>
+          <w:lang w:val="es-CO"/>
+        </w:rPr>
+        <w:t xml:space="preserve">D-77 · El esquema crece por migraciones</w:t>
+      </w:r>
+    </w:p>
+    <w:p>
+      <w:pPr>
+        <w:spacing w:after="120" w:line="276" w:lineRule="auto"/>
+        <w:jc w:val="both"/>
+        <w:rPr>
+          <w:lang w:val="es-CO"/>
+        </w:rPr>
+      </w:pPr>
+      <w:r>
+        <w:rPr>
+          <w:lang w:val="es-CO"/>
+        </w:rPr>
+        <w:t xml:space="preserve">Decisión del dueño, 14 de octubre de 2026. El 05 queda congelado como la migración 0; cada cambio es un archivo numerado con su reverso, aplicado en orden, una sola vez, solo por superusuario y bajo candado, y la base se niega a terminar una migración que deje una tabla sin aislar o una función mal asegurada. Las decisiones de la D-78 en adelante viven en su migración y en el documento 07.</w:t>
       </w:r>
     </w:p>
     <w:p>
@@ -28287,7 +29778,7 @@
               <w:rPr>
                 <w:sz w:val="19"/>
               </w:rPr>
-              <w:t>4</w:t>
+              <w:t xml:space="preserve">4</w:t>
             </w:r>
           </w:p>
         </w:tc>
@@ -28310,35 +29801,29 @@
                 <w:sz w:val="19"/>
                 <w:lang w:val="es-CO"/>
               </w:rPr>
-              <w:t xml:space="preserve">Textos legales de la Ley 1581 de 2012: política de tratamiento de datos, aviso de privacidad y autorización del titular, más las casillas de aceptación en el registro. </w:t>
-            </w:r>
+              <w:t xml:space="preserve">Textos legales de la Ley 1581 de 2012: política de tratamiento de datos, aviso de privacidad y autorización del titular, más las casillas de aceptación en el registro. Requiere abogado.</w:t>
+            </w:r>
+          </w:p>
+        </w:tc>
+        <w:tc>
+          <w:tcPr>
+            <w:tcW w:w="1920" w:type="dxa"/>
+            <w:tcMar>
+              <w:top w:w="70" w:type="dxa"/>
+              <w:left w:w="110" w:type="dxa"/>
+              <w:bottom w:w="70" w:type="dxa"/>
+              <w:right w:w="110" w:type="dxa"/>
+            </w:tcMar>
+          </w:tcPr>
+          <w:p>
+            <w:pPr>
+              <w:spacing w:before="40" w:after="80"/>
+            </w:pPr>
             <w:r>
               <w:rPr>
                 <w:sz w:val="19"/>
               </w:rPr>
-              <w:t>Requiere abogado.</w:t>
-            </w:r>
-          </w:p>
-        </w:tc>
-        <w:tc>
-          <w:tcPr>
-            <w:tcW w:w="1920" w:type="dxa"/>
-            <w:tcMar>
-              <w:top w:w="70" w:type="dxa"/>
-              <w:left w:w="110" w:type="dxa"/>
-              <w:bottom w:w="70" w:type="dxa"/>
-              <w:right w:w="110" w:type="dxa"/>
-            </w:tcMar>
-          </w:tcPr>
-          <w:p>
-            <w:pPr>
-              <w:spacing w:before="40" w:after="80"/>
-            </w:pPr>
-            <w:r>
-              <w:rPr>
-                <w:sz w:val="19"/>
-              </w:rPr>
-              <w:t>Las casillas y las columnas, en la rebanada 6.1, que es donde vive el registro: el esquema ya tiene acepto_terminos_en y version_terminos. Los textos, antes del primer cliente real</w:t>
+              <w:t xml:space="preserve">Las casillas y las columnas ya están construidas. Hay una versión provisional de los textos (legal/PROVISIONAL-2026-10-13) que el registro hace aceptar; el texto definitivo, antes del primer cliente real, con abogado</w:t>
             </w:r>
           </w:p>
         </w:tc>
@@ -28417,6 +29902,29 @@
           <w:lang w:val="es-CO"/>
         </w:rPr>
         <w:t xml:space="preserve">Descartado: fechas programadas de inicio y fin por actividad. El módulo de control no las pide, y el de reportes dice expresamente que opera «exclusivamente bajo la dimensión de costos y cantidades» — sus indicadores son EV, AC, CV y CPI, ninguno de cronograma. Reservar columnas para una función que el diseño excluye solo genera dudas después.</w:t>
+      </w:r>
+    </w:p>
+    <w:p>
+      <w:pPr>
+        <w:spacing w:after="120" w:line="276" w:lineRule="auto"/>
+        <w:jc w:val="both"/>
+        <w:rPr>
+          <w:lang w:val="es-CO"/>
+        </w:rPr>
+      </w:pPr>
+      <w:r>
+        <w:rPr>
+          <w:b/>
+          <w:bCs/>
+          <w:lang w:val="es-CO"/>
+        </w:rPr>
+        <w:t xml:space="preserve">Nota del 16 de octubre de 2026.</w:t>
+      </w:r>
+      <w:r>
+        <w:rPr>
+          <w:lang w:val="es-CO"/>
+        </w:rPr>
+        <w:t xml:space="preserve"> Lo reabre el documento 07: la programación de obra entra como módulo 1 después del MVP (decisión del dueño, 13 de octubre de 2026).</w:t>
       </w:r>
     </w:p>
     <w:p>

</xml_diff>

<commit_message>
docs: el LEEME y el plan por fases entran al repositorio; identidad visual decidida
El 00 y el 03 vivían solo en la carpeta Paquete de desarrollo; desde hoy el
git y esa carpeta tienen los mismos documentos. El 00 se pone al día
(migraciones, seis roles, cinco extensiones, conteo de objetos, purga
diaria) y el 03 también (D-75, D-77, requisitos). En el 01 la identidad
visual queda decidida (web/DISENO.md). El 07 suma la D-80 y corre a D-81…D-84
las decisiones propuestas de programación.

La migración 0003 (D-80) y su batería quedan en el árbol para el commit de
la API: tocan docs/migraciones y el hook tiene que correr la batería en el
equipo del dueño.

Co-Authored-By: Claude Opus 5.5 <noreply@anthropic.com>
Claude-Session: https://claude.ai/code/session_01QkUecTxXWHcSEBT7CByXQu
</commit_message>
<xml_diff>
--- a/docs/01 - Alcance del MVP.docx
+++ b/docs/01 - Alcance del MVP.docx
@@ -29706,7 +29706,7 @@
               <w:rPr>
                 <w:sz w:val="19"/>
               </w:rPr>
-              <w:t>3</w:t>
+              <w:t xml:space="preserve">3</w:t>
             </w:r>
           </w:p>
         </w:tc>
@@ -29732,7 +29732,7 @@
                 <w:sz w:val="19"/>
                 <w:lang w:val="es-CO"/>
               </w:rPr>
-              <w:t>Identidad visual: paleta, tipografía y logotipo. La guía de interfaz define comportamiento, no apariencia.</w:t>
+              <w:t xml:space="preserve">Identidad visual: paleta, tipografía y logotipo. DECIDIDA: la define web/DISENO.md (paleta, tipografía y componentes), y el dueño la dio por cerrada el 16 de octubre de 2026.</w:t>
             </w:r>
           </w:p>
         </w:tc>
@@ -29754,7 +29754,7 @@
               <w:rPr>
                 <w:sz w:val="19"/>
               </w:rPr>
-              <w:t>Antes de la rebanada 6.2: los patrones visuales se definen antes de la segunda pantalla, o salen quince pantallas en quince estilos</w:t>
+              <w:t xml:space="preserve">Resuelta</w:t>
             </w:r>
           </w:p>
         </w:tc>

</xml_diff>

<commit_message>
docs: el módulo de programación con las decisiones del 19 de octubre
07 §6.9 recoge las respuestas del dueño: código de actividad, recálculo y
aviso tras un cambio del presupuesto, dos ediciones a la vez, calendario
por defecto, holgura total y libre, administración sin hitos ni trámites,
duplicar sin líneas base, sin fecha de corte en esta versión, exportación
XER y XML. Nuevo RF-APU-25 (rendimiento de la actividad). El 01 anota en
la D-5 que el cronograma es la excepción al Activo de solo lectura, y el
02 señala el campo nuevo del APU. Queda pendiente la tabla de parejas de
restricciones, que se levanta en P6.

Co-Authored-By: Claude Opus 5.5 <noreply@anthropic.com>
Claude-Session: https://claude.ai/code/session_01QkUecTxXWHcSEBT7CByXQu
</commit_message>
<xml_diff>
--- a/docs/01 - Alcance del MVP.docx
+++ b/docs/01 - Alcance del MVP.docx
@@ -21070,6 +21070,29 @@
         </w:tc>
       </w:tr>
     </w:tbl>
+    <w:p>
+      <w:pPr>
+        <w:spacing w:after="120" w:line="276" w:lineRule="auto"/>
+        <w:jc w:val="both"/>
+        <w:rPr>
+          <w:lang w:val="es-CO"/>
+        </w:rPr>
+      </w:pPr>
+      <w:r>
+        <w:rPr>
+          <w:b/>
+          <w:bCs/>
+          <w:lang w:val="es-CO"/>
+        </w:rPr>
+        <w:t xml:space="preserve">Nota del 19 de octubre de 2026.</w:t>
+      </w:r>
+      <w:r>
+        <w:rPr>
+          <w:lang w:val="es-CO"/>
+        </w:rPr>
+        <w:t xml:space="preserve"> El cronograma del módulo de programación (documento 07) es la excepción: se edita con el presupuesto Activo, porque lee el presupuesto y nunca escribe en él.</w:t>
+      </w:r>
+    </w:p>
     <w:p>
       <w:pPr>
         <w:pStyle w:val="Ttulo2"/>

</xml_diff>